<commit_message>
docs(manuscript): update calibration methods and results
Describe the Nelder-Mead prior centre, the adaptive Metropolis posterior
and the single-round NPE (LHS) comparison. Derive pass lists, capacity
multiples, drug share and 2015 populations from the outputs. Replace the
SI seed and SBC tables, renumber Tables S7-S12, and cite Haario 2001 and
Vehtari 2021.

Co-Authored-By: Claude Opus 5.5 <noreply@anthropic.com>
</commit_message>
<xml_diff>
--- a/docs/main.docx
+++ b/docs/main.docx
@@ -111,7 +111,7 @@
         <w:pStyle w:val="FirstParagraph"/>
       </w:pPr>
       <w:r>
-        <w:t xml:space="preserve">We built an age structured HCV model with four groups: active PWID never imprisoned (D), people in prison (J), and released people who still inject (F) or have stopped (X). We calibrated it to 2015 prison data with Bayesian methods. We assumed treatment in prison from 2019. From 2026 we compared 15 community screening scenarios of 600 to 8,000 tests a year, with 25%, 50% or 75% for F and the rest for X. Results are medians with 95% uncertainty intervals (UI) across 2,000 posterior draws. Without treatment, new infections in 2030 were 130.3% (95% UI: 121.6%–140.0%) of the 2015 level. With prison treatment alone, new infections fell by 75.9% (95% UI: 70.5%–79.8%) by 2030, but HCV deaths fell by only 42.6% (95% UI: 41.8%–43.5%). In 2026, 94% of chronic infections among released people were in X. Only 3 of 15 scenarios met both WHO targets. At 8,000 tests a year, the incidence reduction was 94.2% for every split, while the mortality reduction fell from 70.7% to 57.4% as the F share rose from 25% to 75%. The model covers only PWID and assumes ideal linkage to treatment.</w:t>
+        <w:t xml:space="preserve">We built an age structured HCV model with four groups: active PWID never imprisoned (D), people in prison (J), and released people who still inject (F) or have stopped (X). We calibrated it to 2015 prison data with Bayesian methods. We assumed treatment in prison from 2019. From 2026 we compared 15 community screening scenarios of 600 to 8,000 tests a year, with 25%, 50% or 75% for F and the rest for X. Results are medians with 95% uncertainty intervals (UI) across 2,000 posterior draws. Without treatment, new infections in 2030 were 132.5% (95% UI: 120.9%–147.3%) of the 2015 level. With prison treatment alone, new infections fell by 75.6% (95% UI: 68.5%–80.4%) by 2030, but HCV deaths fell by only 42.6% (95% UI: 41.6%–43.7%). In 2026, 94% of chronic infections among released people were in X. Only 2 of 15 scenarios met both WHO targets. At 8,000 tests a year, the incidence reduction was 94.0% for every split, while the mortality reduction fell from 70.6% to 57.2% as the F share rose from 25% to 75%. The model covers only PWID and assumes ideal linkage to treatment.</w:t>
       </w:r>
     </w:p>
     <w:bookmarkEnd w:id="10"/>
@@ -582,28 +582,37 @@
         <w:pStyle w:val="BodyText"/>
       </w:pPr>
       <w:r>
-        <w:t xml:space="preserve">We used neural posterior estimation to obtain the posterior distribution of the 12 parameters</w:t>
-      </w:r>
-      <w:r>
-        <w:t xml:space="preserve"> </w:t>
-      </w:r>
-      <w:r>
-        <w:t xml:space="preserve">[24–26]</w:t>
-      </w:r>
-      <w:r>
-        <w:t xml:space="preserve">. We trained the estimator on 3,000 simulations. We trained it twice with different random seeds. We accepted the result only if simulation based calibration showed good coverage</w:t>
-      </w:r>
-      <w:r>
-        <w:t xml:space="preserve"> </w:t>
-      </w:r>
-      <w:r>
-        <w:t xml:space="preserve">[27]</w:t>
-      </w:r>
-      <w:r>
-        <w:t xml:space="preserve"> </w:t>
-      </w:r>
-      <w:r>
-        <w:t xml:space="preserve">and the posterior was not overly narrow. Both seeds passed these checks. A separate Markov chain Monte Carlo run gave nearly the same posterior. S1 Text, Section 2 gives details.</w:t>
+        <w:t xml:space="preserve">A multi start Nelder Mead fit gave the best fitting parameter values. We used them as the centre of a normal prior with standard deviation 0.20 on the log scale. The likelihood was binomial for the prevalence counts and log normal for the population counts. Parameter sets that did not reach equilibrium were excluded. We sampled the posterior with an adaptive random walk Metropolis algorithm</w:t>
+      </w:r>
+      <w:r>
+        <w:t xml:space="preserve"> </w:t>
+      </w:r>
+      <w:r>
+        <w:t xml:space="preserve">[24]</w:t>
+      </w:r>
+      <w:r>
+        <w:t xml:space="preserve">. We ran four chains from independent prior draws, with 50,000 model runs each. All parameters reached rank normalised R-hat below 1.01</w:t>
+      </w:r>
+      <w:r>
+        <w:t xml:space="preserve"> </w:t>
+      </w:r>
+      <w:r>
+        <w:t xml:space="preserve">[25]</w:t>
+      </w:r>
+      <w:r>
+        <w:t xml:space="preserve">. We also trained single round neural posterior estimation</w:t>
+      </w:r>
+      <w:r>
+        <w:t xml:space="preserve"> </w:t>
+      </w:r>
+      <w:r>
+        <w:t xml:space="preserve">[26,27]</w:t>
+      </w:r>
+      <w:r>
+        <w:t xml:space="preserve"> </w:t>
+      </w:r>
+      <w:r>
+        <w:t xml:space="preserve">on 50,000 prior simulations drawn by Latin hypercube sampling and compared it with MCMC. Policy results agreed within 0.4%. The neural posterior’s 95% intervals were on average 4% narrower than those from MCMC. We used MCMC, which samples the exact posterior and whose error falls with longer runs. S1 Text, Section 2 gives details.</w:t>
       </w:r>
     </w:p>
     <w:bookmarkEnd w:id="20"/>
@@ -708,25 +717,13 @@
         <w:pStyle w:val="FirstParagraph"/>
       </w:pPr>
       <w:r>
-        <w:t xml:space="preserve">We drew 1,000 parameter sets at random from each seed’s posterior, giving 2,000 draws. For each draw we ran the full analysis. This covered the 2015 equilibrium, the shared history to 2025 and all scenarios to 2030. All draws passed the equilibrium check. We report the median and the 2.5th and 97.5th percentiles across draws as the 95% uncertainty interval (UI). The UI therefore reflects uncertainty in the calibrated parameters and differences between the two training seeds. It does not reflect uncertainty in uptake, linkage to care or prices. We used R with C++ code through Rcpp</w:t>
+        <w:t xml:space="preserve">We drew 2,000 parameter sets at random from the MCMC posterior. For each draw we ran the full analysis. This covered the 2015 equilibrium, the shared history to 2025 and all scenarios to 2030. All draws passed the equilibrium check. We report the median and the 2.5th and 97.5th percentiles across draws as the 95% uncertainty interval (UI). The UI therefore reflects uncertainty in the calibrated parameters. It does not reflect uncertainty in uptake, linkage to care or prices. We used R with C++ code through Rcpp</w:t>
       </w:r>
       <w:r>
         <w:t xml:space="preserve"> </w:t>
       </w:r>
       <w:r>
         <w:t xml:space="preserve">[32]</w:t>
-      </w:r>
-      <w:r>
-        <w:t xml:space="preserve"> </w:t>
-      </w:r>
-      <w:r>
-        <w:t xml:space="preserve">and Python with the sbi package</w:t>
-      </w:r>
-      <w:r>
-        <w:t xml:space="preserve"> </w:t>
-      </w:r>
-      <w:r>
-        <w:t xml:space="preserve">[26]</w:t>
       </w:r>
       <w:r>
         <w:t xml:space="preserve">.</w:t>
@@ -757,7 +754,7 @@
         <w:pStyle w:val="FirstParagraph"/>
       </w:pPr>
       <w:r>
-        <w:t xml:space="preserve">The model reproduced the age specific seroprevalence and population targets. All 95% predictive intervals overlapped the target intervals (S1 Text, Section 2). In 2015, the model estimated 20,915 people with a history of injecting drugs. Of these, 1,513 were in F and 14,680 were in X.</w:t>
+        <w:t xml:space="preserve">The model reproduced the age specific seroprevalence and population targets. All 95% predictive intervals overlapped the target intervals (S1 Text, Section 2). In 2015, the model estimated 21,224 (95% interval: 19,226–23,437) people with a history of injecting drugs. Of these, 1,532 (1,393–1,681) were in F and 14,917 (13,428–16,590) were in X.</w:t>
       </w:r>
     </w:p>
     <w:bookmarkEnd w:id="25"/>
@@ -775,7 +772,7 @@
         <w:pStyle w:val="FirstParagraph"/>
       </w:pPr>
       <w:r>
-        <w:t xml:space="preserve">Without any treatment, new infections rose after 2015 as entry into injecting increased. They remained high to 2030 (Fig 2). In 2030 annual new infections were 130.3% (95% UI: 121.6%–140.0%) of the 2015 level. HCV deaths were 101.2% (95% UI: 100.6%–102.0%) of the 2015 level.</w:t>
+        <w:t xml:space="preserve">Without any treatment, new infections rose after 2015 as entry into injecting increased. They remained high to 2030 (Fig 2). In 2030 annual new infections were 132.5% (95% UI: 120.9%–147.3%) of the 2015 level. HCV deaths were 101.1% (95% UI: 100.4%–102.1%) of the 2015 level.</w:t>
       </w:r>
     </w:p>
     <w:p>
@@ -783,7 +780,7 @@
         <w:pStyle w:val="BodyText"/>
       </w:pPr>
       <w:r>
-        <w:t xml:space="preserve">Prison treatment from 2019 changed the course of new infections. By 2025 they were 45.8% (95% UI: 41.4%–51.0%) of the 2015 level. By 2030 they had fallen by 75.9% (95% UI: 70.5%–79.8%). This was close to the 80% target. Deaths fell more slowly. By 2025 they were still 73.3% (95% UI: 72.6%–73.9%) of the 2015 level. By 2030 the reduction was 42.6% (95% UI: 41.8%–43.5%), well short of the 65% target.</w:t>
+        <w:t xml:space="preserve">Prison treatment from 2019 changed the course of new infections. By 2025 they were 46.3% (95% UI: 40.7%–53.0%) of the 2015 level. By 2030 they had fallen by 75.6% (95% UI: 68.5%–80.4%). This was close to the 80% target. Deaths fell more slowly. By 2025 they were still 73.3% (95% UI: 72.4%–74.1%) of the 2015 level. By 2030 the reduction was 42.6% (95% UI: 41.6%–43.7%), well short of the 65% target.</w:t>
       </w:r>
     </w:p>
     <w:p>
@@ -791,7 +788,7 @@
         <w:pStyle w:val="BodyText"/>
       </w:pPr>
       <w:r>
-        <w:t xml:space="preserve">The reason lies in where infection and disease sit after release. In 2026, F held 103 (95% UI: 94–114) people with chronic infection. X held 1,620 (95% UI: 1,478–1,794). X thus held 94% of chronic infections among released people. In the J only scenario, 97% of HCV deaths in 2026 occurred in F and X. By 2030 this share was 98%. People in X do not inject and do not transmit. Prison treatment does not reach them after release.</w:t>
+        <w:t xml:space="preserve">The reason lies in where infection and disease sit after release. In 2026, F held 103 (95% UI: 92–117) people with chronic infection. X held 1,635 (95% UI: 1,462–1,850). X thus held 94% of chronic infections among released people. In the J only scenario, 97% of HCV deaths in 2026 occurred in F and X. By 2030 this share was 98%. People in X do not inject and do not transmit. Prison treatment does not reach them after release.</w:t>
       </w:r>
     </w:p>
     <w:bookmarkEnd w:id="26"/>
@@ -809,7 +806,7 @@
         <w:pStyle w:val="FirstParagraph"/>
       </w:pPr>
       <w:r>
-        <w:t xml:space="preserve">Adding community screening increased both reductions (Table 1). The incidence target was met at the median in all 15 scenarios. The mortality target was met in only 3. Only 3 scenarios met both. These were 5,000 tests a year with 25% to F, and 8,000 tests a year with 25% or 50% to F. At 5,000 tests a year with 25% to F, the mortality reduction was 65.1% (95% UI: 63.7%–66.4%). Both targets were met in only 56% of draws, so this result is fragile. At 8,000 tests a year with 25% to F, both targets were met in 100% of draws. The ideal reference met both targets with a mortality reduction of 74.6% (95% UI: 74.4%–74.8%).</w:t>
+        <w:t xml:space="preserve">Adding community screening increased both reductions (Table 1). The incidence target was met at the median in 14 of 15 scenarios. The mortality target was met in only 2. Only 2 scenarios met both. These were 8,000 tests a year with 25% or 50% to F. At 5,000 tests a year with 25% to F, the median mortality reduction was 64.9% (95% UI: 63.2%–66.5%), just below the target. Both targets were met in 45% of draws, so this scenario sits on the threshold. At 8,000 tests a year with 25% to F, both targets were met in 100% of draws. With 50% to F, the share was 82%. The ideal reference met both targets with a mortality reduction of 74.6% (95% UI: 74.3%–74.9%).</w:t>
       </w:r>
     </w:p>
     <w:p>
@@ -817,7 +814,7 @@
         <w:pStyle w:val="BodyText"/>
       </w:pPr>
       <w:r>
-        <w:t xml:space="preserve">At 600 tests a year, the planned size of the current community programme, the mortality reduction was at most 46.6%. This was a gain of under 5 percentage points over prison treatment alone.</w:t>
+        <w:t xml:space="preserve">At 600 tests a year, the planned size of the current community programme, the mortality reduction was at most 46.5%. This was a gain of under 5 percentage points over prison treatment alone.</w:t>
       </w:r>
     </w:p>
     <w:bookmarkEnd w:id="27"/>
@@ -843,7 +840,7 @@
         <w:pStyle w:val="BodyText"/>
       </w:pPr>
       <w:r>
-        <w:t xml:space="preserve">The F group is small. In 2026 about 1,560 people in F were eligible for screening each year. Once the F quota exceeded this number, extra tests could not be used (S1 Text, Fig S5). At 8,000 tests a year with 25% to F, 78% of the F quota was used. With 75% to F, only 26% was used. In all three splits at this capacity, the incidence reduction was 94.2%. The extra F tests were idle, while the X tests they replaced were lost. The mortality reduction fell from 70.7% (95% UI: 69.6%–71.7%) with 25% to F to 57.4% (95% UI: 56.1%–58.6%) with 75% to F.</w:t>
+        <w:t xml:space="preserve">The F group is small. In 2026 about 1,580 people in F were eligible for screening each year. Once the F quota exceeded this number, extra tests could not be used (S1 Text, Fig S5). At 8,000 tests a year with 25% to F, 78% of the F quota was used. With 75% to F, only 26% was used. In all three splits at this capacity, the incidence reduction was 94.0%. The extra F tests were idle, while the X tests they replaced were lost. The mortality reduction fell from 70.6% (95% UI: 69.2%–71.8%) with 25% to F to 57.2% (95% UI: 55.6%–58.7%) with 75% to F.</w:t>
       </w:r>
     </w:p>
     <w:p>
@@ -851,7 +848,7 @@
         <w:pStyle w:val="BodyText"/>
       </w:pPr>
       <w:r>
-        <w:t xml:space="preserve">At lower capacities there was a real trade off. At 2,000 tests a year, moving from 25% to 75% for F raised the incidence reduction from 87.1% to 94.0%. It lowered the mortality reduction from 54.3% to 47.3%. A simple rule follows. F should receive enough tests to cover its eligible group each year, about 1,550. All remaining capacity should go to X.</w:t>
+        <w:t xml:space="preserve">At lower capacities there was a real trade off. At 2,000 tests a year, moving from 25% to 75% for F raised the incidence reduction from 86.6% to 93.8%. It lowered the mortality reduction from 54.1% to 47.2%. A simple rule follows. F should receive enough tests to cover its eligible group each year, about 1,550. All remaining capacity should go to X.</w:t>
       </w:r>
     </w:p>
     <w:bookmarkEnd w:id="28"/>
@@ -869,7 +866,7 @@
         <w:pStyle w:val="FirstParagraph"/>
       </w:pPr>
       <w:r>
-        <w:t xml:space="preserve">Treatment starts in F and X over 2026 to 2030 ranged from 154 (95% UI: 145–165) at 600 tests a year with 75% to F, to 1,607 (95% UI: 1,501–1,733) at 8,000 tests a year with 25% to F (Table 1). Starts were highest in 2026 and fell each year as the stock of chronic infection was treated. The discounted cost of the three scenarios that met both targets ranged from S$63.8 million to S$74.8 million over five years. Drugs made up 95% to 96% of this cost. Compared with prison treatment alone, each extra percentage point of mortality reduction cost about S$2.0 million in the two scenarios with 25% to F at 5,000 and 8,000 tests a year. The two training seeds gave nearly the same results (S1 Text, Table S10).</w:t>
+        <w:t xml:space="preserve">Treatment starts in F and X over 2026 to 2030 ranged from 153 (95% UI: 141–167) at 600 tests a year with 75% to F, to 1,615 (95% UI: 1,479–1,766) at 8,000 tests a year with 25% to F (Table 1). Starts were highest in 2026 and fell each year as the stock of chronic infection was treated. The discounted cost of the 2 finite scenarios that met both targets ranged from S$64.0 million to S$75.2 million over five years. Drugs made up 95% to 96% of this cost. Compared with prison treatment alone, each extra percentage point of mortality reduction cost about S$2.0 million in the two scenarios with 25% to F at 5,000 and 8,000 tests a year. Single round neural posterior estimation gave policy results within 0.4% of these values (S1 Text, Table S4).</w:t>
       </w:r>
     </w:p>
     <w:p>
@@ -989,18 +986,18 @@
               <w:pStyle w:val="Compact"/>
             </w:pPr>
             <w:r>
-              <w:t xml:space="preserve">75.9% (95% UI: 70.5%–79.8%)</w:t>
-            </w:r>
-          </w:p>
-        </w:tc>
-        <w:tc>
-          <w:tcPr/>
-          <w:p>
-            <w:pPr>
-              <w:pStyle w:val="Compact"/>
-            </w:pPr>
-            <w:r>
-              <w:t xml:space="preserve">42.6% (95% UI: 41.8%–43.5%)</w:t>
+              <w:t xml:space="preserve">75.6% (95% UI: 68.5%–80.4%)</w:t>
+            </w:r>
+          </w:p>
+        </w:tc>
+        <w:tc>
+          <w:tcPr/>
+          <w:p>
+            <w:pPr>
+              <w:pStyle w:val="Compact"/>
+            </w:pPr>
+            <w:r>
+              <w:t xml:space="preserve">42.6% (95% UI: 41.6%–43.7%)</w:t>
             </w:r>
           </w:p>
         </w:tc>
@@ -1033,7 +1030,7 @@
               <w:pStyle w:val="Compact"/>
             </w:pPr>
             <w:r>
-              <w:t xml:space="preserve">17.5 (95% UI: 15.5–20.0)</w:t>
+              <w:t xml:space="preserve">17.6 (95% UI: 15.0–20.7)</w:t>
             </w:r>
           </w:p>
         </w:tc>
@@ -1057,18 +1054,18 @@
               <w:pStyle w:val="Compact"/>
             </w:pPr>
             <w:r>
-              <w:t xml:space="preserve">83.5% (95% UI: 79.4%–86.4%)</w:t>
-            </w:r>
-          </w:p>
-        </w:tc>
-        <w:tc>
-          <w:tcPr/>
-          <w:p>
-            <w:pPr>
-              <w:pStyle w:val="Compact"/>
-            </w:pPr>
-            <w:r>
-              <w:t xml:space="preserve">45.4% (95% UI: 44.5%–46.3%)</w:t>
+              <w:t xml:space="preserve">83.2% (95% UI: 77.8%–86.8%)</w:t>
+            </w:r>
+          </w:p>
+        </w:tc>
+        <w:tc>
+          <w:tcPr/>
+          <w:p>
+            <w:pPr>
+              <w:pStyle w:val="Compact"/>
+            </w:pPr>
+            <w:r>
+              <w:t xml:space="preserve">45.4% (95% UI: 44.2%–46.5%)</w:t>
             </w:r>
           </w:p>
         </w:tc>
@@ -1090,18 +1087,18 @@
               <w:pStyle w:val="Compact"/>
             </w:pPr>
             <w:r>
-              <w:t xml:space="preserve">200 (95% UI: 190–212)</w:t>
-            </w:r>
-          </w:p>
-        </w:tc>
-        <w:tc>
-          <w:tcPr/>
-          <w:p>
-            <w:pPr>
-              <w:pStyle w:val="Compact"/>
-            </w:pPr>
-            <w:r>
-              <w:t xml:space="preserve">22.4 (95% UI: 20.4–24.9)</w:t>
+              <w:t xml:space="preserve">200 (95% UI: 186–214)</w:t>
+            </w:r>
+          </w:p>
+        </w:tc>
+        <w:tc>
+          <w:tcPr/>
+          <w:p>
+            <w:pPr>
+              <w:pStyle w:val="Compact"/>
+            </w:pPr>
+            <w:r>
+              <w:t xml:space="preserve">22.5 (95% UI: 19.9–25.5)</w:t>
             </w:r>
           </w:p>
         </w:tc>
@@ -1125,18 +1122,18 @@
               <w:pStyle w:val="Compact"/>
             </w:pPr>
             <w:r>
-              <w:t xml:space="preserve">87.1% (95% UI: 83.6%–89.4%)</w:t>
-            </w:r>
-          </w:p>
-        </w:tc>
-        <w:tc>
-          <w:tcPr/>
-          <w:p>
-            <w:pPr>
-              <w:pStyle w:val="Compact"/>
-            </w:pPr>
-            <w:r>
-              <w:t xml:space="preserve">54.3% (95% UI: 53.0%–55.4%)</w:t>
+              <w:t xml:space="preserve">86.6% (95% UI: 82.1%–89.7%)</w:t>
+            </w:r>
+          </w:p>
+        </w:tc>
+        <w:tc>
+          <w:tcPr/>
+          <w:p>
+            <w:pPr>
+              <w:pStyle w:val="Compact"/>
+            </w:pPr>
+            <w:r>
+              <w:t xml:space="preserve">54.1% (95% UI: 52.6%–55.5%)</w:t>
             </w:r>
           </w:p>
         </w:tc>
@@ -1158,18 +1155,18 @@
               <w:pStyle w:val="Compact"/>
             </w:pPr>
             <w:r>
-              <w:t xml:space="preserve">694 (95% UI: 659–734)</w:t>
-            </w:r>
-          </w:p>
-        </w:tc>
-        <w:tc>
-          <w:tcPr/>
-          <w:p>
-            <w:pPr>
-              <w:pStyle w:val="Compact"/>
-            </w:pPr>
-            <w:r>
-              <w:t xml:space="preserve">40.5 (95% UI: 38.0–43.5)</w:t>
+              <w:t xml:space="preserve">692 (95% UI: 645–741)</w:t>
+            </w:r>
+          </w:p>
+        </w:tc>
+        <w:tc>
+          <w:tcPr/>
+          <w:p>
+            <w:pPr>
+              <w:pStyle w:val="Compact"/>
+            </w:pPr>
+            <w:r>
+              <w:t xml:space="preserve">40.5 (95% UI: 37.3–44.4)</w:t>
             </w:r>
           </w:p>
         </w:tc>
@@ -1193,18 +1190,18 @@
               <w:pStyle w:val="Compact"/>
             </w:pPr>
             <w:r>
-              <w:t xml:space="preserve">94.0% (95% UI: 92.4%–95.2%)</w:t>
-            </w:r>
-          </w:p>
-        </w:tc>
-        <w:tc>
-          <w:tcPr/>
-          <w:p>
-            <w:pPr>
-              <w:pStyle w:val="Compact"/>
-            </w:pPr>
-            <w:r>
-              <w:t xml:space="preserve">47.3% (95% UI: 46.3%–48.2%)</w:t>
+              <w:t xml:space="preserve">93.8% (95% UI: 91.6%–95.2%)</w:t>
+            </w:r>
+          </w:p>
+        </w:tc>
+        <w:tc>
+          <w:tcPr/>
+          <w:p>
+            <w:pPr>
+              <w:pStyle w:val="Compact"/>
+            </w:pPr>
+            <w:r>
+              <w:t xml:space="preserve">47.2% (95% UI: 46.0%–48.4%)</w:t>
             </w:r>
           </w:p>
         </w:tc>
@@ -1226,18 +1223,18 @@
               <w:pStyle w:val="Compact"/>
             </w:pPr>
             <w:r>
-              <w:t xml:space="preserve">377 (95% UI: 356–401)</w:t>
-            </w:r>
-          </w:p>
-        </w:tc>
-        <w:tc>
-          <w:tcPr/>
-          <w:p>
-            <w:pPr>
-              <w:pStyle w:val="Compact"/>
-            </w:pPr>
-            <w:r>
-              <w:t xml:space="preserve">24.0 (95% UI: 22.2–26.2)</w:t>
+              <w:t xml:space="preserve">376 (95% UI: 349–408)</w:t>
+            </w:r>
+          </w:p>
+        </w:tc>
+        <w:tc>
+          <w:tcPr/>
+          <w:p>
+            <w:pPr>
+              <w:pStyle w:val="Compact"/>
+            </w:pPr>
+            <w:r>
+              <w:t xml:space="preserve">24.2 (95% UI: 21.8–26.9)</w:t>
             </w:r>
           </w:p>
         </w:tc>
@@ -1261,51 +1258,51 @@
               <w:pStyle w:val="Compact"/>
             </w:pPr>
             <w:r>
-              <w:t xml:space="preserve">93.3% (95% UI: 91.3%–94.5%)</w:t>
-            </w:r>
-          </w:p>
-        </w:tc>
-        <w:tc>
-          <w:tcPr/>
-          <w:p>
-            <w:pPr>
-              <w:pStyle w:val="Compact"/>
-            </w:pPr>
-            <w:r>
-              <w:t xml:space="preserve">65.1% (95% UI: 63.7%–66.4%)</w:t>
-            </w:r>
-          </w:p>
-        </w:tc>
-        <w:tc>
-          <w:tcPr/>
-          <w:p>
-            <w:pPr>
-              <w:pStyle w:val="Compact"/>
-            </w:pPr>
-            <w:r>
-              <w:t xml:space="preserve">56%</w:t>
-            </w:r>
-          </w:p>
-        </w:tc>
-        <w:tc>
-          <w:tcPr/>
-          <w:p>
-            <w:pPr>
-              <w:pStyle w:val="Compact"/>
-            </w:pPr>
-            <w:r>
-              <w:t xml:space="preserve">1,305 (95% UI: 1,232–1,395)</w:t>
-            </w:r>
-          </w:p>
-        </w:tc>
-        <w:tc>
-          <w:tcPr/>
-          <w:p>
-            <w:pPr>
-              <w:pStyle w:val="Compact"/>
-            </w:pPr>
-            <w:r>
-              <w:t xml:space="preserve">62.2 (95% UI: 58.6–66.5)</w:t>
+              <w:t xml:space="preserve">93.0% (95% UI: 90.4%–94.7%)</w:t>
+            </w:r>
+          </w:p>
+        </w:tc>
+        <w:tc>
+          <w:tcPr/>
+          <w:p>
+            <w:pPr>
+              <w:pStyle w:val="Compact"/>
+            </w:pPr>
+            <w:r>
+              <w:t xml:space="preserve">64.9% (95% UI: 63.2%–66.5%)</w:t>
+            </w:r>
+          </w:p>
+        </w:tc>
+        <w:tc>
+          <w:tcPr/>
+          <w:p>
+            <w:pPr>
+              <w:pStyle w:val="Compact"/>
+            </w:pPr>
+            <w:r>
+              <w:t xml:space="preserve">45%</w:t>
+            </w:r>
+          </w:p>
+        </w:tc>
+        <w:tc>
+          <w:tcPr/>
+          <w:p>
+            <w:pPr>
+              <w:pStyle w:val="Compact"/>
+            </w:pPr>
+            <w:r>
+              <w:t xml:space="preserve">1,309 (95% UI: 1,214–1,415)</w:t>
+            </w:r>
+          </w:p>
+        </w:tc>
+        <w:tc>
+          <w:tcPr/>
+          <w:p>
+            <w:pPr>
+              <w:pStyle w:val="Compact"/>
+            </w:pPr>
+            <w:r>
+              <w:t xml:space="preserve">62.4 (95% UI: 57.7–67.8)</w:t>
             </w:r>
           </w:p>
         </w:tc>
@@ -1329,18 +1326,18 @@
               <w:pStyle w:val="Compact"/>
             </w:pPr>
             <w:r>
-              <w:t xml:space="preserve">94.2% (95% UI: 92.5%–95.3%)</w:t>
-            </w:r>
-          </w:p>
-        </w:tc>
-        <w:tc>
-          <w:tcPr/>
-          <w:p>
-            <w:pPr>
-              <w:pStyle w:val="Compact"/>
-            </w:pPr>
-            <w:r>
-              <w:t xml:space="preserve">60.0% (95% UI: 58.6%–61.3%)</w:t>
+              <w:t xml:space="preserve">94.0% (95% UI: 91.9%–95.4%)</w:t>
+            </w:r>
+          </w:p>
+        </w:tc>
+        <w:tc>
+          <w:tcPr/>
+          <w:p>
+            <w:pPr>
+              <w:pStyle w:val="Compact"/>
+            </w:pPr>
+            <w:r>
+              <w:t xml:space="preserve">59.8% (95% UI: 58.1%–61.4%)</w:t>
             </w:r>
           </w:p>
         </w:tc>
@@ -1362,18 +1359,18 @@
               <w:pStyle w:val="Compact"/>
             </w:pPr>
             <w:r>
-              <w:t xml:space="preserve">1,046 (95% UI: 990–1,114)</w:t>
-            </w:r>
-          </w:p>
-        </w:tc>
-        <w:tc>
-          <w:tcPr/>
-          <w:p>
-            <w:pPr>
-              <w:pStyle w:val="Compact"/>
-            </w:pPr>
-            <w:r>
-              <w:t xml:space="preserve">50.8 (95% UI: 48.0–54.2)</w:t>
+              <w:t xml:space="preserve">1,047 (95% UI: 975–1,128)</w:t>
+            </w:r>
+          </w:p>
+        </w:tc>
+        <w:tc>
+          <w:tcPr/>
+          <w:p>
+            <w:pPr>
+              <w:pStyle w:val="Compact"/>
+            </w:pPr>
+            <w:r>
+              <w:t xml:space="preserve">50.9 (95% UI: 47.2–55.2)</w:t>
             </w:r>
           </w:p>
         </w:tc>
@@ -1397,18 +1394,18 @@
               <w:pStyle w:val="Compact"/>
             </w:pPr>
             <w:r>
-              <w:t xml:space="preserve">94.2% (95% UI: 92.5%–95.3%)</w:t>
-            </w:r>
-          </w:p>
-        </w:tc>
-        <w:tc>
-          <w:tcPr/>
-          <w:p>
-            <w:pPr>
-              <w:pStyle w:val="Compact"/>
-            </w:pPr>
-            <w:r>
-              <w:t xml:space="preserve">52.8% (95% UI: 51.6%–53.9%)</w:t>
+              <w:t xml:space="preserve">94.0% (95% UI: 91.9%–95.4%)</w:t>
+            </w:r>
+          </w:p>
+        </w:tc>
+        <w:tc>
+          <w:tcPr/>
+          <w:p>
+            <w:pPr>
+              <w:pStyle w:val="Compact"/>
+            </w:pPr>
+            <w:r>
+              <w:t xml:space="preserve">52.7% (95% UI: 51.2%–54.0%)</w:t>
             </w:r>
           </w:p>
         </w:tc>
@@ -1430,18 +1427,18 @@
               <w:pStyle w:val="Compact"/>
             </w:pPr>
             <w:r>
-              <w:t xml:space="preserve">670 (95% UI: 635–711)</w:t>
-            </w:r>
-          </w:p>
-        </w:tc>
-        <w:tc>
-          <w:tcPr/>
-          <w:p>
-            <w:pPr>
-              <w:pStyle w:val="Compact"/>
-            </w:pPr>
-            <w:r>
-              <w:t xml:space="preserve">35.6 (95% UI: 33.5–38.2)</w:t>
+              <w:t xml:space="preserve">670 (95% UI: 622–720)</w:t>
+            </w:r>
+          </w:p>
+        </w:tc>
+        <w:tc>
+          <w:tcPr/>
+          <w:p>
+            <w:pPr>
+              <w:pStyle w:val="Compact"/>
+            </w:pPr>
+            <w:r>
+              <w:t xml:space="preserve">35.7 (95% UI: 32.8–39.0)</w:t>
             </w:r>
           </w:p>
         </w:tc>
@@ -1465,18 +1462,18 @@
               <w:pStyle w:val="Compact"/>
             </w:pPr>
             <w:r>
-              <w:t xml:space="preserve">94.2% (95% UI: 92.5%–95.3%)</w:t>
-            </w:r>
-          </w:p>
-        </w:tc>
-        <w:tc>
-          <w:tcPr/>
-          <w:p>
-            <w:pPr>
-              <w:pStyle w:val="Compact"/>
-            </w:pPr>
-            <w:r>
-              <w:t xml:space="preserve">70.7% (95% UI: 69.6%–71.7%)</w:t>
+              <w:t xml:space="preserve">94.0% (95% UI: 91.9%–95.4%)</w:t>
+            </w:r>
+          </w:p>
+        </w:tc>
+        <w:tc>
+          <w:tcPr/>
+          <w:p>
+            <w:pPr>
+              <w:pStyle w:val="Compact"/>
+            </w:pPr>
+            <w:r>
+              <w:t xml:space="preserve">70.6% (95% UI: 69.2%–71.8%)</w:t>
             </w:r>
           </w:p>
         </w:tc>
@@ -1498,18 +1495,18 @@
               <w:pStyle w:val="Compact"/>
             </w:pPr>
             <w:r>
-              <w:t xml:space="preserve">1,607 (95% UI: 1,501–1,733)</w:t>
-            </w:r>
-          </w:p>
-        </w:tc>
-        <w:tc>
-          <w:tcPr/>
-          <w:p>
-            <w:pPr>
-              <w:pStyle w:val="Compact"/>
-            </w:pPr>
-            <w:r>
-              <w:t xml:space="preserve">74.8 (95% UI: 70.2–80.3)</w:t>
+              <w:t xml:space="preserve">1,615 (95% UI: 1,479–1,766)</w:t>
+            </w:r>
+          </w:p>
+        </w:tc>
+        <w:tc>
+          <w:tcPr/>
+          <w:p>
+            <w:pPr>
+              <w:pStyle w:val="Compact"/>
+            </w:pPr>
+            <w:r>
+              <w:t xml:space="preserve">75.2 (95% UI: 69.2–82.1)</w:t>
             </w:r>
           </w:p>
         </w:tc>
@@ -1533,51 +1530,51 @@
               <w:pStyle w:val="Compact"/>
             </w:pPr>
             <w:r>
-              <w:t xml:space="preserve">94.2% (95% UI: 92.5%–95.3%)</w:t>
-            </w:r>
-          </w:p>
-        </w:tc>
-        <w:tc>
-          <w:tcPr/>
-          <w:p>
-            <w:pPr>
-              <w:pStyle w:val="Compact"/>
-            </w:pPr>
-            <w:r>
-              <w:t xml:space="preserve">66.0% (95% UI: 64.6%–67.2%)</w:t>
-            </w:r>
-          </w:p>
-        </w:tc>
-        <w:tc>
-          <w:tcPr/>
-          <w:p>
-            <w:pPr>
-              <w:pStyle w:val="Compact"/>
-            </w:pPr>
-            <w:r>
-              <w:t xml:space="preserve">92%</w:t>
-            </w:r>
-          </w:p>
-        </w:tc>
-        <w:tc>
-          <w:tcPr/>
-          <w:p>
-            <w:pPr>
-              <w:pStyle w:val="Compact"/>
-            </w:pPr>
-            <w:r>
-              <w:t xml:space="preserve">1,357 (95% UI: 1,279–1,453)</w:t>
-            </w:r>
-          </w:p>
-        </w:tc>
-        <w:tc>
-          <w:tcPr/>
-          <w:p>
-            <w:pPr>
-              <w:pStyle w:val="Compact"/>
-            </w:pPr>
-            <w:r>
-              <w:t xml:space="preserve">63.8 (95% UI: 60.1–68.2)</w:t>
+              <w:t xml:space="preserve">94.0% (95% UI: 91.9%–95.4%)</w:t>
+            </w:r>
+          </w:p>
+        </w:tc>
+        <w:tc>
+          <w:tcPr/>
+          <w:p>
+            <w:pPr>
+              <w:pStyle w:val="Compact"/>
+            </w:pPr>
+            <w:r>
+              <w:t xml:space="preserve">65.8% (95% UI: 64.0%–67.3%)</w:t>
+            </w:r>
+          </w:p>
+        </w:tc>
+        <w:tc>
+          <w:tcPr/>
+          <w:p>
+            <w:pPr>
+              <w:pStyle w:val="Compact"/>
+            </w:pPr>
+            <w:r>
+              <w:t xml:space="preserve">82%</w:t>
+            </w:r>
+          </w:p>
+        </w:tc>
+        <w:tc>
+          <w:tcPr/>
+          <w:p>
+            <w:pPr>
+              <w:pStyle w:val="Compact"/>
+            </w:pPr>
+            <w:r>
+              <w:t xml:space="preserve">1,361 (95% UI: 1,261–1,476)</w:t>
+            </w:r>
+          </w:p>
+        </w:tc>
+        <w:tc>
+          <w:tcPr/>
+          <w:p>
+            <w:pPr>
+              <w:pStyle w:val="Compact"/>
+            </w:pPr>
+            <w:r>
+              <w:t xml:space="preserve">64.0 (95% UI: 59.1–69.5)</w:t>
             </w:r>
           </w:p>
         </w:tc>
@@ -1601,18 +1598,18 @@
               <w:pStyle w:val="Compact"/>
             </w:pPr>
             <w:r>
-              <w:t xml:space="preserve">94.2% (95% UI: 92.5%–95.3%)</w:t>
-            </w:r>
-          </w:p>
-        </w:tc>
-        <w:tc>
-          <w:tcPr/>
-          <w:p>
-            <w:pPr>
-              <w:pStyle w:val="Compact"/>
-            </w:pPr>
-            <w:r>
-              <w:t xml:space="preserve">57.4% (95% UI: 56.1%–58.6%)</w:t>
+              <w:t xml:space="preserve">94.0% (95% UI: 91.9%–95.4%)</w:t>
+            </w:r>
+          </w:p>
+        </w:tc>
+        <w:tc>
+          <w:tcPr/>
+          <w:p>
+            <w:pPr>
+              <w:pStyle w:val="Compact"/>
+            </w:pPr>
+            <w:r>
+              <w:t xml:space="preserve">57.2% (95% UI: 55.6%–58.7%)</w:t>
             </w:r>
           </w:p>
         </w:tc>
@@ -1634,18 +1631,18 @@
               <w:pStyle w:val="Compact"/>
             </w:pPr>
             <w:r>
-              <w:t xml:space="preserve">910 (95% UI: 862–968)</w:t>
-            </w:r>
-          </w:p>
-        </w:tc>
-        <w:tc>
-          <w:tcPr/>
-          <w:p>
-            <w:pPr>
-              <w:pStyle w:val="Compact"/>
-            </w:pPr>
-            <w:r>
-              <w:t xml:space="preserve">45.3 (95% UI: 42.7–48.4)</w:t>
+              <w:t xml:space="preserve">910 (95% UI: 848–978)</w:t>
+            </w:r>
+          </w:p>
+        </w:tc>
+        <w:tc>
+          <w:tcPr/>
+          <w:p>
+            <w:pPr>
+              <w:pStyle w:val="Compact"/>
+            </w:pPr>
+            <w:r>
+              <w:t xml:space="preserve">45.4 (95% UI: 42.0–49.2)</w:t>
             </w:r>
           </w:p>
         </w:tc>
@@ -1669,18 +1666,18 @@
               <w:pStyle w:val="Compact"/>
             </w:pPr>
             <w:r>
-              <w:t xml:space="preserve">94.2% (95% UI: 92.5%–95.3%)</w:t>
-            </w:r>
-          </w:p>
-        </w:tc>
-        <w:tc>
-          <w:tcPr/>
-          <w:p>
-            <w:pPr>
-              <w:pStyle w:val="Compact"/>
-            </w:pPr>
-            <w:r>
-              <w:t xml:space="preserve">74.6% (95% UI: 74.4%–74.8%)</w:t>
+              <w:t xml:space="preserve">94.0% (95% UI: 91.9%–95.4%)</w:t>
+            </w:r>
+          </w:p>
+        </w:tc>
+        <w:tc>
+          <w:tcPr/>
+          <w:p>
+            <w:pPr>
+              <w:pStyle w:val="Compact"/>
+            </w:pPr>
+            <w:r>
+              <w:t xml:space="preserve">74.6% (95% UI: 74.3%–74.9%)</w:t>
             </w:r>
           </w:p>
         </w:tc>
@@ -1702,18 +1699,18 @@
               <w:pStyle w:val="Compact"/>
             </w:pPr>
             <w:r>
-              <w:t xml:space="preserve">1,883 (95% UI: 1,725–2,075)</w:t>
-            </w:r>
-          </w:p>
-        </w:tc>
-        <w:tc>
-          <w:tcPr/>
-          <w:p>
-            <w:pPr>
-              <w:pStyle w:val="Compact"/>
-            </w:pPr>
-            <w:r>
-              <w:t xml:space="preserve">91.3 (95% UI: 84.0–99.8)</w:t>
+              <w:t xml:space="preserve">1,899 (95% UI: 1,710–2,138)</w:t>
+            </w:r>
+          </w:p>
+        </w:tc>
+        <w:tc>
+          <w:tcPr/>
+          <w:p>
+            <w:pPr>
+              <w:pStyle w:val="Compact"/>
+            </w:pPr>
+            <w:r>
+              <w:t xml:space="preserve">92.2 (95% UI: 83.4–103.1)</w:t>
             </w:r>
           </w:p>
         </w:tc>
@@ -1724,7 +1721,7 @@
         <w:pStyle w:val="BodyText"/>
       </w:pPr>
       <w:r>
-        <w:t xml:space="preserve">Reductions compare 2030 with 2015. Values are medians (95% UI) across 2,000 posterior draws. Targets are at least 80% for incidence and at least 65% for mortality. Costs are in 2026 Singapore dollars, discounted at 3% a year, and include prison treatment costs from 2026. Treatment starts count courses, not people. S1 Text, Table S8 gives all 17 scenarios.</w:t>
+        <w:t xml:space="preserve">Reductions compare 2030 with 2015. Values are medians (95% UI) across 2,000 posterior draws. Targets are at least 80% for incidence and at least 65% for mortality. Costs are in 2026 Singapore dollars, discounted at 3% a year, and include prison treatment costs from 2026. Treatment starts count courses, not people. S1 Text, Table S9 gives all 17 scenarios.</w:t>
       </w:r>
     </w:p>
     <w:bookmarkEnd w:id="29"/>
@@ -1785,7 +1782,7 @@
         <w:pStyle w:val="BodyText"/>
       </w:pPr>
       <w:r>
-        <w:t xml:space="preserve">The scale required is large. The scenarios that met both targets needed 5,000 to 8,000 tests a year. That is 8 to 13 times the planned capacity of the current community programme</w:t>
+        <w:t xml:space="preserve">The scale required is large. The scenarios that met both targets needed 8,000 tests a year. That is about 13 times the planned capacity of the current community programme</w:t>
       </w:r>
       <w:r>
         <w:t xml:space="preserve"> </w:t>
@@ -1794,7 +1791,7 @@
         <w:t xml:space="preserve">[11]</w:t>
       </w:r>
       <w:r>
-        <w:t xml:space="preserve">. They also assumed that every person identified starts treatment. Real linkage is weaker. In a Singapore trial among halfway house residents, only 12.6% of people with antibodies started treatment</w:t>
+        <w:t xml:space="preserve">. Even 5,000 tests a year met both targets in fewer than half of the draws. All scenarios also assumed that every person identified starts treatment. Real linkage is weaker. In a Singapore trial among halfway house residents, only 12.6% of people with antibodies started treatment</w:t>
       </w:r>
       <w:r>
         <w:t xml:space="preserve"> </w:t>
@@ -1820,7 +1817,7 @@
         <w:pStyle w:val="BodyText"/>
       </w:pPr>
       <w:r>
-        <w:t xml:space="preserve">Our study has several strengths. We propagated parameter uncertainty through every scenario using 2,000 posterior draws from two independently trained estimators. We modelled screening capacity explicitly, so treatment depends on how many people are found. We separated released people by injecting status, which earlier work did not do</w:t>
+        <w:t xml:space="preserve">Our study has several strengths. We propagated parameter uncertainty through every scenario using 2,000 draws from a well converged MCMC posterior. We checked the posterior against an independent method, neural posterior estimation. We modelled screening capacity explicitly, so treatment depends on how many people are found. We separated released people by injecting status, which earlier work did not do</w:t>
       </w:r>
       <w:r>
         <w:t xml:space="preserve"> </w:t>
@@ -1846,7 +1843,7 @@
         <w:t xml:space="preserve">[3]</w:t>
       </w:r>
       <w:r>
-        <w:t xml:space="preserve">. Second, we calibrated the model to one year of prison data. We did not fit it to observed treatment numbers after 2019. The prison treatment assumption may therefore overstate or understate what happened. Third, we assumed perfect linkage from screening to treatment and no loss to follow up. Fourth, people in X cannot be reinfected or return to injecting. Some do relapse, which would add transmission. Fifth, entry into injecting uses counts of new drug users from law enforcement as a proxy. Sixth, costs use list prices and an older drug price. Actual payer costs are not public. Seventh, our uncertainty intervals cover model parameters only.</w:t>
+        <w:t xml:space="preserve">. Second, we calibrated the model to one year of prison data. We did not fit it to observed treatment numbers after 2019. The prison treatment assumption may therefore overstate or understate what happened. Third, we assumed perfect linkage from screening to treatment and no loss to follow up. Fourth, people in X cannot be reinfected or return to injecting. Some do relapse, which would add transmission. Fifth, entry into injecting uses counts of new drug users from law enforcement as a proxy. Sixth, costs use list prices and an older drug price. Actual payer costs are not public. Seventh, our uncertainty intervals cover model parameters only. The prior was centred on a fit to the same data, and for three parameters the data narrowed the prior little.</w:t>
       </w:r>
     </w:p>
     <w:p>
@@ -1882,7 +1879,7 @@
         <w:t xml:space="preserve"> </w:t>
       </w:r>
       <w:r>
-        <w:t xml:space="preserve">Model equations and parameters, calibration methods and diagnostics, scenario definitions, cost inputs, full scenario results with 95% uncertainty intervals, results by training seed, cost sensitivity and the CHEERS 2022 checklist.</w:t>
+        <w:t xml:space="preserve">Model equations and parameters, calibration methods and diagnostics, the comparison with neural posterior estimation, scenario definitions, cost inputs, full scenario results with 95% uncertainty intervals, cost sensitivity and the CHEERS 2022 checklist.</w:t>
       </w:r>
     </w:p>
     <w:bookmarkEnd w:id="32"/>
@@ -2017,7 +2014,7 @@
               <a:graphicData uri="http://schemas.openxmlformats.org/drawingml/2006/picture">
                 <pic:pic>
                   <pic:nvPicPr>
-                    <pic:cNvPr descr="/Users/yichenhe/Documents/Work/HepC-Transimission-Modelling-feature-AddRecovery/output/scenarios_2026/paper_fig1_schematic.png" id="40" name="Picture"/>
+                    <pic:cNvPr descr="/Users/yichenhe/Documents/Work/HepC-Transimission-Modelling/output/scenarios_2026/paper_fig1_schematic.png" id="40" name="Picture"/>
                     <pic:cNvPicPr>
                       <a:picLocks noChangeArrowheads="1" noChangeAspect="1"/>
                     </pic:cNvPicPr>
@@ -2090,7 +2087,7 @@
               <a:graphicData uri="http://schemas.openxmlformats.org/drawingml/2006/picture">
                 <pic:pic>
                   <pic:nvPicPr>
-                    <pic:cNvPr descr="/Users/yichenhe/Documents/Work/HepC-Transimission-Modelling-feature-AddRecovery/output/scenarios_2026/paper_fig2_trajectories.png" id="43" name="Picture"/>
+                    <pic:cNvPr descr="/Users/yichenhe/Documents/Work/HepC-Transimission-Modelling/output/scenarios_2026/paper_fig2_trajectories.png" id="43" name="Picture"/>
                     <pic:cNvPicPr>
                       <a:picLocks noChangeArrowheads="1" noChangeAspect="1"/>
                     </pic:cNvPicPr>
@@ -2163,7 +2160,7 @@
               <a:graphicData uri="http://schemas.openxmlformats.org/drawingml/2006/picture">
                 <pic:pic>
                   <pic:nvPicPr>
-                    <pic:cNvPr descr="/Users/yichenhe/Documents/Work/HepC-Transimission-Modelling-feature-AddRecovery/output/scenarios_2026/paper_fig3_allocation.png" id="46" name="Picture"/>
+                    <pic:cNvPr descr="/Users/yichenhe/Documents/Work/HepC-Transimission-Modelling/output/scenarios_2026/paper_fig3_allocation.png" id="46" name="Picture"/>
                     <pic:cNvPicPr>
                       <a:picLocks noChangeArrowheads="1" noChangeAspect="1"/>
                     </pic:cNvPicPr>
@@ -2205,7 +2202,7 @@
       </w:r>
     </w:p>
     <w:bookmarkEnd w:id="47"/>
-    <w:bookmarkStart w:id="114" w:name="references"/>
+    <w:bookmarkStart w:id="116" w:name="references"/>
     <w:p>
       <w:pPr>
         <w:pStyle w:val="Heading1"/>
@@ -2214,7 +2211,7 @@
         <w:t xml:space="preserve">References</w:t>
       </w:r>
     </w:p>
-    <w:bookmarkStart w:id="113" w:name="refs"/>
+    <w:bookmarkStart w:id="115" w:name="refs"/>
     <w:bookmarkStart w:id="49" w:name="ref-pawlotsky2020"/>
     <w:p>
       <w:pPr>
@@ -3075,7 +3072,7 @@
       </w:hyperlink>
     </w:p>
     <w:bookmarkEnd w:id="91"/>
-    <w:bookmarkStart w:id="92" w:name="ref-greenberg2019"/>
+    <w:bookmarkStart w:id="93" w:name="ref-haario2001"/>
     <w:p>
       <w:pPr>
         <w:pStyle w:val="Bibliography"/>
@@ -3090,6 +3087,78 @@
         <w:t xml:space="preserve">	</w:t>
       </w:r>
       <w:r>
+        <w:t xml:space="preserve">Haario H, Saksman E, Tamminen J.</w:t>
+      </w:r>
+      <w:r>
+        <w:t xml:space="preserve"> </w:t>
+      </w:r>
+      <w:r>
+        <w:t xml:space="preserve">An adaptive Metropolis algorithm</w:t>
+      </w:r>
+      <w:r>
+        <w:t xml:space="preserve">. Bernoulli. 2001;7: 223–242. doi:</w:t>
+      </w:r>
+      <w:hyperlink r:id="rId92">
+        <w:r>
+          <w:rPr>
+            <w:rStyle w:val="Hyperlink"/>
+          </w:rPr>
+          <w:t xml:space="preserve">10.2307/3318737</w:t>
+        </w:r>
+      </w:hyperlink>
+    </w:p>
+    <w:bookmarkEnd w:id="93"/>
+    <w:bookmarkStart w:id="95" w:name="ref-vehtari2021"/>
+    <w:p>
+      <w:pPr>
+        <w:pStyle w:val="Bibliography"/>
+      </w:pPr>
+      <w:r>
+        <w:t xml:space="preserve">25.</w:t>
+      </w:r>
+      <w:r>
+        <w:t xml:space="preserve"> </w:t>
+      </w:r>
+      <w:r>
+        <w:t xml:space="preserve">	</w:t>
+      </w:r>
+      <w:r>
+        <w:t xml:space="preserve">Vehtari A, Gelman A, Simpson D, Carpenter B, Bürkner P-C.</w:t>
+      </w:r>
+      <w:r>
+        <w:t xml:space="preserve"> </w:t>
+      </w:r>
+      <w:r>
+        <w:t xml:space="preserve">Rank-normalization, folding, and localization: an improved R-hat for assessing convergence of MCMC (with discussion)</w:t>
+      </w:r>
+      <w:r>
+        <w:t xml:space="preserve">. Bayesian Analysis. 2021;16: 667–718. doi:</w:t>
+      </w:r>
+      <w:hyperlink r:id="rId94">
+        <w:r>
+          <w:rPr>
+            <w:rStyle w:val="Hyperlink"/>
+          </w:rPr>
+          <w:t xml:space="preserve">10.1214/20-BA1221</w:t>
+        </w:r>
+      </w:hyperlink>
+    </w:p>
+    <w:bookmarkEnd w:id="95"/>
+    <w:bookmarkStart w:id="96" w:name="ref-greenberg2019"/>
+    <w:p>
+      <w:pPr>
+        <w:pStyle w:val="Bibliography"/>
+      </w:pPr>
+      <w:r>
+        <w:t xml:space="preserve">26.</w:t>
+      </w:r>
+      <w:r>
+        <w:t xml:space="preserve"> </w:t>
+      </w:r>
+      <w:r>
+        <w:t xml:space="preserve">	</w:t>
+      </w:r>
+      <w:r>
         <w:t xml:space="preserve">Greenberg D, Nonnenmacher M, Macke J.</w:t>
       </w:r>
       <w:r>
@@ -3105,14 +3174,14 @@
         <w:t xml:space="preserve"> </w:t>
       </w:r>
     </w:p>
-    <w:bookmarkEnd w:id="92"/>
-    <w:bookmarkStart w:id="93" w:name="ref-papamakarios2017"/>
+    <w:bookmarkEnd w:id="96"/>
+    <w:bookmarkStart w:id="98" w:name="ref-sbi2020"/>
     <w:p>
       <w:pPr>
         <w:pStyle w:val="Bibliography"/>
       </w:pPr>
       <w:r>
-        <w:t xml:space="preserve">25.</w:t>
+        <w:t xml:space="preserve">27.</w:t>
       </w:r>
       <w:r>
         <w:t xml:space="preserve"> </w:t>
@@ -3121,37 +3190,6 @@
         <w:t xml:space="preserve">	</w:t>
       </w:r>
       <w:r>
-        <w:t xml:space="preserve">Papamakarios G, Pavlakou T, Murray I.</w:t>
-      </w:r>
-      <w:r>
-        <w:t xml:space="preserve"> </w:t>
-      </w:r>
-      <w:r>
-        <w:t xml:space="preserve">Masked autoregressive flow for density estimation</w:t>
-      </w:r>
-      <w:r>
-        <w:t xml:space="preserve">. Advances in neural information processing systems 30. 2017. pp. 2335–2344.</w:t>
-      </w:r>
-      <w:r>
-        <w:t xml:space="preserve"> </w:t>
-      </w:r>
-    </w:p>
-    <w:bookmarkEnd w:id="93"/>
-    <w:bookmarkStart w:id="95" w:name="ref-sbi2020"/>
-    <w:p>
-      <w:pPr>
-        <w:pStyle w:val="Bibliography"/>
-      </w:pPr>
-      <w:r>
-        <w:t xml:space="preserve">26.</w:t>
-      </w:r>
-      <w:r>
-        <w:t xml:space="preserve"> </w:t>
-      </w:r>
-      <w:r>
-        <w:t xml:space="preserve">	</w:t>
-      </w:r>
-      <w:r>
         <w:t xml:space="preserve">Tejero-Cantero A, Boelts J, Deistler M, Lueckmann J-M, Durkan C, Gonçalves P, et al.</w:t>
       </w:r>
       <w:r>
@@ -3163,7 +3201,7 @@
       <w:r>
         <w:t xml:space="preserve">. Journal of Open Source Software. 2020;5: 2505. doi:</w:t>
       </w:r>
-      <w:hyperlink r:id="rId94">
+      <w:hyperlink r:id="rId97">
         <w:r>
           <w:rPr>
             <w:rStyle w:val="Hyperlink"/>
@@ -3172,14 +3210,14 @@
         </w:r>
       </w:hyperlink>
     </w:p>
-    <w:bookmarkEnd w:id="95"/>
-    <w:bookmarkStart w:id="96" w:name="ref-talts2018"/>
+    <w:bookmarkEnd w:id="98"/>
+    <w:bookmarkStart w:id="100" w:name="ref-wong2019"/>
     <w:p>
       <w:pPr>
         <w:pStyle w:val="Bibliography"/>
       </w:pPr>
       <w:r>
-        <w:t xml:space="preserve">27.</w:t>
+        <w:t xml:space="preserve">28.</w:t>
       </w:r>
       <w:r>
         <w:t xml:space="preserve"> </w:t>
@@ -3188,37 +3226,6 @@
         <w:t xml:space="preserve">	</w:t>
       </w:r>
       <w:r>
-        <w:t xml:space="preserve">Talts S, Betancourt M, Simpson D, Vehtari A, Gelman A.</w:t>
-      </w:r>
-      <w:r>
-        <w:t xml:space="preserve"> </w:t>
-      </w:r>
-      <w:r>
-        <w:t xml:space="preserve">Validating Bayesian inference algorithms with simulation-based calibration</w:t>
-      </w:r>
-      <w:r>
-        <w:t xml:space="preserve">. arXiv preprint. 2018.</w:t>
-      </w:r>
-      <w:r>
-        <w:t xml:space="preserve"> </w:t>
-      </w:r>
-    </w:p>
-    <w:bookmarkEnd w:id="96"/>
-    <w:bookmarkStart w:id="98" w:name="ref-wong2019"/>
-    <w:p>
-      <w:pPr>
-        <w:pStyle w:val="Bibliography"/>
-      </w:pPr>
-      <w:r>
-        <w:t xml:space="preserve">28.</w:t>
-      </w:r>
-      <w:r>
-        <w:t xml:space="preserve"> </w:t>
-      </w:r>
-      <w:r>
-        <w:t xml:space="preserve">	</w:t>
-      </w:r>
-      <w:r>
         <w:t xml:space="preserve">Wong Y, Cheen MH, Hsiang JC, Kumar R, Tan J, Teo EK, et al.</w:t>
       </w:r>
       <w:r>
@@ -3230,7 +3237,7 @@
       <w:r>
         <w:t xml:space="preserve">. JGH Open. 2019;3: 210–216. doi:</w:t>
       </w:r>
-      <w:hyperlink r:id="rId97">
+      <w:hyperlink r:id="rId99">
         <w:r>
           <w:rPr>
             <w:rStyle w:val="Hyperlink"/>
@@ -3239,8 +3246,8 @@
         </w:r>
       </w:hyperlink>
     </w:p>
-    <w:bookmarkEnd w:id="98"/>
-    <w:bookmarkStart w:id="100" w:name="ref-sgd_rate"/>
+    <w:bookmarkEnd w:id="100"/>
+    <w:bookmarkStart w:id="102" w:name="ref-sgd_rate"/>
     <w:p>
       <w:pPr>
         <w:pStyle w:val="Bibliography"/>
@@ -3269,7 +3276,7 @@
       <w:r>
         <w:t xml:space="preserve"> </w:t>
       </w:r>
-      <w:hyperlink r:id="rId99">
+      <w:hyperlink r:id="rId101">
         <w:r>
           <w:rPr>
             <w:rStyle w:val="Hyperlink"/>
@@ -3278,8 +3285,8 @@
         </w:r>
       </w:hyperlink>
     </w:p>
-    <w:bookmarkEnd w:id="100"/>
-    <w:bookmarkStart w:id="102" w:name="ref-nhg_dsc"/>
+    <w:bookmarkEnd w:id="102"/>
+    <w:bookmarkStart w:id="104" w:name="ref-nhg_dsc"/>
     <w:p>
       <w:pPr>
         <w:pStyle w:val="Bibliography"/>
@@ -3308,7 +3315,7 @@
       <w:r>
         <w:t xml:space="preserve"> </w:t>
       </w:r>
-      <w:hyperlink r:id="rId101">
+      <w:hyperlink r:id="rId103">
         <w:r>
           <w:rPr>
             <w:rStyle w:val="Hyperlink"/>
@@ -3317,8 +3324,8 @@
         </w:r>
       </w:hyperlink>
     </w:p>
-    <w:bookmarkEnd w:id="102"/>
-    <w:bookmarkStart w:id="104" w:name="ref-parkway_rna"/>
+    <w:bookmarkEnd w:id="104"/>
+    <w:bookmarkStart w:id="106" w:name="ref-parkway_rna"/>
     <w:p>
       <w:pPr>
         <w:pStyle w:val="Bibliography"/>
@@ -3347,7 +3354,7 @@
       <w:r>
         <w:t xml:space="preserve"> </w:t>
       </w:r>
-      <w:hyperlink r:id="rId103">
+      <w:hyperlink r:id="rId105">
         <w:r>
           <w:rPr>
             <w:rStyle w:val="Hyperlink"/>
@@ -3356,8 +3363,8 @@
         </w:r>
       </w:hyperlink>
     </w:p>
-    <w:bookmarkEnd w:id="104"/>
-    <w:bookmarkStart w:id="106" w:name="ref-rcpp2011"/>
+    <w:bookmarkEnd w:id="106"/>
+    <w:bookmarkStart w:id="108" w:name="ref-rcpp2011"/>
     <w:p>
       <w:pPr>
         <w:pStyle w:val="Bibliography"/>
@@ -3383,7 +3390,7 @@
       <w:r>
         <w:t xml:space="preserve">. Journal of Statistical Software. 2011;40: 1–18. doi:</w:t>
       </w:r>
-      <w:hyperlink r:id="rId105">
+      <w:hyperlink r:id="rId107">
         <w:r>
           <w:rPr>
             <w:rStyle w:val="Hyperlink"/>
@@ -3392,8 +3399,8 @@
         </w:r>
       </w:hyperlink>
     </w:p>
-    <w:bookmarkEnd w:id="106"/>
-    <w:bookmarkStart w:id="108" w:name="ref-hsiang2022"/>
+    <w:bookmarkEnd w:id="108"/>
+    <w:bookmarkStart w:id="110" w:name="ref-hsiang2022"/>
     <w:p>
       <w:pPr>
         <w:pStyle w:val="Bibliography"/>
@@ -3419,7 +3426,7 @@
       <w:r>
         <w:t xml:space="preserve">. Singapore Medical Journal. 2022;63: 86–92. doi:</w:t>
       </w:r>
-      <w:hyperlink r:id="rId107">
+      <w:hyperlink r:id="rId109">
         <w:r>
           <w:rPr>
             <w:rStyle w:val="Hyperlink"/>
@@ -3428,8 +3435,8 @@
         </w:r>
       </w:hyperlink>
     </w:p>
-    <w:bookmarkEnd w:id="108"/>
-    <w:bookmarkStart w:id="110" w:name="ref-clink2022"/>
+    <w:bookmarkEnd w:id="110"/>
+    <w:bookmarkStart w:id="112" w:name="ref-clink2022"/>
     <w:p>
       <w:pPr>
         <w:pStyle w:val="Bibliography"/>
@@ -3455,7 +3462,7 @@
       <w:r>
         <w:t xml:space="preserve">. Open Forum Infectious Diseases. 2022;9: ofac350. doi:</w:t>
       </w:r>
-      <w:hyperlink r:id="rId109">
+      <w:hyperlink r:id="rId111">
         <w:r>
           <w:rPr>
             <w:rStyle w:val="Hyperlink"/>
@@ -3464,8 +3471,8 @@
         </w:r>
       </w:hyperlink>
     </w:p>
-    <w:bookmarkEnd w:id="110"/>
-    <w:bookmarkStart w:id="112" w:name="ref-eckhardt2022"/>
+    <w:bookmarkEnd w:id="112"/>
+    <w:bookmarkStart w:id="114" w:name="ref-eckhardt2022"/>
     <w:p>
       <w:pPr>
         <w:pStyle w:val="Bibliography"/>
@@ -3491,7 +3498,7 @@
       <w:r>
         <w:t xml:space="preserve">. JAMA Internal Medicine. 2022;182: 494–502. doi:</w:t>
       </w:r>
-      <w:hyperlink r:id="rId111">
+      <w:hyperlink r:id="rId113">
         <w:r>
           <w:rPr>
             <w:rStyle w:val="Hyperlink"/>
@@ -3500,9 +3507,9 @@
         </w:r>
       </w:hyperlink>
     </w:p>
-    <w:bookmarkEnd w:id="112"/>
-    <w:bookmarkEnd w:id="113"/>
     <w:bookmarkEnd w:id="114"/>
+    <w:bookmarkEnd w:id="115"/>
+    <w:bookmarkEnd w:id="116"/>
     <w:sectPr>
       <w:footnotePr>
         <w:numRestart w:val="eachSect"/>

</xml_diff>

<commit_message>
docs(manuscript): rebuild main text and S1 Text on the final posterior
Describe the prior-centre rule (Table S5 gains a prior-centre column), the
MCMC defaults, the NPE ensemble and both SBC checks; drop the random-NPE
context. Result-dependent wording (J-only reduction, pass counts, prior-
dominated parameters, interval overlap) is now derived from the outputs.

Co-Authored-By: Claude Opus 5.5 <noreply@anthropic.com>
</commit_message>
<xml_diff>
--- a/docs/main.docx
+++ b/docs/main.docx
@@ -111,7 +111,7 @@
         <w:pStyle w:val="FirstParagraph"/>
       </w:pPr>
       <w:r>
-        <w:t xml:space="preserve">We built an age structured HCV model with four groups: active PWID never imprisoned (D), people in prison (J), and released people who still inject (F) or have stopped (X). We calibrated it to 2015 prison data with Bayesian methods. We assumed treatment in prison from 2019. From 2026 we compared 15 community screening scenarios of 600 to 8,000 tests a year, with 25%, 50% or 75% for F and the rest for X. Results are medians with 95% uncertainty intervals (UI) across 2,000 posterior draws. Without treatment, new infections in 2030 were 132.5% (95% UI: 120.9%–147.3%) of the 2015 level. With prison treatment alone, new infections fell by 75.6% (95% UI: 68.5%–80.4%) by 2030, but HCV deaths fell by only 42.6% (95% UI: 41.6%–43.7%). In 2026, 94% of chronic infections among released people were in X. Only 2 of 15 scenarios met both WHO targets. At 8,000 tests a year, the incidence reduction was 94.0% for every split, while the mortality reduction fell from 70.6% to 57.2% as the F share rose from 25% to 75%. The model covers only PWID and assumes ideal linkage to treatment.</w:t>
+        <w:t xml:space="preserve">We built an age structured HCV model with four groups: active PWID never imprisoned (D), people in prison (J), and released people who still inject (F) or have stopped (X). We calibrated it to 2015 prison data with Bayesian methods. We assumed treatment in prison from 2019. From 2026 we compared 15 community screening scenarios of 600 to 8,000 tests a year, with 25%, 50% or 75% for F and the rest for X. Results are medians with 95% uncertainty intervals (UI) across 2,000 posterior draws. Without treatment, new infections in 2030 were 134.9% (95% UI: 121.7%–149.9%) of the 2015 level. With prison treatment alone, new infections fell by 59.2% (95% UI: 46.4%–69.0%) by 2030, but HCV deaths fell by only 41.8% (95% UI: 40.9%–42.8%). In 2026, 92% of chronic infections among released people were in X. Only 1 of 15 scenarios met both WHO targets. At 8,000 tests a year, the incidence reduction was 99.0% for every split, while the mortality reduction fell from 69.6% to 56.5% as the F share rose from 25% to 75%. The model covers only PWID and assumes ideal linkage to treatment.</w:t>
       </w:r>
     </w:p>
     <w:bookmarkEnd w:id="10"/>
@@ -219,7 +219,7 @@
         </w:numPr>
       </w:pPr>
       <w:r>
-        <w:t xml:space="preserve">Prison treatment alone reduced new infections by about three quarters by 2030. It reduced hepatitis C deaths by less than half.</w:t>
+        <w:t xml:space="preserve">Prison treatment alone reduced new infections by more than half by 2030. It reduced hepatitis C deaths by less than half.</w:t>
       </w:r>
     </w:p>
     <w:p>
@@ -582,7 +582,7 @@
         <w:pStyle w:val="BodyText"/>
       </w:pPr>
       <w:r>
-        <w:t xml:space="preserve">A multi start Nelder Mead fit gave the best fitting parameter values. We used them as the centre of a normal prior with standard deviation 0.20 on the log scale. The likelihood was binomial for the prevalence counts and log normal for the population counts. Parameter sets that did not reach equilibrium were excluded. We sampled the posterior with an adaptive random walk Metropolis algorithm</w:t>
+        <w:t xml:space="preserve">A multi start Nelder Mead fit gave the best fitting parameter values. We used them as the centre of a normal prior with standard deviation 0.20 on the log scale. Any best fit value closer than five prior standard deviations to a parameter bound was moved inward to that distance, so that the prior lies within the bounds. The likelihood was binomial for the prevalence counts and log normal for the population counts. Parameter sets that did not reach equilibrium were excluded. We sampled the posterior with an adaptive random walk Metropolis algorithm</w:t>
       </w:r>
       <w:r>
         <w:t xml:space="preserve"> </w:t>
@@ -612,7 +612,7 @@
         <w:t xml:space="preserve"> </w:t>
       </w:r>
       <w:r>
-        <w:t xml:space="preserve">on 50,000 prior simulations drawn by Latin hypercube sampling and compared it with MCMC. Policy results agreed within 0.4%. The neural posterior’s 95% intervals were on average 4% narrower than those from MCMC. We used MCMC, which samples the exact posterior and whose error falls with longer runs. S1 Text, Section 2 gives details.</w:t>
+        <w:t xml:space="preserve">on 50,000 prior simulations drawn by Latin hypercube sampling and compared it with MCMC. Simulation based calibration on 1,000 simulated datasets showed well calibrated neural posteriors (95% coverage 0.93 to 0.96). Policy results agreed within 0.6%. The neural posterior’s 95% intervals were on average 4% narrower than those from MCMC. We used MCMC, which samples the exact posterior and whose error falls with longer runs. S1 Text, Section 2 gives details.</w:t>
       </w:r>
     </w:p>
     <w:bookmarkEnd w:id="20"/>
@@ -754,7 +754,7 @@
         <w:pStyle w:val="FirstParagraph"/>
       </w:pPr>
       <w:r>
-        <w:t xml:space="preserve">The model reproduced the age specific seroprevalence and population targets. All 95% predictive intervals overlapped the target intervals (S1 Text, Section 2). In 2015, the model estimated 21,224 (95% interval: 19,226–23,437) people with a history of injecting drugs. Of these, 1,532 (1,393–1,681) were in F and 14,917 (13,428–16,590) were in X.</w:t>
+        <w:t xml:space="preserve">The model reproduced the age specific seroprevalence and population targets. All 95% predictive intervals overlapped the target intervals (S1 Text, Section 2). In 2015, the model estimated 21,169 (95% interval: 19,152–23,399) people with a history of injecting drugs. Of these, 1,551 (1,412–1,707) were in F and 15,016 (13,502–16,714) were in X.</w:t>
       </w:r>
     </w:p>
     <w:bookmarkEnd w:id="25"/>
@@ -772,7 +772,7 @@
         <w:pStyle w:val="FirstParagraph"/>
       </w:pPr>
       <w:r>
-        <w:t xml:space="preserve">Without any treatment, new infections rose after 2015 as entry into injecting increased. They remained high to 2030 (Fig 2). In 2030 annual new infections were 132.5% (95% UI: 120.9%–147.3%) of the 2015 level. HCV deaths were 101.1% (95% UI: 100.4%–102.1%) of the 2015 level.</w:t>
+        <w:t xml:space="preserve">Without any treatment, new infections rose after 2015 as entry into injecting increased. They remained high to 2030 (Fig 2). In 2030 annual new infections were 134.9% (95% UI: 121.7%–149.9%) of the 2015 level. HCV deaths were 102.9% (95% UI: 101.5%–104.6%) of the 2015 level.</w:t>
       </w:r>
     </w:p>
     <w:p>
@@ -780,7 +780,7 @@
         <w:pStyle w:val="BodyText"/>
       </w:pPr>
       <w:r>
-        <w:t xml:space="preserve">Prison treatment from 2019 changed the course of new infections. By 2025 they were 46.3% (95% UI: 40.7%–53.0%) of the 2015 level. By 2030 they had fallen by 75.6% (95% UI: 68.5%–80.4%). This was close to the 80% target. Deaths fell more slowly. By 2025 they were still 73.3% (95% UI: 72.4%–74.1%) of the 2015 level. By 2030 the reduction was 42.6% (95% UI: 41.6%–43.7%), well short of the 65% target.</w:t>
+        <w:t xml:space="preserve">Prison treatment from 2019 changed the course of new infections. By 2025 they were 59.1% (95% UI: 50.6%–68.7%) of the 2015 level. By 2030 they had fallen by 59.2% (95% UI: 46.4%–69.0%). This was well short of the 80% target. Deaths fell more slowly. By 2025 they were still 74.0% (95% UI: 73.2%–74.7%) of the 2015 level. By 2030 the reduction was 41.8% (95% UI: 40.9%–42.8%), well short of the 65% target.</w:t>
       </w:r>
     </w:p>
     <w:p>
@@ -788,7 +788,7 @@
         <w:pStyle w:val="BodyText"/>
       </w:pPr>
       <w:r>
-        <w:t xml:space="preserve">The reason lies in where infection and disease sit after release. In 2026, F held 103 (95% UI: 92–117) people with chronic infection. X held 1,635 (95% UI: 1,462–1,850). X thus held 94% of chronic infections among released people. In the J only scenario, 97% of HCV deaths in 2026 occurred in F and X. By 2030 this share was 98%. People in X do not inject and do not transmit. Prison treatment does not reach them after release.</w:t>
+        <w:t xml:space="preserve">The reason lies in where infection and disease sit after release. In 2026, F held 146 (95% UI: 129–167) people with chronic infection. X held 1,687 (95% UI: 1,493–1,896). X thus held 92% of chronic infections among released people. In the J only scenario, 96% of HCV deaths in 2026 occurred in F and X. By 2030 this share was 96%. People in X do not inject and do not transmit. Prison treatment does not reach them after release.</w:t>
       </w:r>
     </w:p>
     <w:bookmarkEnd w:id="26"/>
@@ -806,7 +806,7 @@
         <w:pStyle w:val="FirstParagraph"/>
       </w:pPr>
       <w:r>
-        <w:t xml:space="preserve">Adding community screening increased both reductions (Table 1). The incidence target was met at the median in 14 of 15 scenarios. The mortality target was met in only 2. Only 2 scenarios met both. These were 8,000 tests a year with 25% or 50% to F. At 5,000 tests a year with 25% to F, the median mortality reduction was 64.9% (95% UI: 63.2%–66.5%), just below the target. Both targets were met in 45% of draws, so this scenario sits on the threshold. At 8,000 tests a year with 25% to F, both targets were met in 100% of draws. With 50% to F, the share was 82%. The ideal reference met both targets with a mortality reduction of 74.6% (95% UI: 74.3%–74.9%).</w:t>
+        <w:t xml:space="preserve">Adding community screening increased both reductions (Table 1). The incidence target was met at the median in 12 of 15 scenarios. The mortality target was met in only 1. Only 1 scenario met both. This was 8,000 tests a year with 25% to F. At 5,000 tests a year with 25% to F, the median mortality reduction was 64.0% (95% UI: 62.5%–65.6%), just below the target. Both targets were met in 11% of draws, so this scenario sits on the threshold. At 8,000 tests a year with 25% to F, both targets were met in 100% of draws. With 50% to F, the share was 44%. The ideal reference met both targets with a mortality reduction of 73.5% (95% UI: 72.8%–73.9%).</w:t>
       </w:r>
     </w:p>
     <w:p>
@@ -814,7 +814,7 @@
         <w:pStyle w:val="BodyText"/>
       </w:pPr>
       <w:r>
-        <w:t xml:space="preserve">At 600 tests a year, the planned size of the current community programme, the mortality reduction was at most 46.5%. This was a gain of under 5 percentage points over prison treatment alone.</w:t>
+        <w:t xml:space="preserve">At 600 tests a year, the planned size of the current community programme, the mortality reduction was at most 45.7%. This was a gain of under 5 percentage points over prison treatment alone.</w:t>
       </w:r>
     </w:p>
     <w:bookmarkEnd w:id="27"/>
@@ -840,7 +840,7 @@
         <w:pStyle w:val="BodyText"/>
       </w:pPr>
       <w:r>
-        <w:t xml:space="preserve">The F group is small. In 2026 about 1,580 people in F were eligible for screening each year. Once the F quota exceeded this number, extra tests could not be used (S1 Text, Fig S5). At 8,000 tests a year with 25% to F, 78% of the F quota was used. With 75% to F, only 26% was used. In all three splits at this capacity, the incidence reduction was 94.0%. The extra F tests were idle, while the X tests they replaced were lost. The mortality reduction fell from 70.6% (95% UI: 69.2%–71.8%) with 25% to F to 57.2% (95% UI: 55.6%–58.7%) with 75% to F.</w:t>
+        <w:t xml:space="preserve">The F group is small. In 2026 about 1,480 people in F were eligible for screening each year. Once the F quota exceeded this number, extra tests could not be used (S1 Text, Fig S5). At 8,000 tests a year with 25% to F, 75% of the F quota was used. With 75% to F, only 25% was used. In all three splits at this capacity, the incidence reduction was 99.0%. The extra F tests were idle, while the X tests they replaced were lost. The mortality reduction fell from 69.6% (95% UI: 68.3%–70.8%) with 25% to F to 56.5% (95% UI: 55.1%–58.1%) with 75% to F.</w:t>
       </w:r>
     </w:p>
     <w:p>
@@ -848,7 +848,7 @@
         <w:pStyle w:val="BodyText"/>
       </w:pPr>
       <w:r>
-        <w:t xml:space="preserve">At lower capacities there was a real trade off. At 2,000 tests a year, moving from 25% to 75% for F raised the incidence reduction from 86.6% to 93.8%. It lowered the mortality reduction from 54.1% to 47.2%. A simple rule follows. F should receive enough tests to cover its eligible group each year, about 1,550. All remaining capacity should go to X.</w:t>
+        <w:t xml:space="preserve">At lower capacities there was a real trade off. At 2,000 tests a year, moving from 25% to 75% for F raised the incidence reduction from 85.7% to 99.0%. It lowered the mortality reduction from 53.3% to 46.7%. A simple rule follows. F should receive enough tests to cover its eligible group each year, about 1,550. All remaining capacity should go to X.</w:t>
       </w:r>
     </w:p>
     <w:bookmarkEnd w:id="28"/>
@@ -866,7 +866,7 @@
         <w:pStyle w:val="FirstParagraph"/>
       </w:pPr>
       <w:r>
-        <w:t xml:space="preserve">Treatment starts in F and X over 2026 to 2030 ranged from 153 (95% UI: 141–167) at 600 tests a year with 75% to F, to 1,615 (95% UI: 1,479–1,766) at 8,000 tests a year with 25% to F (Table 1). Starts were highest in 2026 and fell each year as the stock of chronic infection was treated. The discounted cost of the 2 finite scenarios that met both targets ranged from S$64.0 million to S$75.2 million over five years. Drugs made up 95% to 96% of this cost. Compared with prison treatment alone, each extra percentage point of mortality reduction cost about S$2.0 million in the two scenarios with 25% to F at 5,000 and 8,000 tests a year. Single round neural posterior estimation gave policy results within 0.4% of these values (S1 Text, Table S4).</w:t>
+        <w:t xml:space="preserve">Treatment starts in F and X over 2026 to 2030 ranged from 197 (95% UI: 177–222) at 600 tests a year with 75% to F, to 1,699 (95% UI: 1,544–1,856) at 8,000 tests a year with 25% to F (Table 1). Starts were highest in 2026 and fell each year as the stock of chronic infection was treated. The discounted cost of the finite scenario that met both targets was S$77.9 million over five years. Drugs made up 95% of this cost. Compared with prison treatment alone, each extra percentage point of mortality reduction cost about S$1.9 million in the two scenarios with 25% to F at 5,000 and 8,000 tests a year. Single round neural posterior estimation gave policy results within 0.6% of these values (S1 Text, Table S4).</w:t>
       </w:r>
     </w:p>
     <w:p>
@@ -986,18 +986,18 @@
               <w:pStyle w:val="Compact"/>
             </w:pPr>
             <w:r>
-              <w:t xml:space="preserve">75.6% (95% UI: 68.5%–80.4%)</w:t>
-            </w:r>
-          </w:p>
-        </w:tc>
-        <w:tc>
-          <w:tcPr/>
-          <w:p>
-            <w:pPr>
-              <w:pStyle w:val="Compact"/>
-            </w:pPr>
-            <w:r>
-              <w:t xml:space="preserve">42.6% (95% UI: 41.6%–43.7%)</w:t>
+              <w:t xml:space="preserve">59.2% (95% UI: 46.4%–69.0%)</w:t>
+            </w:r>
+          </w:p>
+        </w:tc>
+        <w:tc>
+          <w:tcPr/>
+          <w:p>
+            <w:pPr>
+              <w:pStyle w:val="Compact"/>
+            </w:pPr>
+            <w:r>
+              <w:t xml:space="preserve">41.8% (95% UI: 40.9%–42.8%)</w:t>
             </w:r>
           </w:p>
         </w:tc>
@@ -1030,7 +1030,7 @@
               <w:pStyle w:val="Compact"/>
             </w:pPr>
             <w:r>
-              <w:t xml:space="preserve">17.6 (95% UI: 15.0–20.7)</w:t>
+              <w:t xml:space="preserve">23.8 (95% UI: 20.0–28.5)</w:t>
             </w:r>
           </w:p>
         </w:tc>
@@ -1054,18 +1054,18 @@
               <w:pStyle w:val="Compact"/>
             </w:pPr>
             <w:r>
-              <w:t xml:space="preserve">83.2% (95% UI: 77.8%–86.8%)</w:t>
-            </w:r>
-          </w:p>
-        </w:tc>
-        <w:tc>
-          <w:tcPr/>
-          <w:p>
-            <w:pPr>
-              <w:pStyle w:val="Compact"/>
-            </w:pPr>
-            <w:r>
-              <w:t xml:space="preserve">45.4% (95% UI: 44.2%–46.5%)</w:t>
+              <w:t xml:space="preserve">77.2% (95% UI: 67.3%–83.6%)</w:t>
+            </w:r>
+          </w:p>
+        </w:tc>
+        <w:tc>
+          <w:tcPr/>
+          <w:p>
+            <w:pPr>
+              <w:pStyle w:val="Compact"/>
+            </w:pPr>
+            <w:r>
+              <w:t xml:space="preserve">44.6% (95% UI: 43.7%–45.7%)</w:t>
             </w:r>
           </w:p>
         </w:tc>
@@ -1087,18 +1087,18 @@
               <w:pStyle w:val="Compact"/>
             </w:pPr>
             <w:r>
-              <w:t xml:space="preserve">200 (95% UI: 186–214)</w:t>
-            </w:r>
-          </w:p>
-        </w:tc>
-        <w:tc>
-          <w:tcPr/>
-          <w:p>
-            <w:pPr>
-              <w:pStyle w:val="Compact"/>
-            </w:pPr>
-            <w:r>
-              <w:t xml:space="preserve">22.5 (95% UI: 19.9–25.5)</w:t>
+              <w:t xml:space="preserve">238 (95% UI: 218–260)</w:t>
+            </w:r>
+          </w:p>
+        </w:tc>
+        <w:tc>
+          <w:tcPr/>
+          <w:p>
+            <w:pPr>
+              <w:pStyle w:val="Compact"/>
+            </w:pPr>
+            <w:r>
+              <w:t xml:space="preserve">27.5 (95% UI: 23.8–32.1)</w:t>
             </w:r>
           </w:p>
         </w:tc>
@@ -1122,18 +1122,18 @@
               <w:pStyle w:val="Compact"/>
             </w:pPr>
             <w:r>
-              <w:t xml:space="preserve">86.6% (95% UI: 82.1%–89.7%)</w:t>
-            </w:r>
-          </w:p>
-        </w:tc>
-        <w:tc>
-          <w:tcPr/>
-          <w:p>
-            <w:pPr>
-              <w:pStyle w:val="Compact"/>
-            </w:pPr>
-            <w:r>
-              <w:t xml:space="preserve">54.1% (95% UI: 52.6%–55.5%)</w:t>
+              <w:t xml:space="preserve">85.7% (95% UI: 78.0%–90.1%)</w:t>
+            </w:r>
+          </w:p>
+        </w:tc>
+        <w:tc>
+          <w:tcPr/>
+          <w:p>
+            <w:pPr>
+              <w:pStyle w:val="Compact"/>
+            </w:pPr>
+            <w:r>
+              <w:t xml:space="preserve">53.3% (95% UI: 52.0%–54.8%)</w:t>
             </w:r>
           </w:p>
         </w:tc>
@@ -1155,18 +1155,18 @@
               <w:pStyle w:val="Compact"/>
             </w:pPr>
             <w:r>
-              <w:t xml:space="preserve">692 (95% UI: 645–741)</w:t>
-            </w:r>
-          </w:p>
-        </w:tc>
-        <w:tc>
-          <w:tcPr/>
-          <w:p>
-            <w:pPr>
-              <w:pStyle w:val="Compact"/>
-            </w:pPr>
-            <w:r>
-              <w:t xml:space="preserve">40.5 (95% UI: 37.3–44.4)</w:t>
+              <w:t xml:space="preserve">757 (95% UI: 699–815)</w:t>
+            </w:r>
+          </w:p>
+        </w:tc>
+        <w:tc>
+          <w:tcPr/>
+          <w:p>
+            <w:pPr>
+              <w:pStyle w:val="Compact"/>
+            </w:pPr>
+            <w:r>
+              <w:t xml:space="preserve">45.3 (95% UI: 41.0–50.2)</w:t>
             </w:r>
           </w:p>
         </w:tc>
@@ -1190,18 +1190,18 @@
               <w:pStyle w:val="Compact"/>
             </w:pPr>
             <w:r>
-              <w:t xml:space="preserve">93.8% (95% UI: 91.6%–95.2%)</w:t>
-            </w:r>
-          </w:p>
-        </w:tc>
-        <w:tc>
-          <w:tcPr/>
-          <w:p>
-            <w:pPr>
-              <w:pStyle w:val="Compact"/>
-            </w:pPr>
-            <w:r>
-              <w:t xml:space="preserve">47.2% (95% UI: 46.0%–48.4%)</w:t>
+              <w:t xml:space="preserve">99.0% (95% UI: 98.1%–99.4%)</w:t>
+            </w:r>
+          </w:p>
+        </w:tc>
+        <w:tc>
+          <w:tcPr/>
+          <w:p>
+            <w:pPr>
+              <w:pStyle w:val="Compact"/>
+            </w:pPr>
+            <w:r>
+              <w:t xml:space="preserve">46.7% (95% UI: 45.6%–47.8%)</w:t>
             </w:r>
           </w:p>
         </w:tc>
@@ -1223,18 +1223,18 @@
               <w:pStyle w:val="Compact"/>
             </w:pPr>
             <w:r>
-              <w:t xml:space="preserve">376 (95% UI: 349–408)</w:t>
-            </w:r>
-          </w:p>
-        </w:tc>
-        <w:tc>
-          <w:tcPr/>
-          <w:p>
-            <w:pPr>
-              <w:pStyle w:val="Compact"/>
-            </w:pPr>
-            <w:r>
-              <w:t xml:space="preserve">24.2 (95% UI: 21.8–26.9)</w:t>
+              <w:t xml:space="preserve">424 (95% UI: 387–466)</w:t>
+            </w:r>
+          </w:p>
+        </w:tc>
+        <w:tc>
+          <w:tcPr/>
+          <w:p>
+            <w:pPr>
+              <w:pStyle w:val="Compact"/>
+            </w:pPr>
+            <w:r>
+              <w:t xml:space="preserve">25.2 (95% UI: 22.5–28.5)</w:t>
             </w:r>
           </w:p>
         </w:tc>
@@ -1258,51 +1258,51 @@
               <w:pStyle w:val="Compact"/>
             </w:pPr>
             <w:r>
-              <w:t xml:space="preserve">93.0% (95% UI: 90.4%–94.7%)</w:t>
-            </w:r>
-          </w:p>
-        </w:tc>
-        <w:tc>
-          <w:tcPr/>
-          <w:p>
-            <w:pPr>
-              <w:pStyle w:val="Compact"/>
-            </w:pPr>
-            <w:r>
-              <w:t xml:space="preserve">64.9% (95% UI: 63.2%–66.5%)</w:t>
-            </w:r>
-          </w:p>
-        </w:tc>
-        <w:tc>
-          <w:tcPr/>
-          <w:p>
-            <w:pPr>
-              <w:pStyle w:val="Compact"/>
-            </w:pPr>
-            <w:r>
-              <w:t xml:space="preserve">45%</w:t>
-            </w:r>
-          </w:p>
-        </w:tc>
-        <w:tc>
-          <w:tcPr/>
-          <w:p>
-            <w:pPr>
-              <w:pStyle w:val="Compact"/>
-            </w:pPr>
-            <w:r>
-              <w:t xml:space="preserve">1,309 (95% UI: 1,214–1,415)</w:t>
-            </w:r>
-          </w:p>
-        </w:tc>
-        <w:tc>
-          <w:tcPr/>
-          <w:p>
-            <w:pPr>
-              <w:pStyle w:val="Compact"/>
-            </w:pPr>
-            <w:r>
-              <w:t xml:space="preserve">62.4 (95% UI: 57.7–67.8)</w:t>
+              <w:t xml:space="preserve">98.3% (95% UI: 96.7%–99.1%)</w:t>
+            </w:r>
+          </w:p>
+        </w:tc>
+        <w:tc>
+          <w:tcPr/>
+          <w:p>
+            <w:pPr>
+              <w:pStyle w:val="Compact"/>
+            </w:pPr>
+            <w:r>
+              <w:t xml:space="preserve">64.0% (95% UI: 62.5%–65.6%)</w:t>
+            </w:r>
+          </w:p>
+        </w:tc>
+        <w:tc>
+          <w:tcPr/>
+          <w:p>
+            <w:pPr>
+              <w:pStyle w:val="Compact"/>
+            </w:pPr>
+            <w:r>
+              <w:t xml:space="preserve">11%</w:t>
+            </w:r>
+          </w:p>
+        </w:tc>
+        <w:tc>
+          <w:tcPr/>
+          <w:p>
+            <w:pPr>
+              <w:pStyle w:val="Compact"/>
+            </w:pPr>
+            <w:r>
+              <w:t xml:space="preserve">1,390 (95% UI: 1,276–1,503)</w:t>
+            </w:r>
+          </w:p>
+        </w:tc>
+        <w:tc>
+          <w:tcPr/>
+          <w:p>
+            <w:pPr>
+              <w:pStyle w:val="Compact"/>
+            </w:pPr>
+            <w:r>
+              <w:t xml:space="preserve">65.2 (95% UI: 59.8–70.8)</w:t>
             </w:r>
           </w:p>
         </w:tc>
@@ -1326,18 +1326,18 @@
               <w:pStyle w:val="Compact"/>
             </w:pPr>
             <w:r>
-              <w:t xml:space="preserve">94.0% (95% UI: 91.9%–95.4%)</w:t>
-            </w:r>
-          </w:p>
-        </w:tc>
-        <w:tc>
-          <w:tcPr/>
-          <w:p>
-            <w:pPr>
-              <w:pStyle w:val="Compact"/>
-            </w:pPr>
-            <w:r>
-              <w:t xml:space="preserve">59.8% (95% UI: 58.1%–61.4%)</w:t>
+              <w:t xml:space="preserve">99.0% (95% UI: 98.2%–99.5%)</w:t>
+            </w:r>
+          </w:p>
+        </w:tc>
+        <w:tc>
+          <w:tcPr/>
+          <w:p>
+            <w:pPr>
+              <w:pStyle w:val="Compact"/>
+            </w:pPr>
+            <w:r>
+              <w:t xml:space="preserve">59.0% (95% UI: 57.5%–60.6%)</w:t>
             </w:r>
           </w:p>
         </w:tc>
@@ -1359,18 +1359,18 @@
               <w:pStyle w:val="Compact"/>
             </w:pPr>
             <w:r>
-              <w:t xml:space="preserve">1,047 (95% UI: 975–1,128)</w:t>
-            </w:r>
-          </w:p>
-        </w:tc>
-        <w:tc>
-          <w:tcPr/>
-          <w:p>
-            <w:pPr>
-              <w:pStyle w:val="Compact"/>
-            </w:pPr>
-            <w:r>
-              <w:t xml:space="preserve">50.9 (95% UI: 47.2–55.2)</w:t>
+              <w:t xml:space="preserve">1,115 (95% UI: 1,027–1,205)</w:t>
+            </w:r>
+          </w:p>
+        </w:tc>
+        <w:tc>
+          <w:tcPr/>
+          <w:p>
+            <w:pPr>
+              <w:pStyle w:val="Compact"/>
+            </w:pPr>
+            <w:r>
+              <w:t xml:space="preserve">52.9 (95% UI: 48.8–57.5)</w:t>
             </w:r>
           </w:p>
         </w:tc>
@@ -1394,18 +1394,18 @@
               <w:pStyle w:val="Compact"/>
             </w:pPr>
             <w:r>
-              <w:t xml:space="preserve">94.0% (95% UI: 91.9%–95.4%)</w:t>
-            </w:r>
-          </w:p>
-        </w:tc>
-        <w:tc>
-          <w:tcPr/>
-          <w:p>
-            <w:pPr>
-              <w:pStyle w:val="Compact"/>
-            </w:pPr>
-            <w:r>
-              <w:t xml:space="preserve">52.7% (95% UI: 51.2%–54.0%)</w:t>
+              <w:t xml:space="preserve">99.0% (95% UI: 98.2%–99.5%)</w:t>
+            </w:r>
+          </w:p>
+        </w:tc>
+        <w:tc>
+          <w:tcPr/>
+          <w:p>
+            <w:pPr>
+              <w:pStyle w:val="Compact"/>
+            </w:pPr>
+            <w:r>
+              <w:t xml:space="preserve">52.0% (95% UI: 50.7%–53.4%)</w:t>
             </w:r>
           </w:p>
         </w:tc>
@@ -1427,18 +1427,18 @@
               <w:pStyle w:val="Compact"/>
             </w:pPr>
             <w:r>
-              <w:t xml:space="preserve">670 (95% UI: 622–720)</w:t>
-            </w:r>
-          </w:p>
-        </w:tc>
-        <w:tc>
-          <w:tcPr/>
-          <w:p>
-            <w:pPr>
-              <w:pStyle w:val="Compact"/>
-            </w:pPr>
-            <w:r>
-              <w:t xml:space="preserve">35.7 (95% UI: 32.8–39.0)</w:t>
+              <w:t xml:space="preserve">725 (95% UI: 667–784)</w:t>
+            </w:r>
+          </w:p>
+        </w:tc>
+        <w:tc>
+          <w:tcPr/>
+          <w:p>
+            <w:pPr>
+              <w:pStyle w:val="Compact"/>
+            </w:pPr>
+            <w:r>
+              <w:t xml:space="preserve">37.2 (95% UI: 34.0–40.8)</w:t>
             </w:r>
           </w:p>
         </w:tc>
@@ -1462,18 +1462,18 @@
               <w:pStyle w:val="Compact"/>
             </w:pPr>
             <w:r>
-              <w:t xml:space="preserve">94.0% (95% UI: 91.9%–95.4%)</w:t>
-            </w:r>
-          </w:p>
-        </w:tc>
-        <w:tc>
-          <w:tcPr/>
-          <w:p>
-            <w:pPr>
-              <w:pStyle w:val="Compact"/>
-            </w:pPr>
-            <w:r>
-              <w:t xml:space="preserve">70.6% (95% UI: 69.2%–71.8%)</w:t>
+              <w:t xml:space="preserve">99.0% (95% UI: 98.2%–99.5%)</w:t>
+            </w:r>
+          </w:p>
+        </w:tc>
+        <w:tc>
+          <w:tcPr/>
+          <w:p>
+            <w:pPr>
+              <w:pStyle w:val="Compact"/>
+            </w:pPr>
+            <w:r>
+              <w:t xml:space="preserve">69.6% (95% UI: 68.3%–70.8%)</w:t>
             </w:r>
           </w:p>
         </w:tc>
@@ -1495,18 +1495,18 @@
               <w:pStyle w:val="Compact"/>
             </w:pPr>
             <w:r>
-              <w:t xml:space="preserve">1,615 (95% UI: 1,479–1,766)</w:t>
-            </w:r>
-          </w:p>
-        </w:tc>
-        <w:tc>
-          <w:tcPr/>
-          <w:p>
-            <w:pPr>
-              <w:pStyle w:val="Compact"/>
-            </w:pPr>
-            <w:r>
-              <w:t xml:space="preserve">75.2 (95% UI: 69.2–82.1)</w:t>
+              <w:t xml:space="preserve">1,699 (95% UI: 1,544–1,856)</w:t>
+            </w:r>
+          </w:p>
+        </w:tc>
+        <w:tc>
+          <w:tcPr/>
+          <w:p>
+            <w:pPr>
+              <w:pStyle w:val="Compact"/>
+            </w:pPr>
+            <w:r>
+              <w:t xml:space="preserve">77.9 (95% UI: 71.3–84.7)</w:t>
             </w:r>
           </w:p>
         </w:tc>
@@ -1530,51 +1530,51 @@
               <w:pStyle w:val="Compact"/>
             </w:pPr>
             <w:r>
-              <w:t xml:space="preserve">94.0% (95% UI: 91.9%–95.4%)</w:t>
-            </w:r>
-          </w:p>
-        </w:tc>
-        <w:tc>
-          <w:tcPr/>
-          <w:p>
-            <w:pPr>
-              <w:pStyle w:val="Compact"/>
-            </w:pPr>
-            <w:r>
-              <w:t xml:space="preserve">65.8% (95% UI: 64.0%–67.3%)</w:t>
-            </w:r>
-          </w:p>
-        </w:tc>
-        <w:tc>
-          <w:tcPr/>
-          <w:p>
-            <w:pPr>
-              <w:pStyle w:val="Compact"/>
-            </w:pPr>
-            <w:r>
-              <w:t xml:space="preserve">82%</w:t>
-            </w:r>
-          </w:p>
-        </w:tc>
-        <w:tc>
-          <w:tcPr/>
-          <w:p>
-            <w:pPr>
-              <w:pStyle w:val="Compact"/>
-            </w:pPr>
-            <w:r>
-              <w:t xml:space="preserve">1,361 (95% UI: 1,261–1,476)</w:t>
-            </w:r>
-          </w:p>
-        </w:tc>
-        <w:tc>
-          <w:tcPr/>
-          <w:p>
-            <w:pPr>
-              <w:pStyle w:val="Compact"/>
-            </w:pPr>
-            <w:r>
-              <w:t xml:space="preserve">64.0 (95% UI: 59.1–69.5)</w:t>
+              <w:t xml:space="preserve">99.0% (95% UI: 98.2%–99.5%)</w:t>
+            </w:r>
+          </w:p>
+        </w:tc>
+        <w:tc>
+          <w:tcPr/>
+          <w:p>
+            <w:pPr>
+              <w:pStyle w:val="Compact"/>
+            </w:pPr>
+            <w:r>
+              <w:t xml:space="preserve">64.9% (95% UI: 63.4%–66.4%)</w:t>
+            </w:r>
+          </w:p>
+        </w:tc>
+        <w:tc>
+          <w:tcPr/>
+          <w:p>
+            <w:pPr>
+              <w:pStyle w:val="Compact"/>
+            </w:pPr>
+            <w:r>
+              <w:t xml:space="preserve">44%</w:t>
+            </w:r>
+          </w:p>
+        </w:tc>
+        <w:tc>
+          <w:tcPr/>
+          <w:p>
+            <w:pPr>
+              <w:pStyle w:val="Compact"/>
+            </w:pPr>
+            <w:r>
+              <w:t xml:space="preserve">1,438 (95% UI: 1,319–1,557)</w:t>
+            </w:r>
+          </w:p>
+        </w:tc>
+        <w:tc>
+          <w:tcPr/>
+          <w:p>
+            <w:pPr>
+              <w:pStyle w:val="Compact"/>
+            </w:pPr>
+            <w:r>
+              <w:t xml:space="preserve">66.4 (95% UI: 61.1–71.8)</w:t>
             </w:r>
           </w:p>
         </w:tc>
@@ -1598,18 +1598,18 @@
               <w:pStyle w:val="Compact"/>
             </w:pPr>
             <w:r>
-              <w:t xml:space="preserve">94.0% (95% UI: 91.9%–95.4%)</w:t>
-            </w:r>
-          </w:p>
-        </w:tc>
-        <w:tc>
-          <w:tcPr/>
-          <w:p>
-            <w:pPr>
-              <w:pStyle w:val="Compact"/>
-            </w:pPr>
-            <w:r>
-              <w:t xml:space="preserve">57.2% (95% UI: 55.6%–58.7%)</w:t>
+              <w:t xml:space="preserve">99.0% (95% UI: 98.2%–99.5%)</w:t>
+            </w:r>
+          </w:p>
+        </w:tc>
+        <w:tc>
+          <w:tcPr/>
+          <w:p>
+            <w:pPr>
+              <w:pStyle w:val="Compact"/>
+            </w:pPr>
+            <w:r>
+              <w:t xml:space="preserve">56.5% (95% UI: 55.1%–58.1%)</w:t>
             </w:r>
           </w:p>
         </w:tc>
@@ -1631,18 +1631,18 @@
               <w:pStyle w:val="Compact"/>
             </w:pPr>
             <w:r>
-              <w:t xml:space="preserve">910 (95% UI: 848–978)</w:t>
-            </w:r>
-          </w:p>
-        </w:tc>
-        <w:tc>
-          <w:tcPr/>
-          <w:p>
-            <w:pPr>
-              <w:pStyle w:val="Compact"/>
-            </w:pPr>
-            <w:r>
-              <w:t xml:space="preserve">45.4 (95% UI: 42.0–49.2)</w:t>
+              <w:t xml:space="preserve">974 (95% UI: 897–1,052)</w:t>
+            </w:r>
+          </w:p>
+        </w:tc>
+        <w:tc>
+          <w:tcPr/>
+          <w:p>
+            <w:pPr>
+              <w:pStyle w:val="Compact"/>
+            </w:pPr>
+            <w:r>
+              <w:t xml:space="preserve">47.2 (95% UI: 43.5–51.4)</w:t>
             </w:r>
           </w:p>
         </w:tc>
@@ -1666,18 +1666,18 @@
               <w:pStyle w:val="Compact"/>
             </w:pPr>
             <w:r>
-              <w:t xml:space="preserve">94.0% (95% UI: 91.9%–95.4%)</w:t>
-            </w:r>
-          </w:p>
-        </w:tc>
-        <w:tc>
-          <w:tcPr/>
-          <w:p>
-            <w:pPr>
-              <w:pStyle w:val="Compact"/>
-            </w:pPr>
-            <w:r>
-              <w:t xml:space="preserve">74.6% (95% UI: 74.3%–74.9%)</w:t>
+              <w:t xml:space="preserve">99.0% (95% UI: 98.2%–99.5%)</w:t>
+            </w:r>
+          </w:p>
+        </w:tc>
+        <w:tc>
+          <w:tcPr/>
+          <w:p>
+            <w:pPr>
+              <w:pStyle w:val="Compact"/>
+            </w:pPr>
+            <w:r>
+              <w:t xml:space="preserve">73.5% (95% UI: 72.8%–73.9%)</w:t>
             </w:r>
           </w:p>
         </w:tc>
@@ -1699,18 +1699,18 @@
               <w:pStyle w:val="Compact"/>
             </w:pPr>
             <w:r>
-              <w:t xml:space="preserve">1,899 (95% UI: 1,710–2,138)</w:t>
-            </w:r>
-          </w:p>
-        </w:tc>
-        <w:tc>
-          <w:tcPr/>
-          <w:p>
-            <w:pPr>
-              <w:pStyle w:val="Compact"/>
-            </w:pPr>
-            <w:r>
-              <w:t xml:space="preserve">92.2 (95% UI: 83.4–103.1)</w:t>
+              <w:t xml:space="preserve">1,990 (95% UI: 1,772–2,225)</w:t>
+            </w:r>
+          </w:p>
+        </w:tc>
+        <w:tc>
+          <w:tcPr/>
+          <w:p>
+            <w:pPr>
+              <w:pStyle w:val="Compact"/>
+            </w:pPr>
+            <w:r>
+              <w:t xml:space="preserve">95.2 (95% UI: 85.4–105.7)</w:t>
             </w:r>
           </w:p>
         </w:tc>
@@ -1740,7 +1740,7 @@
         <w:pStyle w:val="FirstParagraph"/>
       </w:pPr>
       <w:r>
-        <w:t xml:space="preserve">In this model, prison treatment from 2019 cut new HCV infections among people who inject drugs in Singapore by about three quarters by 2030. It did much less for deaths. By 2026, nearly all chronic infections and HCV deaths among released people were in those who had stopped injecting. Community screening was needed to meet the mortality target. The split of screening between released people who still inject and those who have stopped mattered as much as the total amount.</w:t>
+        <w:t xml:space="preserve">In this model, prison treatment from 2019 cut new HCV infections among people who inject drugs in Singapore by more than half by 2030. It did much less for deaths. By 2026, nearly all chronic infections and HCV deaths among released people were in those who had stopped injecting. Community screening was needed to meet the mortality target. The split of screening between released people who still inject and those who have stopped mattered as much as the total amount.</w:t>
       </w:r>
     </w:p>
     <w:p>
@@ -1791,7 +1791,7 @@
         <w:t xml:space="preserve">[11]</w:t>
       </w:r>
       <w:r>
-        <w:t xml:space="preserve">. Even 5,000 tests a year met both targets in fewer than half of the draws. All scenarios also assumed that every person identified starts treatment. Real linkage is weaker. In a Singapore trial among halfway house residents, only 12.6% of people with antibodies started treatment</w:t>
+        <w:t xml:space="preserve">. Even 5,000 tests a year with 25% to F met both targets in only 11% of draws. All scenarios also assumed that every person identified starts treatment. Real linkage is weaker. In a Singapore trial among halfway house residents, only 12.6% of people with antibodies started treatment</w:t>
       </w:r>
       <w:r>
         <w:t xml:space="preserve"> </w:t>

</xml_diff>

<commit_message>
docs: describe the first-arrest handoff, entry anchor and viraemic mortality; rebuild manuscript
- docs/first_arrest_mortality_update.md: the structured prompt, with the evidence (Lee 2012,
  Piselli 2021, Cepeda 2022, Mathers 2013), the requirements and the decisions made during
  execution.
- training, evaluation, model card, READMEs and claude.md: new commands (--nm-restarts), results
  and flags.
- build_paper.py:
  - methods: f_first, lambda1, the HR and the excess-entry scale; Table S1 gains h, v and f_i.
  - The narrative is rewritten for the new results: no scenario meets the incidence target, and
    mortality is met only at 8,000 tests a year.
  - It asserts those claims, so the build stops if the results change.
- references.bib: lee2012, piselli2021, cepeda2022.

Co-Authored-By: Claude Opus 5.5 <noreply@anthropic.com>
</commit_message>
<xml_diff>
--- a/docs/main.docx
+++ b/docs/main.docx
@@ -111,7 +111,7 @@
         <w:pStyle w:val="FirstParagraph"/>
       </w:pPr>
       <w:r>
-        <w:t xml:space="preserve">We built an age structured HCV model with four groups: active PWID never imprisoned (D), people in prison (J), and released people who still inject (F) or have stopped (X). We calibrated it to 2015 prison data with Bayesian methods. We assumed treatment in prison from 2019. From 2026 we compared 15 community screening scenarios of 600 to 8,000 tests a year, with 25%, 50% or 75% for F and the rest for X. Results are medians with 95% uncertainty intervals (UI) across 2,000 posterior draws. Without treatment, new infections in 2030 were 134.9% (95% UI: 121.7%–149.9%) of the 2015 level. With prison treatment alone, new infections fell by 59.2% (95% UI: 46.4%–69.0%) by 2030, but HCV deaths fell by only 41.8% (95% UI: 40.9%–42.8%). In 2026, 92% of chronic infections among released people were in X. Only 1 of 15 scenarios met both WHO targets. At 8,000 tests a year, the incidence reduction was 99.0% for every split, while the mortality reduction fell from 69.6% to 56.5% as the F share rose from 25% to 75%. The model covers only PWID and assumes ideal linkage to treatment.</w:t>
+        <w:t xml:space="preserve">We built an age structured HCV model with four groups: active PWID never imprisoned (D), people in prison (J), and released people who still inject (F) or have stopped (X). We calibrated it to 2015 prison data with Bayesian methods. We assumed treatment in prison from 2019. From 2026 we compared 15 community screening scenarios of 600 to 8,000 tests a year, with 25%, 50% or 75% for F and the rest for X. Results are medians with 95% uncertainty intervals (UI) across 2,000 posterior draws. Without treatment, new infections in 2030 were 101.9% (95% UI: 98.8%–105.5%) of the 2015 level. With prison treatment alone, new infections fell by 47.6% (95% UI: 36.5%–57.5%) by 2030 and HCV deaths by 47.4% (95% UI: 44.7%–48.8%). In 2026, 86% of chronic infections among released people were in X. No scenario met the incidence target: even screening everyone eligible after release cut new infections by only 57%, because 59% of new infections in 2030 occurred among people who had never been imprisoned. The mortality target was met at the median only at 8,000 tests a year with 25% or 50% to F. At 8,000 tests a year, the incidence reduction was 57.1% to 57.3% for every split, while the mortality reduction fell from 67.2% to 60.3% as the F share rose from 25% to 75%. The model covers only PWID and assumes ideal linkage to treatment.</w:t>
       </w:r>
     </w:p>
     <w:bookmarkEnd w:id="10"/>
@@ -129,7 +129,7 @@
         <w:pStyle w:val="FirstParagraph"/>
       </w:pPr>
       <w:r>
-        <w:t xml:space="preserve">In this model, prison treatment sharply reduces new HCV infections, but the fall in HCV deaths lags. Most remaining deaths occur among released people who no longer inject. Community screening is needed to reach the mortality target. The F group is small, so screening beyond its size adds no benefit. Most community capacity should go to X.</w:t>
+        <w:t xml:space="preserve">In this model, prison treatment alone roughly halves new HCV infections and HCV deaths by 2030, short of both targets. Most remaining deaths occur among released people who no longer inject, so large scale community screening is needed to reach the mortality target. The F group is small, so screening beyond its size adds no benefit, and most community capacity should go to X. The incidence target cannot be met through prison and post release services, because most new infections occur in people who have never been imprisoned.</w:t>
       </w:r>
     </w:p>
     <w:bookmarkEnd w:id="11"/>
@@ -219,7 +219,7 @@
         </w:numPr>
       </w:pPr>
       <w:r>
-        <w:t xml:space="preserve">Prison treatment alone reduced new infections by more than half by 2030. It reduced hepatitis C deaths by less than half.</w:t>
+        <w:t xml:space="preserve">Prison treatment alone reduced new infections by 48% and hepatitis C deaths by 47% by 2030, short of the WHO targets of 80% and 65%.</w:t>
       </w:r>
     </w:p>
     <w:p>
@@ -234,6 +234,18 @@
         <w:t xml:space="preserve">By 2026, nearly all chronic infections and deaths among released people were in those who had stopped injecting. Shifting screening towards people who still inject did not improve infections once that small group was covered. It did reduce the fall in deaths.</w:t>
       </w:r>
     </w:p>
+    <w:p>
+      <w:pPr>
+        <w:pStyle w:val="Compact"/>
+        <w:numPr>
+          <w:ilvl w:val="0"/>
+          <w:numId w:val="1002"/>
+        </w:numPr>
+      </w:pPr>
+      <w:r>
+        <w:t xml:space="preserve">No strategy met the target for new infections. Most new infections occurred among people who inject but have never been imprisoned, whom prison and post release services do not reach.</w:t>
+      </w:r>
+    </w:p>
     <w:bookmarkEnd w:id="14"/>
     <w:bookmarkStart w:id="15" w:name="what-do-these-findings-mean"/>
     <w:p>
@@ -253,7 +265,7 @@
         </w:numPr>
       </w:pPr>
       <w:r>
-        <w:t xml:space="preserve">Prison treatment is a strong tool for cutting transmission. Its effect on deaths is slow because deaths come from liver disease that has built up over many years.</w:t>
+        <w:t xml:space="preserve">Prison treatment reaches only people who are imprisoned. Cutting new infections further needs testing and prevention for people who inject before they are ever imprisoned.</w:t>
       </w:r>
     </w:p>
     <w:p>
@@ -446,7 +458,7 @@
         <w:pStyle w:val="BodyText"/>
       </w:pPr>
       <w:r>
-        <w:t xml:space="preserve">We used a calibrated model to answer three questions. First, how much does prison treatment from 2019 reduce new infections and deaths by 2030? Second, how much community screening is needed to meet both WHO targets? Third, how should a fixed screening capacity be shared between released people who still inject and those who have stopped?</w:t>
+        <w:t xml:space="preserve">We used a calibrated model to answer three questions. First, how much does prison treatment from 2019 reduce new infections and deaths by 2030? Second, how much community screening is needed to meet the WHO targets? Third, how should a fixed screening capacity be shared between released people who still inject and those who have stopped?</w:t>
       </w:r>
     </w:p>
     <w:bookmarkEnd w:id="17"/>
@@ -547,7 +559,16 @@
         <w:t xml:space="preserve">[15,22]</w:t>
       </w:r>
       <w:r>
-        <w:t xml:space="preserve">. S1 Text gives all equations, parameter values and sources.</w:t>
+        <w:t xml:space="preserve">. People with chronic infection also die 1.47 times as fast from other causes</w:t>
+      </w:r>
+      <w:r>
+        <w:t xml:space="preserve"> </w:t>
+      </w:r>
+      <w:r>
+        <w:t xml:space="preserve">[23]</w:t>
+      </w:r>
+      <w:r>
+        <w:t xml:space="preserve">. Release and re-arrest rates and the yearly number of first arrests came from Singapore Prison Service records, and the first arrest rate was set so that the model reproduces that number. S1 Text gives all equations, parameter values and sources.</w:t>
       </w:r>
     </w:p>
     <w:bookmarkEnd w:id="19"/>
@@ -565,13 +586,13 @@
         <w:pStyle w:val="FirstParagraph"/>
       </w:pPr>
       <w:r>
-        <w:t xml:space="preserve">We fitted the model to 2015 data from the Singapore Prison Service. These were seroprevalence and prison population counts in six age groups. We estimated 12 parameters. Six scaled the contact rates by age. Six scaled the rate of entry into injecting by age. Each model run started in model year 0 and ran for 150 years to reach equilibrium. The end of that period represents 2015. From 2016, entry into injecting followed the official annual number of new drug users by age</w:t>
-      </w:r>
-      <w:r>
-        <w:t xml:space="preserve"> </w:t>
-      </w:r>
-      <w:r>
-        <w:t xml:space="preserve">[23]</w:t>
+        <w:t xml:space="preserve">We fitted the model to 2015 data from the Singapore Prison Service. These were seroprevalence and prison population counts in six age groups. We estimated 12 parameters. Six scaled the contact rates by age. Six set the rate of entry into injecting by age, as an excess above the minimum entry that supplies the observed first arrests. Each model run started in model year 0 and ran for 150 years to reach equilibrium. The end of that period represents 2015. From 2016, entry into injecting followed the official annual number of new drug users by age</w:t>
+      </w:r>
+      <w:r>
+        <w:t xml:space="preserve"> </w:t>
+      </w:r>
+      <w:r>
+        <w:t xml:space="preserve">[24]</w:t>
       </w:r>
       <w:r>
         <w:t xml:space="preserve">. The 2025 value was held constant to 2030.</w:t>
@@ -582,13 +603,13 @@
         <w:pStyle w:val="BodyText"/>
       </w:pPr>
       <w:r>
-        <w:t xml:space="preserve">A multi start Nelder Mead fit gave the best fitting parameter values. We used them as the centre of a normal prior with standard deviation 0.20 on the log scale. Any best fit value closer than five prior standard deviations to a parameter bound was moved inward to that distance, so that the prior lies within the bounds. The likelihood was binomial for the prevalence counts and log normal for the population counts. Parameter sets that did not reach equilibrium were excluded. We sampled the posterior with an adaptive random walk Metropolis algorithm</w:t>
-      </w:r>
-      <w:r>
-        <w:t xml:space="preserve"> </w:t>
-      </w:r>
-      <w:r>
-        <w:t xml:space="preserve">[24]</w:t>
+        <w:t xml:space="preserve">A multi start Nelder Mead fit gave the best fitting parameter values. We used them as the centre of a normal prior with standard deviation 0.20 on the log scale. Any best fit value closer than five prior standard deviations to a parameter bound was moved inward to that distance, so that the prior lies within the bounds. The likelihood was binomial for the prevalence counts and log normal for the population counts and for the 2015 entry into injecting, compared with the official count of new drug users. Parameter sets that did not reach equilibrium were excluded. We sampled the posterior with an adaptive random walk Metropolis algorithm</w:t>
+      </w:r>
+      <w:r>
+        <w:t xml:space="preserve"> </w:t>
+      </w:r>
+      <w:r>
+        <w:t xml:space="preserve">[25]</w:t>
       </w:r>
       <w:r>
         <w:t xml:space="preserve">. We ran four chains from independent prior draws, with 50,000 model runs each. All parameters reached rank normalised R-hat below 1.01</w:t>
@@ -597,7 +618,7 @@
         <w:t xml:space="preserve"> </w:t>
       </w:r>
       <w:r>
-        <w:t xml:space="preserve">[25]</w:t>
+        <w:t xml:space="preserve">[26]</w:t>
       </w:r>
       <w:r>
         <w:t xml:space="preserve">. We also trained single round neural posterior estimation</w:t>
@@ -606,13 +627,13 @@
         <w:t xml:space="preserve"> </w:t>
       </w:r>
       <w:r>
-        <w:t xml:space="preserve">[26,27]</w:t>
-      </w:r>
-      <w:r>
-        <w:t xml:space="preserve"> </w:t>
-      </w:r>
-      <w:r>
-        <w:t xml:space="preserve">on 50,000 prior simulations drawn by Latin hypercube sampling and compared it with MCMC. Simulation based calibration on 1,000 simulated datasets showed well calibrated neural posteriors (95% coverage 0.93 to 0.96). Policy results agreed within 0.6%. The neural posterior’s 95% intervals were on average 4% narrower than those from MCMC. We used MCMC, which samples the exact posterior and whose error falls with longer runs. S1 Text, Section 2 gives details.</w:t>
+        <w:t xml:space="preserve">[27,28]</w:t>
+      </w:r>
+      <w:r>
+        <w:t xml:space="preserve"> </w:t>
+      </w:r>
+      <w:r>
+        <w:t xml:space="preserve">on 50,000 prior simulations drawn by Latin hypercube sampling and compared it with MCMC. Simulation based calibration on 973 simulated datasets showed well calibrated neural posteriors (95% coverage 0.94 to 0.96). Policy results agreed within 1.2%. The neural posterior’s 95% intervals were on average 1% narrower than those from MCMC. We used MCMC, which samples the exact posterior and whose error falls with longer runs. S1 Text, Section 2 gives details.</w:t>
       </w:r>
     </w:p>
     <w:bookmarkEnd w:id="20"/>
@@ -673,7 +694,7 @@
         <w:pStyle w:val="FirstParagraph"/>
       </w:pPr>
       <w:r>
-        <w:t xml:space="preserve">The two main outcomes were the reductions in 2030 compared with 2015 in annual new infections and annual HCV deaths. New infections include reinfections. HCV deaths are excess deaths from decompensated cirrhosis and liver cancer. These are event counts per year in the modelled population. They are not rates per person. A scenario met a target if its median reduction was at least 80% for infections or 65% for deaths. We also report the share of posterior draws in which both targets were met. Secondary outcomes were screening tests, treatment starts and costs from 2026 to 2030.</w:t>
+        <w:t xml:space="preserve">The two main outcomes were the reductions in 2030 compared with 2015 in annual new infections and annual HCV deaths. New infections include reinfections. HCV deaths are excess deaths from decompensated cirrhosis and liver cancer. These are event counts per year in the modelled population. They are not rates per person. A scenario met a target if its median reduction was at least 80% for infections or 65% for deaths. We also report the share of posterior draws in which each target, and both together, were met. Secondary outcomes were screening tests, treatment starts and costs from 2026 to 2030.</w:t>
       </w:r>
     </w:p>
     <w:p>
@@ -687,7 +708,7 @@
         <w:t xml:space="preserve"> </w:t>
       </w:r>
       <w:r>
-        <w:t xml:space="preserve">[28,29]</w:t>
+        <w:t xml:space="preserve">[29,30]</w:t>
       </w:r>
       <w:r>
         <w:t xml:space="preserve">. Test and consultation prices came from public price lists</w:t>
@@ -696,7 +717,7 @@
         <w:t xml:space="preserve"> </w:t>
       </w:r>
       <w:r>
-        <w:t xml:space="preserve">[30,31]</w:t>
+        <w:t xml:space="preserve">[31,32]</w:t>
       </w:r>
       <w:r>
         <w:t xml:space="preserve">. These are model prices. They are not Singapore payer costs. Costs were discounted at 3% a year to 2026. Treatment starts were not discounted. S1 Text, Section 3 lists all cost inputs.</w:t>
@@ -723,7 +744,7 @@
         <w:t xml:space="preserve"> </w:t>
       </w:r>
       <w:r>
-        <w:t xml:space="preserve">[32]</w:t>
+        <w:t xml:space="preserve">[33]</w:t>
       </w:r>
       <w:r>
         <w:t xml:space="preserve">.</w:t>
@@ -754,17 +775,17 @@
         <w:pStyle w:val="FirstParagraph"/>
       </w:pPr>
       <w:r>
-        <w:t xml:space="preserve">The model reproduced the age specific seroprevalence and population targets. All 95% predictive intervals overlapped the target intervals (S1 Text, Section 2). In 2015, the model estimated 21,169 (95% interval: 19,152–23,399) people with a history of injecting drugs. Of these, 1,551 (1,412–1,707) were in F and 15,016 (13,502–16,714) were in X.</w:t>
+        <w:t xml:space="preserve">The model reproduced the age specific seroprevalence and population targets. All 95% predictive intervals overlapped the target intervals (S1 Text, Section 2). In 2015, the model estimated 18,453 (95% interval: 17,799–19,380) people with a history of injecting drugs. Of these, 2,157 (2,148–2,165) were in F and 9,608 (9,545–9,664) were in X.</w:t>
       </w:r>
     </w:p>
     <w:bookmarkEnd w:id="25"/>
-    <w:bookmarkStart w:id="26" w:name="X92b45ca8153c173c8bc1f4c2ea1bb3a56425b73"/>
+    <w:bookmarkStart w:id="26" w:name="X7fcd94bfd87d1a843d0e5bbed8188314588d4e1"/>
     <w:p>
       <w:pPr>
         <w:pStyle w:val="Heading2"/>
       </w:pPr>
       <w:r>
-        <w:t xml:space="preserve">Prison treatment reduced new infections but deaths lagged</w:t>
+        <w:t xml:space="preserve">Prison treatment alone met neither target</w:t>
       </w:r>
     </w:p>
     <w:p>
@@ -772,7 +793,7 @@
         <w:pStyle w:val="FirstParagraph"/>
       </w:pPr>
       <w:r>
-        <w:t xml:space="preserve">Without any treatment, new infections rose after 2015 as entry into injecting increased. They remained high to 2030 (Fig 2). In 2030 annual new infections were 134.9% (95% UI: 121.7%–149.9%) of the 2015 level. HCV deaths were 102.9% (95% UI: 101.5%–104.6%) of the 2015 level.</w:t>
+        <w:t xml:space="preserve">Without any treatment, new infections rose after 2015 as entry into injecting increased. They remained high to 2030 (Fig 2). In 2030 annual new infections were 101.9% (95% UI: 98.8%–105.5%) of the 2015 level. HCV deaths were 100.1% (95% UI: 99.8%–100.4%) of the 2015 level.</w:t>
       </w:r>
     </w:p>
     <w:p>
@@ -780,7 +801,7 @@
         <w:pStyle w:val="BodyText"/>
       </w:pPr>
       <w:r>
-        <w:t xml:space="preserve">Prison treatment from 2019 changed the course of new infections. By 2025 they were 59.1% (95% UI: 50.6%–68.7%) of the 2015 level. By 2030 they had fallen by 59.2% (95% UI: 46.4%–69.0%). This was well short of the 80% target. Deaths fell more slowly. By 2025 they were still 74.0% (95% UI: 73.2%–74.7%) of the 2015 level. By 2030 the reduction was 41.8% (95% UI: 40.9%–42.8%), well short of the 65% target.</w:t>
+        <w:t xml:space="preserve">Prison treatment from 2019 changed the course of new infections. By 2025 they were 64.0% (95% UI: 56.5%–72.2%) of the 2015 level. By 2030 they had fallen by 47.6% (95% UI: 36.5%–57.5%). This was well short of the 80% target. Deaths fell at a similar pace. By 2025 they were 66.8% (95% UI: 65.8%–68.5%) of the 2015 level. By 2030 the reduction was 47.4% (95% UI: 44.7%–48.8%), well short of the 65% target.</w:t>
       </w:r>
     </w:p>
     <w:p>
@@ -788,17 +809,17 @@
         <w:pStyle w:val="BodyText"/>
       </w:pPr>
       <w:r>
-        <w:t xml:space="preserve">The reason lies in where infection and disease sit after release. In 2026, F held 146 (95% UI: 129–167) people with chronic infection. X held 1,687 (95% UI: 1,493–1,896). X thus held 92% of chronic infections among released people. In the J only scenario, 96% of HCV deaths in 2026 occurred in F and X. By 2030 this share was 96%. People in X do not inject and do not transmit. Prison treatment does not reach them after release.</w:t>
+        <w:t xml:space="preserve">The reason lies in where infection and disease sit after release. In 2026, F held 149 (95% UI: 138–160) people with chronic infection. X held 909 (95% UI: 846–969). X thus held 86% of chronic infections among released people. In the J only scenario, 81% of HCV deaths in 2026 occurred in F and X. By 2030 this share was 80%. People in X do not inject and do not transmit. Prison treatment does not reach them after release.</w:t>
       </w:r>
     </w:p>
     <w:bookmarkEnd w:id="26"/>
-    <w:bookmarkStart w:id="27" w:name="X83149539b544f1c4b9fa5c2a7f5e56cdcb5fcfa"/>
+    <w:bookmarkStart w:id="27" w:name="Xda86bbae8803f10c8689f5048ad51af7d326745"/>
     <w:p>
       <w:pPr>
         <w:pStyle w:val="Heading2"/>
       </w:pPr>
       <w:r>
-        <w:t xml:space="preserve">Community screening needed to meet both targets</w:t>
+        <w:t xml:space="preserve">Community screening can meet the mortality target but not the incidence target</w:t>
       </w:r>
     </w:p>
     <w:p>
@@ -806,7 +827,7 @@
         <w:pStyle w:val="FirstParagraph"/>
       </w:pPr>
       <w:r>
-        <w:t xml:space="preserve">Adding community screening increased both reductions (Table 1). The incidence target was met at the median in 12 of 15 scenarios. The mortality target was met in only 1. Only 1 scenario met both. This was 8,000 tests a year with 25% to F. At 5,000 tests a year with 25% to F, the median mortality reduction was 64.0% (95% UI: 62.5%–65.6%), just below the target. Both targets were met in 11% of draws, so this scenario sits on the threshold. At 8,000 tests a year with 25% to F, both targets were met in 100% of draws. With 50% to F, the share was 44%. The ideal reference met both targets with a mortality reduction of 73.5% (95% UI: 72.8%–73.9%).</w:t>
+        <w:t xml:space="preserve">Adding community screening increased both reductions (Table 1). No scenario met the incidence target. The largest reduction in a finite scenario was 57.3%, and screening everyone eligible in F and X every year gave 57.3% (95% UI: 44.4%–68.4%). In that ideal reference, 59% of new infections in 2030 occurred in D, among people who inject but have never been imprisoned. Neither prison treatment nor screening after release reaches them, and no draw met the incidence target in any scenario.</w:t>
       </w:r>
     </w:p>
     <w:p>
@@ -814,7 +835,15 @@
         <w:pStyle w:val="BodyText"/>
       </w:pPr>
       <w:r>
-        <w:t xml:space="preserve">At 600 tests a year, the planned size of the current community programme, the mortality reduction was at most 45.7%. This was a gain of under 5 percentage points over prison treatment alone.</w:t>
+        <w:t xml:space="preserve">The mortality target was met at the median in 2 of 15 scenarios: 8,000 tests a year with 25% or 50% to F. At 8,000 tests a year with 25% to F, the mortality target was met in 87% of draws. With 50% to F, the share was 60%. At 5,000 tests a year with 25% to F, the median mortality reduction was 64.9% (95% UI: 60.9%–67.0%), just below the target. The mortality target was met in 47% of draws, so this scenario sits on the threshold. The ideal reference reduced mortality by 67.4% (95% UI: 63.3%–69.7%).</w:t>
+      </w:r>
+    </w:p>
+    <w:p>
+      <w:pPr>
+        <w:pStyle w:val="BodyText"/>
+      </w:pPr>
+      <w:r>
+        <w:t xml:space="preserve">At 600 tests a year, the planned size of the current community programme, the mortality reduction was at most 51.1%. This was a gain of under 5 percentage points over prison treatment alone.</w:t>
       </w:r>
     </w:p>
     <w:bookmarkEnd w:id="27"/>
@@ -840,7 +869,7 @@
         <w:pStyle w:val="BodyText"/>
       </w:pPr>
       <w:r>
-        <w:t xml:space="preserve">The F group is small. In 2026 about 1,480 people in F were eligible for screening each year. Once the F quota exceeded this number, extra tests could not be used (S1 Text, Fig S5). At 8,000 tests a year with 25% to F, 75% of the F quota was used. With 75% to F, only 25% was used. In all three splits at this capacity, the incidence reduction was 99.0%. The extra F tests were idle, while the X tests they replaced were lost. The mortality reduction fell from 69.6% (95% UI: 68.3%–70.8%) with 25% to F to 56.5% (95% UI: 55.1%–58.1%) with 75% to F.</w:t>
+        <w:t xml:space="preserve">The F group is small. In 2026 about 2,110 people in F were eligible for screening each year. Once the F quota exceeded this number, extra tests could not be used (S1 Text, Fig S5). At 8,000 tests a year with 25% to F, 100% of the F quota was used. With 75% to F, only 35% was used. In all three splits at this capacity, the incidence reduction was 57.1% to 57.3%. The extra F tests were idle, while the X tests they replaced were lost. The mortality reduction fell from 67.2% (95% UI: 63.1%–69.4%) with 25% to F to 60.3% (95% UI: 56.7%–62.2%) with 75% to F.</w:t>
       </w:r>
     </w:p>
     <w:p>
@@ -848,7 +877,7 @@
         <w:pStyle w:val="BodyText"/>
       </w:pPr>
       <w:r>
-        <w:t xml:space="preserve">At lower capacities there was a real trade off. At 2,000 tests a year, moving from 25% to 75% for F raised the incidence reduction from 85.7% to 99.0%. It lowered the mortality reduction from 53.3% to 46.7%. A simple rule follows. F should receive enough tests to cover its eligible group each year, about 1,550. All remaining capacity should go to X.</w:t>
+        <w:t xml:space="preserve">At lower capacities there was a real trade off. At 2,000 tests a year, moving from 25% to 75% for F raised the incidence reduction from 51.9% to 56.1%. It lowered the mortality reduction from 57.6% to 52.1%. A simple rule follows. F should receive enough tests to cover its eligible group each year, about 1,550. All remaining capacity should go to X.</w:t>
       </w:r>
     </w:p>
     <w:bookmarkEnd w:id="28"/>
@@ -866,7 +895,7 @@
         <w:pStyle w:val="FirstParagraph"/>
       </w:pPr>
       <w:r>
-        <w:t xml:space="preserve">Treatment starts in F and X over 2026 to 2030 ranged from 197 (95% UI: 177–222) at 600 tests a year with 75% to F, to 1,699 (95% UI: 1,544–1,856) at 8,000 tests a year with 25% to F (Table 1). Starts were highest in 2026 and fell each year as the stock of chronic infection was treated. The discounted cost of the finite scenario that met both targets was S$77.9 million over five years. Drugs made up 95% of this cost. Compared with prison treatment alone, each extra percentage point of mortality reduction cost about S$1.9 million in the two scenarios with 25% to F at 5,000 and 8,000 tests a year. Single round neural posterior estimation gave policy results within 0.6% of these values (S1 Text, Table S4).</w:t>
+        <w:t xml:space="preserve">Treatment starts in F and X over 2026 to 2030 ranged from 171 (95% UI: 157–184) at 600 tests a year with 75% to F, to 1,194 (95% UI: 1,116–1,269) at 8,000 tests a year with 25% to F (Table 1). Starts were highest in 2026 and fell each year as the stock of chronic infection was treated. The discounted cost of the 2 finite scenarios that met the mortality target ranged from S$63.8 million to S$68.8 million over five years. Drugs made up 94% to 95% of this cost. Compared with prison treatment alone, each extra percentage point of mortality reduction cost about S$2.1 million in the two scenarios with 25% to F at 5,000 and 8,000 tests a year. Single round neural posterior estimation gave policy results within 1.2% of these values (S1 Text, Table S4).</w:t>
       </w:r>
     </w:p>
     <w:p>
@@ -940,7 +969,7 @@
               <w:pStyle w:val="Compact"/>
             </w:pPr>
             <w:r>
-              <w:t xml:space="preserve">Draws meeting both targets</w:t>
+              <w:t xml:space="preserve">Draws meeting the mortality target</w:t>
             </w:r>
           </w:p>
         </w:tc>
@@ -986,18 +1015,18 @@
               <w:pStyle w:val="Compact"/>
             </w:pPr>
             <w:r>
-              <w:t xml:space="preserve">59.2% (95% UI: 46.4%–69.0%)</w:t>
-            </w:r>
-          </w:p>
-        </w:tc>
-        <w:tc>
-          <w:tcPr/>
-          <w:p>
-            <w:pPr>
-              <w:pStyle w:val="Compact"/>
-            </w:pPr>
-            <w:r>
-              <w:t xml:space="preserve">41.8% (95% UI: 40.9%–42.8%)</w:t>
+              <w:t xml:space="preserve">47.6% (95% UI: 36.5%–57.5%)</w:t>
+            </w:r>
+          </w:p>
+        </w:tc>
+        <w:tc>
+          <w:tcPr/>
+          <w:p>
+            <w:pPr>
+              <w:pStyle w:val="Compact"/>
+            </w:pPr>
+            <w:r>
+              <w:t xml:space="preserve">47.4% (95% UI: 44.7%–48.8%)</w:t>
             </w:r>
           </w:p>
         </w:tc>
@@ -1030,7 +1059,7 @@
               <w:pStyle w:val="Compact"/>
             </w:pPr>
             <w:r>
-              <w:t xml:space="preserve">23.8 (95% UI: 20.0–28.5)</w:t>
+              <w:t xml:space="preserve">26.2 (95% UI: 22.9–29.5)</w:t>
             </w:r>
           </w:p>
         </w:tc>
@@ -1054,18 +1083,18 @@
               <w:pStyle w:val="Compact"/>
             </w:pPr>
             <w:r>
-              <w:t xml:space="preserve">77.2% (95% UI: 67.3%–83.6%)</w:t>
-            </w:r>
-          </w:p>
-        </w:tc>
-        <w:tc>
-          <w:tcPr/>
-          <w:p>
-            <w:pPr>
-              <w:pStyle w:val="Compact"/>
-            </w:pPr>
-            <w:r>
-              <w:t xml:space="preserve">44.6% (95% UI: 43.7%–45.7%)</w:t>
+              <w:t xml:space="preserve">50.4% (95% UI: 38.8%–60.7%)</w:t>
+            </w:r>
+          </w:p>
+        </w:tc>
+        <w:tc>
+          <w:tcPr/>
+          <w:p>
+            <w:pPr>
+              <w:pStyle w:val="Compact"/>
+            </w:pPr>
+            <w:r>
+              <w:t xml:space="preserve">50.1% (95% UI: 47.2%–51.6%)</w:t>
             </w:r>
           </w:p>
         </w:tc>
@@ -1087,18 +1116,18 @@
               <w:pStyle w:val="Compact"/>
             </w:pPr>
             <w:r>
-              <w:t xml:space="preserve">238 (95% UI: 218–260)</w:t>
-            </w:r>
-          </w:p>
-        </w:tc>
-        <w:tc>
-          <w:tcPr/>
-          <w:p>
-            <w:pPr>
-              <w:pStyle w:val="Compact"/>
-            </w:pPr>
-            <w:r>
-              <w:t xml:space="preserve">27.5 (95% UI: 23.8–32.1)</w:t>
+              <w:t xml:space="preserve">196 (95% UI: 182–209)</w:t>
+            </w:r>
+          </w:p>
+        </w:tc>
+        <w:tc>
+          <w:tcPr/>
+          <w:p>
+            <w:pPr>
+              <w:pStyle w:val="Compact"/>
+            </w:pPr>
+            <w:r>
+              <w:t xml:space="preserve">31.8 (95% UI: 28.3–35.3)</w:t>
             </w:r>
           </w:p>
         </w:tc>
@@ -1122,18 +1151,18 @@
               <w:pStyle w:val="Compact"/>
             </w:pPr>
             <w:r>
-              <w:t xml:space="preserve">85.7% (95% UI: 78.0%–90.1%)</w:t>
-            </w:r>
-          </w:p>
-        </w:tc>
-        <w:tc>
-          <w:tcPr/>
-          <w:p>
-            <w:pPr>
-              <w:pStyle w:val="Compact"/>
-            </w:pPr>
-            <w:r>
-              <w:t xml:space="preserve">53.3% (95% UI: 52.0%–54.8%)</w:t>
+              <w:t xml:space="preserve">51.9% (95% UI: 40.0%–62.4%)</w:t>
+            </w:r>
+          </w:p>
+        </w:tc>
+        <w:tc>
+          <w:tcPr/>
+          <w:p>
+            <w:pPr>
+              <w:pStyle w:val="Compact"/>
+            </w:pPr>
+            <w:r>
+              <w:t xml:space="preserve">57.6% (95% UI: 54.2%–59.5%)</w:t>
             </w:r>
           </w:p>
         </w:tc>
@@ -1155,18 +1184,18 @@
               <w:pStyle w:val="Compact"/>
             </w:pPr>
             <w:r>
-              <w:t xml:space="preserve">757 (95% UI: 699–815)</w:t>
-            </w:r>
-          </w:p>
-        </w:tc>
-        <w:tc>
-          <w:tcPr/>
-          <w:p>
-            <w:pPr>
-              <w:pStyle w:val="Compact"/>
-            </w:pPr>
-            <w:r>
-              <w:t xml:space="preserve">45.3 (95% UI: 41.0–50.2)</w:t>
+              <w:t xml:space="preserve">591 (95% UI: 551–631)</w:t>
+            </w:r>
+          </w:p>
+        </w:tc>
+        <w:tc>
+          <w:tcPr/>
+          <w:p>
+            <w:pPr>
+              <w:pStyle w:val="Compact"/>
+            </w:pPr>
+            <w:r>
+              <w:t xml:space="preserve">46.5 (95% UI: 42.6–50.4)</w:t>
             </w:r>
           </w:p>
         </w:tc>
@@ -1190,18 +1219,18 @@
               <w:pStyle w:val="Compact"/>
             </w:pPr>
             <w:r>
-              <w:t xml:space="preserve">99.0% (95% UI: 98.1%–99.4%)</w:t>
-            </w:r>
-          </w:p>
-        </w:tc>
-        <w:tc>
-          <w:tcPr/>
-          <w:p>
-            <w:pPr>
-              <w:pStyle w:val="Compact"/>
-            </w:pPr>
-            <w:r>
-              <w:t xml:space="preserve">46.7% (95% UI: 45.6%–47.8%)</w:t>
+              <w:t xml:space="preserve">56.1% (95% UI: 43.4%–67.0%)</w:t>
+            </w:r>
+          </w:p>
+        </w:tc>
+        <w:tc>
+          <w:tcPr/>
+          <w:p>
+            <w:pPr>
+              <w:pStyle w:val="Compact"/>
+            </w:pPr>
+            <w:r>
+              <w:t xml:space="preserve">52.1% (95% UI: 49.1%–53.7%)</w:t>
             </w:r>
           </w:p>
         </w:tc>
@@ -1223,18 +1252,18 @@
               <w:pStyle w:val="Compact"/>
             </w:pPr>
             <w:r>
-              <w:t xml:space="preserve">424 (95% UI: 387–466)</w:t>
-            </w:r>
-          </w:p>
-        </w:tc>
-        <w:tc>
-          <w:tcPr/>
-          <w:p>
-            <w:pPr>
-              <w:pStyle w:val="Compact"/>
-            </w:pPr>
-            <w:r>
-              <w:t xml:space="preserve">25.2 (95% UI: 22.5–28.5)</w:t>
+              <w:t xml:space="preserve">431 (95% UI: 399–463)</w:t>
+            </w:r>
+          </w:p>
+        </w:tc>
+        <w:tc>
+          <w:tcPr/>
+          <w:p>
+            <w:pPr>
+              <w:pStyle w:val="Compact"/>
+            </w:pPr>
+            <w:r>
+              <w:t xml:space="preserve">36.6 (95% UI: 32.7–40.7)</w:t>
             </w:r>
           </w:p>
         </w:tc>
@@ -1258,51 +1287,51 @@
               <w:pStyle w:val="Compact"/>
             </w:pPr>
             <w:r>
-              <w:t xml:space="preserve">98.3% (95% UI: 96.7%–99.1%)</w:t>
-            </w:r>
-          </w:p>
-        </w:tc>
-        <w:tc>
-          <w:tcPr/>
-          <w:p>
-            <w:pPr>
-              <w:pStyle w:val="Compact"/>
-            </w:pPr>
-            <w:r>
-              <w:t xml:space="preserve">64.0% (95% UI: 62.5%–65.6%)</w:t>
-            </w:r>
-          </w:p>
-        </w:tc>
-        <w:tc>
-          <w:tcPr/>
-          <w:p>
-            <w:pPr>
-              <w:pStyle w:val="Compact"/>
-            </w:pPr>
-            <w:r>
-              <w:t xml:space="preserve">11%</w:t>
-            </w:r>
-          </w:p>
-        </w:tc>
-        <w:tc>
-          <w:tcPr/>
-          <w:p>
-            <w:pPr>
-              <w:pStyle w:val="Compact"/>
-            </w:pPr>
-            <w:r>
-              <w:t xml:space="preserve">1,390 (95% UI: 1,276–1,503)</w:t>
-            </w:r>
-          </w:p>
-        </w:tc>
-        <w:tc>
-          <w:tcPr/>
-          <w:p>
-            <w:pPr>
-              <w:pStyle w:val="Compact"/>
-            </w:pPr>
-            <w:r>
-              <w:t xml:space="preserve">65.2 (95% UI: 59.8–70.8)</w:t>
+              <w:t xml:space="preserve">55.4% (95% UI: 42.8%–66.3%)</w:t>
+            </w:r>
+          </w:p>
+        </w:tc>
+        <w:tc>
+          <w:tcPr/>
+          <w:p>
+            <w:pPr>
+              <w:pStyle w:val="Compact"/>
+            </w:pPr>
+            <w:r>
+              <w:t xml:space="preserve">64.9% (95% UI: 60.9%–67.0%)</w:t>
+            </w:r>
+          </w:p>
+        </w:tc>
+        <w:tc>
+          <w:tcPr/>
+          <w:p>
+            <w:pPr>
+              <w:pStyle w:val="Compact"/>
+            </w:pPr>
+            <w:r>
+              <w:t xml:space="preserve">47%</w:t>
+            </w:r>
+          </w:p>
+        </w:tc>
+        <w:tc>
+          <w:tcPr/>
+          <w:p>
+            <w:pPr>
+              <w:pStyle w:val="Compact"/>
+            </w:pPr>
+            <w:r>
+              <w:t xml:space="preserve">1,025 (95% UI: 957–1,091)</w:t>
+            </w:r>
+          </w:p>
+        </w:tc>
+        <w:tc>
+          <w:tcPr/>
+          <w:p>
+            <w:pPr>
+              <w:pStyle w:val="Compact"/>
+            </w:pPr>
+            <w:r>
+              <w:t xml:space="preserve">62.0 (95% UI: 57.3–66.7)</w:t>
             </w:r>
           </w:p>
         </w:tc>
@@ -1326,18 +1355,18 @@
               <w:pStyle w:val="Compact"/>
             </w:pPr>
             <w:r>
-              <w:t xml:space="preserve">99.0% (95% UI: 98.2%–99.5%)</w:t>
-            </w:r>
-          </w:p>
-        </w:tc>
-        <w:tc>
-          <w:tcPr/>
-          <w:p>
-            <w:pPr>
-              <w:pStyle w:val="Compact"/>
-            </w:pPr>
-            <w:r>
-              <w:t xml:space="preserve">59.0% (95% UI: 57.5%–60.6%)</w:t>
+              <w:t xml:space="preserve">57.3% (95% UI: 44.4%–68.4%)</w:t>
+            </w:r>
+          </w:p>
+        </w:tc>
+        <w:tc>
+          <w:tcPr/>
+          <w:p>
+            <w:pPr>
+              <w:pStyle w:val="Compact"/>
+            </w:pPr>
+            <w:r>
+              <w:t xml:space="preserve">62.0% (95% UI: 58.3%–64.1%)</w:t>
             </w:r>
           </w:p>
         </w:tc>
@@ -1359,18 +1388,18 @@
               <w:pStyle w:val="Compact"/>
             </w:pPr>
             <w:r>
-              <w:t xml:space="preserve">1,115 (95% UI: 1,027–1,205)</w:t>
-            </w:r>
-          </w:p>
-        </w:tc>
-        <w:tc>
-          <w:tcPr/>
-          <w:p>
-            <w:pPr>
-              <w:pStyle w:val="Compact"/>
-            </w:pPr>
-            <w:r>
-              <w:t xml:space="preserve">52.9 (95% UI: 48.8–57.5)</w:t>
+              <w:t xml:space="preserve">936 (95% UI: 875–998)</w:t>
+            </w:r>
+          </w:p>
+        </w:tc>
+        <w:tc>
+          <w:tcPr/>
+          <w:p>
+            <w:pPr>
+              <w:pStyle w:val="Compact"/>
+            </w:pPr>
+            <w:r>
+              <w:t xml:space="preserve">56.4 (95% UI: 51.9–60.9)</w:t>
             </w:r>
           </w:p>
         </w:tc>
@@ -1394,18 +1423,18 @@
               <w:pStyle w:val="Compact"/>
             </w:pPr>
             <w:r>
-              <w:t xml:space="preserve">99.0% (95% UI: 98.2%–99.5%)</w:t>
-            </w:r>
-          </w:p>
-        </w:tc>
-        <w:tc>
-          <w:tcPr/>
-          <w:p>
-            <w:pPr>
-              <w:pStyle w:val="Compact"/>
-            </w:pPr>
-            <w:r>
-              <w:t xml:space="preserve">52.0% (95% UI: 50.7%–53.4%)</w:t>
+              <w:t xml:space="preserve">57.3% (95% UI: 44.4%–68.4%)</w:t>
+            </w:r>
+          </w:p>
+        </w:tc>
+        <w:tc>
+          <w:tcPr/>
+          <w:p>
+            <w:pPr>
+              <w:pStyle w:val="Compact"/>
+            </w:pPr>
+            <w:r>
+              <w:t xml:space="preserve">56.8% (95% UI: 53.5%–58.6%)</w:t>
             </w:r>
           </w:p>
         </w:tc>
@@ -1427,18 +1456,18 @@
               <w:pStyle w:val="Compact"/>
             </w:pPr>
             <w:r>
-              <w:t xml:space="preserve">725 (95% UI: 667–784)</w:t>
-            </w:r>
-          </w:p>
-        </w:tc>
-        <w:tc>
-          <w:tcPr/>
-          <w:p>
-            <w:pPr>
-              <w:pStyle w:val="Compact"/>
-            </w:pPr>
-            <w:r>
-              <w:t xml:space="preserve">37.2 (95% UI: 34.0–40.8)</w:t>
+              <w:t xml:space="preserve">688 (95% UI: 640–734)</w:t>
+            </w:r>
+          </w:p>
+        </w:tc>
+        <w:tc>
+          <w:tcPr/>
+          <w:p>
+            <w:pPr>
+              <w:pStyle w:val="Compact"/>
+            </w:pPr>
+            <w:r>
+              <w:t xml:space="preserve">46.1 (95% UI: 41.9–50.3)</w:t>
             </w:r>
           </w:p>
         </w:tc>
@@ -1462,51 +1491,51 @@
               <w:pStyle w:val="Compact"/>
             </w:pPr>
             <w:r>
-              <w:t xml:space="preserve">99.0% (95% UI: 98.2%–99.5%)</w:t>
-            </w:r>
-          </w:p>
-        </w:tc>
-        <w:tc>
-          <w:tcPr/>
-          <w:p>
-            <w:pPr>
-              <w:pStyle w:val="Compact"/>
-            </w:pPr>
-            <w:r>
-              <w:t xml:space="preserve">69.6% (95% UI: 68.3%–70.8%)</w:t>
-            </w:r>
-          </w:p>
-        </w:tc>
-        <w:tc>
-          <w:tcPr/>
-          <w:p>
-            <w:pPr>
-              <w:pStyle w:val="Compact"/>
-            </w:pPr>
-            <w:r>
-              <w:t xml:space="preserve">100%</w:t>
-            </w:r>
-          </w:p>
-        </w:tc>
-        <w:tc>
-          <w:tcPr/>
-          <w:p>
-            <w:pPr>
-              <w:pStyle w:val="Compact"/>
-            </w:pPr>
-            <w:r>
-              <w:t xml:space="preserve">1,699 (95% UI: 1,544–1,856)</w:t>
-            </w:r>
-          </w:p>
-        </w:tc>
-        <w:tc>
-          <w:tcPr/>
-          <w:p>
-            <w:pPr>
-              <w:pStyle w:val="Compact"/>
-            </w:pPr>
-            <w:r>
-              <w:t xml:space="preserve">77.9 (95% UI: 71.3–84.7)</w:t>
+              <w:t xml:space="preserve">57.1% (95% UI: 44.3%–68.2%)</w:t>
+            </w:r>
+          </w:p>
+        </w:tc>
+        <w:tc>
+          <w:tcPr/>
+          <w:p>
+            <w:pPr>
+              <w:pStyle w:val="Compact"/>
+            </w:pPr>
+            <w:r>
+              <w:t xml:space="preserve">67.2% (95% UI: 63.1%–69.4%)</w:t>
+            </w:r>
+          </w:p>
+        </w:tc>
+        <w:tc>
+          <w:tcPr/>
+          <w:p>
+            <w:pPr>
+              <w:pStyle w:val="Compact"/>
+            </w:pPr>
+            <w:r>
+              <w:t xml:space="preserve">87%</w:t>
+            </w:r>
+          </w:p>
+        </w:tc>
+        <w:tc>
+          <w:tcPr/>
+          <w:p>
+            <w:pPr>
+              <w:pStyle w:val="Compact"/>
+            </w:pPr>
+            <w:r>
+              <w:t xml:space="preserve">1,194 (95% UI: 1,116–1,269)</w:t>
+            </w:r>
+          </w:p>
+        </w:tc>
+        <w:tc>
+          <w:tcPr/>
+          <w:p>
+            <w:pPr>
+              <w:pStyle w:val="Compact"/>
+            </w:pPr>
+            <w:r>
+              <w:t xml:space="preserve">68.8 (95% UI: 63.7–73.8)</w:t>
             </w:r>
           </w:p>
         </w:tc>
@@ -1530,51 +1559,51 @@
               <w:pStyle w:val="Compact"/>
             </w:pPr>
             <w:r>
-              <w:t xml:space="preserve">99.0% (95% UI: 98.2%–99.5%)</w:t>
-            </w:r>
-          </w:p>
-        </w:tc>
-        <w:tc>
-          <w:tcPr/>
-          <w:p>
-            <w:pPr>
-              <w:pStyle w:val="Compact"/>
-            </w:pPr>
-            <w:r>
-              <w:t xml:space="preserve">64.9% (95% UI: 63.4%–66.4%)</w:t>
-            </w:r>
-          </w:p>
-        </w:tc>
-        <w:tc>
-          <w:tcPr/>
-          <w:p>
-            <w:pPr>
-              <w:pStyle w:val="Compact"/>
-            </w:pPr>
-            <w:r>
-              <w:t xml:space="preserve">44%</w:t>
-            </w:r>
-          </w:p>
-        </w:tc>
-        <w:tc>
-          <w:tcPr/>
-          <w:p>
-            <w:pPr>
-              <w:pStyle w:val="Compact"/>
-            </w:pPr>
-            <w:r>
-              <w:t xml:space="preserve">1,438 (95% UI: 1,319–1,557)</w:t>
-            </w:r>
-          </w:p>
-        </w:tc>
-        <w:tc>
-          <w:tcPr/>
-          <w:p>
-            <w:pPr>
-              <w:pStyle w:val="Compact"/>
-            </w:pPr>
-            <w:r>
-              <w:t xml:space="preserve">66.4 (95% UI: 61.1–71.8)</w:t>
+              <w:t xml:space="preserve">57.3% (95% UI: 44.4%–68.4%)</w:t>
+            </w:r>
+          </w:p>
+        </w:tc>
+        <w:tc>
+          <w:tcPr/>
+          <w:p>
+            <w:pPr>
+              <w:pStyle w:val="Compact"/>
+            </w:pPr>
+            <w:r>
+              <w:t xml:space="preserve">65.4% (95% UI: 61.4%–67.6%)</w:t>
+            </w:r>
+          </w:p>
+        </w:tc>
+        <w:tc>
+          <w:tcPr/>
+          <w:p>
+            <w:pPr>
+              <w:pStyle w:val="Compact"/>
+            </w:pPr>
+            <w:r>
+              <w:t xml:space="preserve">60%</w:t>
+            </w:r>
+          </w:p>
+        </w:tc>
+        <w:tc>
+          <w:tcPr/>
+          <w:p>
+            <w:pPr>
+              <w:pStyle w:val="Compact"/>
+            </w:pPr>
+            <w:r>
+              <w:t xml:space="preserve">1,101 (95% UI: 1,029–1,170)</w:t>
+            </w:r>
+          </w:p>
+        </w:tc>
+        <w:tc>
+          <w:tcPr/>
+          <w:p>
+            <w:pPr>
+              <w:pStyle w:val="Compact"/>
+            </w:pPr>
+            <w:r>
+              <w:t xml:space="preserve">63.8 (95% UI: 58.9–68.6)</w:t>
             </w:r>
           </w:p>
         </w:tc>
@@ -1598,18 +1627,18 @@
               <w:pStyle w:val="Compact"/>
             </w:pPr>
             <w:r>
-              <w:t xml:space="preserve">99.0% (95% UI: 98.2%–99.5%)</w:t>
-            </w:r>
-          </w:p>
-        </w:tc>
-        <w:tc>
-          <w:tcPr/>
-          <w:p>
-            <w:pPr>
-              <w:pStyle w:val="Compact"/>
-            </w:pPr>
-            <w:r>
-              <w:t xml:space="preserve">56.5% (95% UI: 55.1%–58.1%)</w:t>
+              <w:t xml:space="preserve">57.3% (95% UI: 44.4%–68.4%)</w:t>
+            </w:r>
+          </w:p>
+        </w:tc>
+        <w:tc>
+          <w:tcPr/>
+          <w:p>
+            <w:pPr>
+              <w:pStyle w:val="Compact"/>
+            </w:pPr>
+            <w:r>
+              <w:t xml:space="preserve">60.3% (95% UI: 56.7%–62.2%)</w:t>
             </w:r>
           </w:p>
         </w:tc>
@@ -1631,18 +1660,18 @@
               <w:pStyle w:val="Compact"/>
             </w:pPr>
             <w:r>
-              <w:t xml:space="preserve">974 (95% UI: 897–1,052)</w:t>
-            </w:r>
-          </w:p>
-        </w:tc>
-        <w:tc>
-          <w:tcPr/>
-          <w:p>
-            <w:pPr>
-              <w:pStyle w:val="Compact"/>
-            </w:pPr>
-            <w:r>
-              <w:t xml:space="preserve">47.2 (95% UI: 43.5–51.4)</w:t>
+              <w:t xml:space="preserve">852 (95% UI: 795–909)</w:t>
+            </w:r>
+          </w:p>
+        </w:tc>
+        <w:tc>
+          <w:tcPr/>
+          <w:p>
+            <w:pPr>
+              <w:pStyle w:val="Compact"/>
+            </w:pPr>
+            <w:r>
+              <w:t xml:space="preserve">52.9 (95% UI: 48.4–57.3)</w:t>
             </w:r>
           </w:p>
         </w:tc>
@@ -1666,51 +1695,51 @@
               <w:pStyle w:val="Compact"/>
             </w:pPr>
             <w:r>
-              <w:t xml:space="preserve">99.0% (95% UI: 98.2%–99.5%)</w:t>
-            </w:r>
-          </w:p>
-        </w:tc>
-        <w:tc>
-          <w:tcPr/>
-          <w:p>
-            <w:pPr>
-              <w:pStyle w:val="Compact"/>
-            </w:pPr>
-            <w:r>
-              <w:t xml:space="preserve">73.5% (95% UI: 72.8%–73.9%)</w:t>
-            </w:r>
-          </w:p>
-        </w:tc>
-        <w:tc>
-          <w:tcPr/>
-          <w:p>
-            <w:pPr>
-              <w:pStyle w:val="Compact"/>
-            </w:pPr>
-            <w:r>
-              <w:t xml:space="preserve">100%</w:t>
-            </w:r>
-          </w:p>
-        </w:tc>
-        <w:tc>
-          <w:tcPr/>
-          <w:p>
-            <w:pPr>
-              <w:pStyle w:val="Compact"/>
-            </w:pPr>
-            <w:r>
-              <w:t xml:space="preserve">1,990 (95% UI: 1,772–2,225)</w:t>
-            </w:r>
-          </w:p>
-        </w:tc>
-        <w:tc>
-          <w:tcPr/>
-          <w:p>
-            <w:pPr>
-              <w:pStyle w:val="Compact"/>
-            </w:pPr>
-            <w:r>
-              <w:t xml:space="preserve">95.2 (95% UI: 85.4–105.7)</w:t>
+              <w:t xml:space="preserve">57.3% (95% UI: 44.4%–68.4%)</w:t>
+            </w:r>
+          </w:p>
+        </w:tc>
+        <w:tc>
+          <w:tcPr/>
+          <w:p>
+            <w:pPr>
+              <w:pStyle w:val="Compact"/>
+            </w:pPr>
+            <w:r>
+              <w:t xml:space="preserve">67.4% (95% UI: 63.3%–69.7%)</w:t>
+            </w:r>
+          </w:p>
+        </w:tc>
+        <w:tc>
+          <w:tcPr/>
+          <w:p>
+            <w:pPr>
+              <w:pStyle w:val="Compact"/>
+            </w:pPr>
+            <w:r>
+              <w:t xml:space="preserve">89%</w:t>
+            </w:r>
+          </w:p>
+        </w:tc>
+        <w:tc>
+          <w:tcPr/>
+          <w:p>
+            <w:pPr>
+              <w:pStyle w:val="Compact"/>
+            </w:pPr>
+            <w:r>
+              <w:t xml:space="preserve">1,255 (95% UI: 1,174–1,332)</w:t>
+            </w:r>
+          </w:p>
+        </w:tc>
+        <w:tc>
+          <w:tcPr/>
+          <w:p>
+            <w:pPr>
+              <w:pStyle w:val="Compact"/>
+            </w:pPr>
+            <w:r>
+              <w:t xml:space="preserve">73.3 (95% UI: 68.1–78.4)</w:t>
             </w:r>
           </w:p>
         </w:tc>
@@ -1721,7 +1750,7 @@
         <w:pStyle w:val="BodyText"/>
       </w:pPr>
       <w:r>
-        <w:t xml:space="preserve">Reductions compare 2030 with 2015. Values are medians (95% UI) across 2,000 posterior draws. Targets are at least 80% for incidence and at least 65% for mortality. Costs are in 2026 Singapore dollars, discounted at 3% a year, and include prison treatment costs from 2026. Treatment starts count courses, not people. S1 Text, Table S9 gives all 17 scenarios.</w:t>
+        <w:t xml:space="preserve">Reductions compare 2030 with 2015. Values are medians (95% UI) across 2,000 posterior draws. Targets are at least 80% for incidence and at least 65% for mortality. No draw met the incidence target in any scenario. Costs are in 2026 Singapore dollars, discounted at 3% a year, and include prison treatment costs from 2026. Treatment starts count courses, not people. S1 Text, Table S9 gives all 17 scenarios.</w:t>
       </w:r>
     </w:p>
     <w:bookmarkEnd w:id="29"/>
@@ -1740,7 +1769,7 @@
         <w:pStyle w:val="FirstParagraph"/>
       </w:pPr>
       <w:r>
-        <w:t xml:space="preserve">In this model, prison treatment from 2019 cut new HCV infections among people who inject drugs in Singapore by more than half by 2030. It did much less for deaths. By 2026, nearly all chronic infections and HCV deaths among released people were in those who had stopped injecting. Community screening was needed to meet the mortality target. The split of screening between released people who still inject and those who have stopped mattered as much as the total amount.</w:t>
+        <w:t xml:space="preserve">In this model, prison treatment from 2019 cut new HCV infections among people who inject drugs in Singapore by 48% and HCV deaths by 47% by 2030. By 2026, nearly all chronic infections and HCV deaths among released people were in those who had stopped injecting. Community screening was needed to meet the mortality target. The split of screening between released people who still inject and those who have stopped mattered as much as the total amount. No strategy we modelled met the incidence target, because most new infections occurred in people who had not yet been imprisoned.</w:t>
       </w:r>
     </w:p>
     <w:p>
@@ -1748,7 +1777,7 @@
         <w:pStyle w:val="BodyText"/>
       </w:pPr>
       <w:r>
-        <w:t xml:space="preserve">Prison treatment works on transmission because most active injectors pass through prison. Curing them before release removes infection from the injecting network. This matches earlier work on treatment as prevention</w:t>
+        <w:t xml:space="preserve">Prison treatment works on transmission among people who pass through prison. Curing them before release removes infection from that part of the injecting network, which matches earlier work on treatment as prevention</w:t>
       </w:r>
       <w:r>
         <w:t xml:space="preserve"> </w:t>
@@ -1757,7 +1786,7 @@
         <w:t xml:space="preserve">[14,15]</w:t>
       </w:r>
       <w:r>
-        <w:t xml:space="preserve">. Deaths follow a different path. They arise from cirrhosis and liver cancer that built up over many years. Most of this burden sits in people who stopped injecting long ago. They are rarely in prison and do not transmit. Cure also does not remove all risk in people who already have cirrhosis</w:t>
+        <w:t xml:space="preserve">. But people inject for years before their first arrest, and in this model they acquired 59% of new infections in 2030 even when everyone eligible after release was screened. Reducing these infections needs testing and prevention in the community before imprisonment. Deaths follow a different path. They arise from cirrhosis and liver cancer that built up over many years. Most of this burden sits in people who stopped injecting long ago. They are rarely in prison and do not transmit. Cure also does not remove all risk in people who already have cirrhosis</w:t>
       </w:r>
       <w:r>
         <w:t xml:space="preserve"> </w:t>
@@ -1766,7 +1795,7 @@
         <w:t xml:space="preserve">[17,18]</w:t>
       </w:r>
       <w:r>
-        <w:t xml:space="preserve">. So the mortality curve bends late. This lag is a feature of HCV natural history. It is not a failure of prison treatment.</w:t>
+        <w:t xml:space="preserve">.</w:t>
       </w:r>
     </w:p>
     <w:p>
@@ -1782,7 +1811,7 @@
         <w:pStyle w:val="BodyText"/>
       </w:pPr>
       <w:r>
-        <w:t xml:space="preserve">The scale required is large. The scenarios that met both targets needed 8,000 tests a year. That is about 13 times the planned capacity of the current community programme</w:t>
+        <w:t xml:space="preserve">The scale required is large. The scenarios that met the mortality target needed 8,000 tests a year. That is about 13 times the planned capacity of the current community programme</w:t>
       </w:r>
       <w:r>
         <w:t xml:space="preserve"> </w:t>
@@ -1791,13 +1820,13 @@
         <w:t xml:space="preserve">[11]</w:t>
       </w:r>
       <w:r>
-        <w:t xml:space="preserve">. Even 5,000 tests a year with 25% to F met both targets in only 11% of draws. All scenarios also assumed that every person identified starts treatment. Real linkage is weaker. In a Singapore trial among halfway house residents, only 12.6% of people with antibodies started treatment</w:t>
-      </w:r>
-      <w:r>
-        <w:t xml:space="preserve"> </w:t>
-      </w:r>
-      <w:r>
-        <w:t xml:space="preserve">[33]</w:t>
+        <w:t xml:space="preserve">. Even 5,000 tests a year with 25% to F met the mortality target in only 47% of draws. All scenarios also assumed that every person identified starts treatment. Real linkage is weaker. In a Singapore trial among halfway house residents, only 12.6% of people with antibodies started treatment</w:t>
+      </w:r>
+      <w:r>
+        <w:t xml:space="preserve"> </w:t>
+      </w:r>
+      <w:r>
+        <w:t xml:space="preserve">[34]</w:t>
       </w:r>
       <w:r>
         <w:t xml:space="preserve">. Care navigation and simpler models of care can raise uptake</w:t>
@@ -1806,7 +1835,7 @@
         <w:t xml:space="preserve"> </w:t>
       </w:r>
       <w:r>
-        <w:t xml:space="preserve">[34,35]</w:t>
+        <w:t xml:space="preserve">[35,36]</w:t>
       </w:r>
       <w:r>
         <w:t xml:space="preserve">. Even then, real programmes will likely need more screening than our model suggests.</w:t>
@@ -1843,7 +1872,7 @@
         <w:t xml:space="preserve">[3]</w:t>
       </w:r>
       <w:r>
-        <w:t xml:space="preserve">. Second, we calibrated the model to one year of prison data. We did not fit it to observed treatment numbers after 2019. The prison treatment assumption may therefore overstate or understate what happened. Third, we assumed perfect linkage from screening to treatment and no loss to follow up. Fourth, people in X cannot be reinfected or return to injecting. Some do relapse, which would add transmission. Fifth, entry into injecting uses counts of new drug users from law enforcement as a proxy. Sixth, costs use list prices and an older drug price. Actual payer costs are not public. Seventh, our uncertainty intervals cover model parameters only. The prior was centred on a fit to the same data, and for three parameters the data narrowed the prior little.</w:t>
+        <w:t xml:space="preserve">. Second, we calibrated the model to one year of prison data. We did not fit it to observed treatment numbers after 2019. The prison treatment assumption may therefore overstate or understate what happened. Third, we assumed perfect linkage from screening to treatment and no loss to follow up. Fourth, people in X cannot be reinfected or return to injecting. Some do relapse, which would add transmission. Fifth, entry into injecting uses counts of new drug users from law enforcement as a proxy, and the same counts anchor the number of people who inject without ever being imprisoned. That number sets the incidence result that prison and post release services cannot reach. Sixth, costs use list prices and an older drug price. Actual payer costs are not public. Seventh, our uncertainty intervals cover model parameters only. The prior was centred on a fit to the same data, and for 8 parameters the data narrowed the prior little.</w:t>
       </w:r>
     </w:p>
     <w:p>
@@ -1851,7 +1880,7 @@
         <w:pStyle w:val="BodyText"/>
       </w:pPr>
       <w:r>
-        <w:t xml:space="preserve">In conclusion, prison treatment has done much to reduce HCV transmission among people who inject drugs in Singapore. It will not, by itself, meet the WHO mortality target by 2030. Large scale community screening is needed. Most of it should reach people who have stopped injecting, after enough is set aside to cover those who still inject.</w:t>
+        <w:t xml:space="preserve">In conclusion, prison treatment has done much to reduce HCV among people who inject drugs in Singapore, but by itself it will not meet either WHO target by 2030. Large scale community screening after release can meet the mortality target, if most of it reaches people who have stopped injecting after enough is set aside for those who still inject. Meeting the incidence target needs testing and prevention that reach people who inject before they are ever imprisoned.</w:t>
       </w:r>
     </w:p>
     <w:bookmarkEnd w:id="31"/>
@@ -2202,7 +2231,7 @@
       </w:r>
     </w:p>
     <w:bookmarkEnd w:id="47"/>
-    <w:bookmarkStart w:id="116" w:name="references"/>
+    <w:bookmarkStart w:id="118" w:name="references"/>
     <w:p>
       <w:pPr>
         <w:pStyle w:val="Heading1"/>
@@ -2211,7 +2240,7 @@
         <w:t xml:space="preserve">References</w:t>
       </w:r>
     </w:p>
-    <w:bookmarkStart w:id="115" w:name="refs"/>
+    <w:bookmarkStart w:id="117" w:name="refs"/>
     <w:bookmarkStart w:id="49" w:name="ref-pawlotsky2020"/>
     <w:p>
       <w:pPr>
@@ -3033,7 +3062,7 @@
       </w:hyperlink>
     </w:p>
     <w:bookmarkEnd w:id="89"/>
-    <w:bookmarkStart w:id="91" w:name="ref-singstat_drug"/>
+    <w:bookmarkStart w:id="91" w:name="ref-lee2012"/>
     <w:p>
       <w:pPr>
         <w:pStyle w:val="Bibliography"/>
@@ -3048,6 +3077,42 @@
         <w:t xml:space="preserve">	</w:t>
       </w:r>
       <w:r>
+        <w:t xml:space="preserve">Lee M-H, Yang H-I, Lu S-N, Jen C-L, You S-L, Wang L-Y, et al.</w:t>
+      </w:r>
+      <w:r>
+        <w:t xml:space="preserve"> </w:t>
+      </w:r>
+      <w:r>
+        <w:t xml:space="preserve">Chronic hepatitis C virus infection increases mortality from hepatic and extrahepatic diseases: a community-based long-term prospective study</w:t>
+      </w:r>
+      <w:r>
+        <w:t xml:space="preserve">. The Journal of Infectious Diseases. 2012;206: 469–477. doi:</w:t>
+      </w:r>
+      <w:hyperlink r:id="rId90">
+        <w:r>
+          <w:rPr>
+            <w:rStyle w:val="Hyperlink"/>
+          </w:rPr>
+          <w:t xml:space="preserve">10.1093/infdis/jis385</w:t>
+        </w:r>
+      </w:hyperlink>
+    </w:p>
+    <w:bookmarkEnd w:id="91"/>
+    <w:bookmarkStart w:id="93" w:name="ref-singstat_drug"/>
+    <w:p>
+      <w:pPr>
+        <w:pStyle w:val="Bibliography"/>
+      </w:pPr>
+      <w:r>
+        <w:t xml:space="preserve">24.</w:t>
+      </w:r>
+      <w:r>
+        <w:t xml:space="preserve"> </w:t>
+      </w:r>
+      <w:r>
+        <w:t xml:space="preserve">	</w:t>
+      </w:r>
+      <w:r>
         <w:t xml:space="preserve">Singapore Department of Statistics.</w:t>
       </w:r>
       <w:r>
@@ -3062,7 +3127,7 @@
       <w:r>
         <w:t xml:space="preserve"> </w:t>
       </w:r>
-      <w:hyperlink r:id="rId90">
+      <w:hyperlink r:id="rId92">
         <w:r>
           <w:rPr>
             <w:rStyle w:val="Hyperlink"/>
@@ -3071,14 +3136,14 @@
         </w:r>
       </w:hyperlink>
     </w:p>
-    <w:bookmarkEnd w:id="91"/>
-    <w:bookmarkStart w:id="93" w:name="ref-haario2001"/>
+    <w:bookmarkEnd w:id="93"/>
+    <w:bookmarkStart w:id="95" w:name="ref-haario2001"/>
     <w:p>
       <w:pPr>
         <w:pStyle w:val="Bibliography"/>
       </w:pPr>
       <w:r>
-        <w:t xml:space="preserve">24.</w:t>
+        <w:t xml:space="preserve">25.</w:t>
       </w:r>
       <w:r>
         <w:t xml:space="preserve"> </w:t>
@@ -3098,7 +3163,7 @@
       <w:r>
         <w:t xml:space="preserve">. Bernoulli. 2001;7: 223–242. doi:</w:t>
       </w:r>
-      <w:hyperlink r:id="rId92">
+      <w:hyperlink r:id="rId94">
         <w:r>
           <w:rPr>
             <w:rStyle w:val="Hyperlink"/>
@@ -3107,14 +3172,14 @@
         </w:r>
       </w:hyperlink>
     </w:p>
-    <w:bookmarkEnd w:id="93"/>
-    <w:bookmarkStart w:id="95" w:name="ref-vehtari2021"/>
+    <w:bookmarkEnd w:id="95"/>
+    <w:bookmarkStart w:id="97" w:name="ref-vehtari2021"/>
     <w:p>
       <w:pPr>
         <w:pStyle w:val="Bibliography"/>
       </w:pPr>
       <w:r>
-        <w:t xml:space="preserve">25.</w:t>
+        <w:t xml:space="preserve">26.</w:t>
       </w:r>
       <w:r>
         <w:t xml:space="preserve"> </w:t>
@@ -3134,7 +3199,7 @@
       <w:r>
         <w:t xml:space="preserve">. Bayesian Analysis. 2021;16: 667–718. doi:</w:t>
       </w:r>
-      <w:hyperlink r:id="rId94">
+      <w:hyperlink r:id="rId96">
         <w:r>
           <w:rPr>
             <w:rStyle w:val="Hyperlink"/>
@@ -3143,14 +3208,14 @@
         </w:r>
       </w:hyperlink>
     </w:p>
-    <w:bookmarkEnd w:id="95"/>
-    <w:bookmarkStart w:id="96" w:name="ref-greenberg2019"/>
+    <w:bookmarkEnd w:id="97"/>
+    <w:bookmarkStart w:id="98" w:name="ref-greenberg2019"/>
     <w:p>
       <w:pPr>
         <w:pStyle w:val="Bibliography"/>
       </w:pPr>
       <w:r>
-        <w:t xml:space="preserve">26.</w:t>
+        <w:t xml:space="preserve">27.</w:t>
       </w:r>
       <w:r>
         <w:t xml:space="preserve"> </w:t>
@@ -3174,14 +3239,14 @@
         <w:t xml:space="preserve"> </w:t>
       </w:r>
     </w:p>
-    <w:bookmarkEnd w:id="96"/>
-    <w:bookmarkStart w:id="98" w:name="ref-sbi2020"/>
+    <w:bookmarkEnd w:id="98"/>
+    <w:bookmarkStart w:id="100" w:name="ref-sbi2020"/>
     <w:p>
       <w:pPr>
         <w:pStyle w:val="Bibliography"/>
       </w:pPr>
       <w:r>
-        <w:t xml:space="preserve">27.</w:t>
+        <w:t xml:space="preserve">28.</w:t>
       </w:r>
       <w:r>
         <w:t xml:space="preserve"> </w:t>
@@ -3201,7 +3266,7 @@
       <w:r>
         <w:t xml:space="preserve">. Journal of Open Source Software. 2020;5: 2505. doi:</w:t>
       </w:r>
-      <w:hyperlink r:id="rId97">
+      <w:hyperlink r:id="rId99">
         <w:r>
           <w:rPr>
             <w:rStyle w:val="Hyperlink"/>
@@ -3210,14 +3275,14 @@
         </w:r>
       </w:hyperlink>
     </w:p>
-    <w:bookmarkEnd w:id="98"/>
-    <w:bookmarkStart w:id="100" w:name="ref-wong2019"/>
+    <w:bookmarkEnd w:id="100"/>
+    <w:bookmarkStart w:id="102" w:name="ref-wong2019"/>
     <w:p>
       <w:pPr>
         <w:pStyle w:val="Bibliography"/>
       </w:pPr>
       <w:r>
-        <w:t xml:space="preserve">28.</w:t>
+        <w:t xml:space="preserve">29.</w:t>
       </w:r>
       <w:r>
         <w:t xml:space="preserve"> </w:t>
@@ -3237,7 +3302,7 @@
       <w:r>
         <w:t xml:space="preserve">. JGH Open. 2019;3: 210–216. doi:</w:t>
       </w:r>
-      <w:hyperlink r:id="rId99">
+      <w:hyperlink r:id="rId101">
         <w:r>
           <w:rPr>
             <w:rStyle w:val="Hyperlink"/>
@@ -3246,14 +3311,14 @@
         </w:r>
       </w:hyperlink>
     </w:p>
-    <w:bookmarkEnd w:id="100"/>
-    <w:bookmarkStart w:id="102" w:name="ref-sgd_rate"/>
+    <w:bookmarkEnd w:id="102"/>
+    <w:bookmarkStart w:id="104" w:name="ref-sgd_rate"/>
     <w:p>
       <w:pPr>
         <w:pStyle w:val="Bibliography"/>
       </w:pPr>
       <w:r>
-        <w:t xml:space="preserve">29.</w:t>
+        <w:t xml:space="preserve">30.</w:t>
       </w:r>
       <w:r>
         <w:t xml:space="preserve"> </w:t>
@@ -3276,7 +3341,7 @@
       <w:r>
         <w:t xml:space="preserve"> </w:t>
       </w:r>
-      <w:hyperlink r:id="rId101">
+      <w:hyperlink r:id="rId103">
         <w:r>
           <w:rPr>
             <w:rStyle w:val="Hyperlink"/>
@@ -3285,14 +3350,14 @@
         </w:r>
       </w:hyperlink>
     </w:p>
-    <w:bookmarkEnd w:id="102"/>
-    <w:bookmarkStart w:id="104" w:name="ref-nhg_dsc"/>
+    <w:bookmarkEnd w:id="104"/>
+    <w:bookmarkStart w:id="106" w:name="ref-nhg_dsc"/>
     <w:p>
       <w:pPr>
         <w:pStyle w:val="Bibliography"/>
       </w:pPr>
       <w:r>
-        <w:t xml:space="preserve">30.</w:t>
+        <w:t xml:space="preserve">31.</w:t>
       </w:r>
       <w:r>
         <w:t xml:space="preserve"> </w:t>
@@ -3315,7 +3380,7 @@
       <w:r>
         <w:t xml:space="preserve"> </w:t>
       </w:r>
-      <w:hyperlink r:id="rId103">
+      <w:hyperlink r:id="rId105">
         <w:r>
           <w:rPr>
             <w:rStyle w:val="Hyperlink"/>
@@ -3324,14 +3389,14 @@
         </w:r>
       </w:hyperlink>
     </w:p>
-    <w:bookmarkEnd w:id="104"/>
-    <w:bookmarkStart w:id="106" w:name="ref-parkway_rna"/>
+    <w:bookmarkEnd w:id="106"/>
+    <w:bookmarkStart w:id="108" w:name="ref-parkway_rna"/>
     <w:p>
       <w:pPr>
         <w:pStyle w:val="Bibliography"/>
       </w:pPr>
       <w:r>
-        <w:t xml:space="preserve">31.</w:t>
+        <w:t xml:space="preserve">32.</w:t>
       </w:r>
       <w:r>
         <w:t xml:space="preserve"> </w:t>
@@ -3354,7 +3419,7 @@
       <w:r>
         <w:t xml:space="preserve"> </w:t>
       </w:r>
-      <w:hyperlink r:id="rId105">
+      <w:hyperlink r:id="rId107">
         <w:r>
           <w:rPr>
             <w:rStyle w:val="Hyperlink"/>
@@ -3363,14 +3428,14 @@
         </w:r>
       </w:hyperlink>
     </w:p>
-    <w:bookmarkEnd w:id="106"/>
-    <w:bookmarkStart w:id="108" w:name="ref-rcpp2011"/>
+    <w:bookmarkEnd w:id="108"/>
+    <w:bookmarkStart w:id="110" w:name="ref-rcpp2011"/>
     <w:p>
       <w:pPr>
         <w:pStyle w:val="Bibliography"/>
       </w:pPr>
       <w:r>
-        <w:t xml:space="preserve">32.</w:t>
+        <w:t xml:space="preserve">33.</w:t>
       </w:r>
       <w:r>
         <w:t xml:space="preserve"> </w:t>
@@ -3390,7 +3455,7 @@
       <w:r>
         <w:t xml:space="preserve">. Journal of Statistical Software. 2011;40: 1–18. doi:</w:t>
       </w:r>
-      <w:hyperlink r:id="rId107">
+      <w:hyperlink r:id="rId109">
         <w:r>
           <w:rPr>
             <w:rStyle w:val="Hyperlink"/>
@@ -3399,14 +3464,14 @@
         </w:r>
       </w:hyperlink>
     </w:p>
-    <w:bookmarkEnd w:id="108"/>
-    <w:bookmarkStart w:id="110" w:name="ref-hsiang2022"/>
+    <w:bookmarkEnd w:id="110"/>
+    <w:bookmarkStart w:id="112" w:name="ref-hsiang2022"/>
     <w:p>
       <w:pPr>
         <w:pStyle w:val="Bibliography"/>
       </w:pPr>
       <w:r>
-        <w:t xml:space="preserve">33.</w:t>
+        <w:t xml:space="preserve">34.</w:t>
       </w:r>
       <w:r>
         <w:t xml:space="preserve"> </w:t>
@@ -3426,7 +3491,7 @@
       <w:r>
         <w:t xml:space="preserve">. Singapore Medical Journal. 2022;63: 86–92. doi:</w:t>
       </w:r>
-      <w:hyperlink r:id="rId109">
+      <w:hyperlink r:id="rId111">
         <w:r>
           <w:rPr>
             <w:rStyle w:val="Hyperlink"/>
@@ -3435,14 +3500,14 @@
         </w:r>
       </w:hyperlink>
     </w:p>
-    <w:bookmarkEnd w:id="110"/>
-    <w:bookmarkStart w:id="112" w:name="ref-clink2022"/>
+    <w:bookmarkEnd w:id="112"/>
+    <w:bookmarkStart w:id="114" w:name="ref-clink2022"/>
     <w:p>
       <w:pPr>
         <w:pStyle w:val="Bibliography"/>
       </w:pPr>
       <w:r>
-        <w:t xml:space="preserve">34.</w:t>
+        <w:t xml:space="preserve">35.</w:t>
       </w:r>
       <w:r>
         <w:t xml:space="preserve"> </w:t>
@@ -3462,7 +3527,7 @@
       <w:r>
         <w:t xml:space="preserve">. Open Forum Infectious Diseases. 2022;9: ofac350. doi:</w:t>
       </w:r>
-      <w:hyperlink r:id="rId111">
+      <w:hyperlink r:id="rId113">
         <w:r>
           <w:rPr>
             <w:rStyle w:val="Hyperlink"/>
@@ -3471,14 +3536,14 @@
         </w:r>
       </w:hyperlink>
     </w:p>
-    <w:bookmarkEnd w:id="112"/>
-    <w:bookmarkStart w:id="114" w:name="ref-eckhardt2022"/>
+    <w:bookmarkEnd w:id="114"/>
+    <w:bookmarkStart w:id="116" w:name="ref-eckhardt2022"/>
     <w:p>
       <w:pPr>
         <w:pStyle w:val="Bibliography"/>
       </w:pPr>
       <w:r>
-        <w:t xml:space="preserve">35.</w:t>
+        <w:t xml:space="preserve">36.</w:t>
       </w:r>
       <w:r>
         <w:t xml:space="preserve"> </w:t>
@@ -3498,7 +3563,7 @@
       <w:r>
         <w:t xml:space="preserve">. JAMA Internal Medicine. 2022;182: 494–502. doi:</w:t>
       </w:r>
-      <w:hyperlink r:id="rId113">
+      <w:hyperlink r:id="rId115">
         <w:r>
           <w:rPr>
             <w:rStyle w:val="Hyperlink"/>
@@ -3507,9 +3572,9 @@
         </w:r>
       </w:hyperlink>
     </w:p>
-    <w:bookmarkEnd w:id="114"/>
-    <w:bookmarkEnd w:id="115"/>
     <w:bookmarkEnd w:id="116"/>
+    <w:bookmarkEnd w:id="117"/>
+    <w:bookmarkEnd w:id="118"/>
     <w:sectPr>
       <w:footnotePr>
         <w:numRestart w:val="eachSect"/>

</xml_diff>

<commit_message>
docs: rewrite manuscript, training guide and handoff for the three-target calibration
- build_paper.py: methods, results, SI Tables S5/S6 and limitations describe the
  13-parameter calibration and assert the new scenario claims; manuscript rebuilt.
- training.md: commands and results for every stage, including the MCMC SBC.
- claude.md: new current-state section; the previous one is marked superseded.

Co-Authored-By: Claude Opus 5.5 <noreply@anthropic.com>
</commit_message>
<xml_diff>
--- a/docs/main.docx
+++ b/docs/main.docx
@@ -111,7 +111,7 @@
         <w:pStyle w:val="FirstParagraph"/>
       </w:pPr>
       <w:r>
-        <w:t xml:space="preserve">We built an age structured HCV model with four groups: active PWID never imprisoned (D), people in prison (J), and released people who still inject (F) or have stopped (X). We calibrated it to age specific HCV seroprevalence in prison in 2015 with Bayesian methods. Entry into injecting was held at the official 2015 counts of new drug users in every year, and the first arrest rate was a calibrated multiple of the re-arrest rate. We assumed treatment in prison from 2019. From 2026 we compared 15 community screening scenarios of 600 to 8,000 tests a year, with 25%, 50% or 75% for F and the rest for X. Results are medians with 95% uncertainty intervals (UI) across 2,000 posterior draws. Without treatment, new infections in 2030 were 100.0% (95% UI: 100.0%–100.1%) of the 2015 level. With prison treatment alone, new infections fell by 84.5% (95% UI: 68.7%–90.5%) by 2030, meeting the incidence target in 77% of draws, but HCV deaths fell by only 54.9% (95% UI: 52.3%–57.5%). In 2026, 90% of chronic infections among released people were in X, and 96% of HCV deaths occurred in F and X. Every screening scenario met the incidence target. The mortality target was met at the median only at 5,000 or 8,000 tests a year with 25% or 50% to F. Three of these met both targets in at least 95% of draws; 5,000 tests a year with 50% to F did so in only 51%. At every capacity, giving more tests to X gave larger falls in deaths. The model covers only PWID, assumes ideal linkage to treatment and was not fitted to the size of the prison population.</w:t>
+        <w:t xml:space="preserve">We built an age structured HCV model with four groups: active PWID never imprisoned (D), people in prison (J), and released people who still inject (F) or have stopped (X). We calibrated it with Bayesian methods to age specific HCV seroprevalence in prison in 2015, the official 2015 counts of new drug users by age (taken as first arrests) and a published estimate of the number of people who inject drugs. Entry into injecting and the first arrest rate were calibrated and held at their 2015 values in every year. We assumed treatment in prison from 2019. From 2026 we compared 15 community screening scenarios of 600 to 8,000 tests a year, with 25%, 50% or 75% for F and the rest for X. Results are medians with 95% uncertainty intervals (UI) across 2,000 posterior draws. Without treatment, new infections in 2030 were 100.0% (95% UI: 100.0%–100.0%) of the 2015 level. With prison treatment alone, new infections fell by 84.4% (95% UI: 67.9%–90.4%) by 2030, meeting the incidence target in 78% of draws, but HCV deaths fell by only 54.0% (95% UI: 51.2%–56.6%). In 2026, 89% of chronic infections among released people were in X, and 97% of HCV deaths occurred in F and X. Every screening scenario met the incidence target. The mortality target was met at the median only at 5,000 tests a year with 25% to F and 8,000 with 25% or 50% to F. Only 8,000 tests a year with 25% to F met both targets in at least 95% of draws (100%); 8,000 with 50% did so in 94% and 5,000 with 25% in 80%. At every capacity, giving more tests to X gave larger falls in deaths. The model covers only PWID, assumes ideal linkage to treatment and was not fitted to the size of the prison population.</w:t>
       </w:r>
     </w:p>
     <w:bookmarkEnd w:id="10"/>
@@ -129,7 +129,7 @@
         <w:pStyle w:val="FirstParagraph"/>
       </w:pPr>
       <w:r>
-        <w:t xml:space="preserve">In this model, prison treatment alone cuts new HCV infections by more than four fifths by 2030 but cuts HCV deaths by only about half. Most remaining deaths occur among released people, and most chronic infection after release is in people who no longer inject. Community screening of about 5,000 tests a year or more, with most tests for released people who have stopped injecting, met both targets. That is eight times the planned capacity of the current programme.</w:t>
+        <w:t xml:space="preserve">In this model, prison treatment alone cuts new HCV infections by more than four fifths by 2030 but cuts HCV deaths by only about half. Most remaining deaths occur among released people, and most chronic infection after release is in people who no longer inject. Community screening met both targets at the median from 5,000 tests a year, with three quarters of tests for released people who have stopped injecting; it did so reliably only at 8,000 tests a year. That is eight to thirteen times the planned capacity of the current programme.</w:t>
       </w:r>
     </w:p>
     <w:bookmarkEnd w:id="11"/>
@@ -207,7 +207,7 @@
         </w:numPr>
       </w:pPr>
       <w:r>
-        <w:t xml:space="preserve">We built a model of hepatitis C transmission and liver disease among people with a history of injecting drugs in Singapore. We calibrated it to prison seroprevalence data and carried uncertainty in the calibrated parameters through to the results.</w:t>
+        <w:t xml:space="preserve">We built a model of hepatitis C transmission and liver disease among people with a history of injecting drugs in Singapore. We calibrated it to prison seroprevalence, counts of new drug users and an estimate of the number of people who inject drugs, and carried uncertainty in the calibrated parameters through to the results.</w:t>
       </w:r>
     </w:p>
     <w:p>
@@ -219,7 +219,7 @@
         </w:numPr>
       </w:pPr>
       <w:r>
-        <w:t xml:space="preserve">Prison treatment alone reduced new infections by 85% and hepatitis C deaths by 55% by 2030. It met the WHO target of 80% for infections but not the target of 65% for deaths.</w:t>
+        <w:t xml:space="preserve">Prison treatment alone reduced new infections by 84% and hepatitis C deaths by 54% by 2030. It met the WHO target of 80% for infections but not the target of 65% for deaths.</w:t>
       </w:r>
     </w:p>
     <w:p>
@@ -231,7 +231,7 @@
         </w:numPr>
       </w:pPr>
       <w:r>
-        <w:t xml:space="preserve">By 2026, nearly all HCV deaths occurred among released people, and nearly all of their chronic infections were in those who had stopped injecting. Community screening of 5,000 or 8,000 tests a year met both targets when at least half of the tests went to people who had stopped injecting.</w:t>
+        <w:t xml:space="preserve">By 2026, nearly all HCV deaths occurred among released people, and most of their chronic infections were in those who had stopped injecting. Community screening met both targets at the median with 5,000 tests a year when three quarters went to people who had stopped injecting, and with 8,000 tests a year when at least half did.</w:t>
       </w:r>
     </w:p>
     <w:bookmarkEnd w:id="14"/>
@@ -265,7 +265,7 @@
         </w:numPr>
       </w:pPr>
       <w:r>
-        <w:t xml:space="preserve">Reaching the mortality target needs community screening about eight times larger than current plans, aimed mainly at people who have stopped injecting.</w:t>
+        <w:t xml:space="preserve">Reaching the mortality target reliably needs community screening about thirteen times larger than current plans, aimed mainly at people who have stopped injecting.</w:t>
       </w:r>
     </w:p>
     <w:p>
@@ -277,7 +277,7 @@
         </w:numPr>
       </w:pPr>
       <w:r>
-        <w:t xml:space="preserve">These results come from a model with ideal links from testing to treatment, calibrated only to seroprevalence. Real programmes will need data on uptake, referral and cost before they set targets.</w:t>
+        <w:t xml:space="preserve">These results come from a model with ideal links from testing to treatment, calibrated to one year of data. Real programmes will need data on uptake, referral and cost before they set targets.</w:t>
       </w:r>
     </w:p>
     <w:bookmarkEnd w:id="15"/>
@@ -340,7 +340,7 @@
         <w:t xml:space="preserve">[5,6]</w:t>
       </w:r>
       <w:r>
-        <w:t xml:space="preserve">. An earlier study estimated that about 11,000 people in Singapore have ever injected drugs</w:t>
+        <w:t xml:space="preserve">. A network scale-up survey in 2017 estimated that about 11,000 people in Singapore inject drugs (95% CI 6,500 to 17,000)</w:t>
       </w:r>
       <w:r>
         <w:t xml:space="preserve"> </w:t>
@@ -570,7 +570,7 @@
         <w:t xml:space="preserve"> </w:t>
       </w:r>
       <w:r>
-        <w:t xml:space="preserve">of the re-arrest rate. S1 Text gives all equations, parameter values and sources.</w:t>
+        <w:t xml:space="preserve">of the re-arrest rate, and entry into injecting was a calibrated multiple of the official counts of new drug users. S1 Text gives all equations, parameter values and sources.</w:t>
       </w:r>
     </w:p>
     <w:bookmarkEnd w:id="19"/>
@@ -588,7 +588,25 @@
         <w:pStyle w:val="FirstParagraph"/>
       </w:pPr>
       <w:r>
-        <w:t xml:space="preserve">We fitted the model to 2015 HCV seroprevalence among people in prison in six age groups, from the Singapore Prison Service. Seroprevalence was the only target; the size of the prison population was not fitted. Each observed seroprevalence had a beta likelihood centred on the model value with a fixed precision of 100, so no sample sizes were used. We estimated seven parameters. Six scaled the contact rates by age. The seventh,</w:t>
+        <w:t xml:space="preserve">We fitted the model to three sets of 2015 data. The first was HCV seroprevalence among people in prison in six age groups, from the Singapore Prison Service, with a beta likelihood centred on the model value and a fixed precision of 100. The second was the official number of new drug users by age in 2015</w:t>
+      </w:r>
+      <w:r>
+        <w:t xml:space="preserve"> </w:t>
+      </w:r>
+      <w:r>
+        <w:t xml:space="preserve">[23]</w:t>
+      </w:r>
+      <w:r>
+        <w:t xml:space="preserve">, which we compared with the modelled number of first arrests from D, with a negative binomial likelihood (size 50). The third was the network scale-up estimate of 11,000 people who inject drugs in Singapore in 2017</w:t>
+      </w:r>
+      <w:r>
+        <w:t xml:space="preserve"> </w:t>
+      </w:r>
+      <w:r>
+        <w:t xml:space="preserve">[7]</w:t>
+      </w:r>
+      <w:r>
+        <w:t xml:space="preserve">, which we compared with the modelled number of active injectors outside prison (D and F), with a log normal likelihood whose standard deviation matched the published 95% interval. The size of the prison population was not fitted. We estimated 13 parameters. Six scaled the contact rates by age. Six scaled the entry into injecting by age, as multiples of at least 1 of the official counts of new drug users. The last,</w:t>
       </w:r>
       <w:r>
         <w:t xml:space="preserve"> </w:t>
@@ -599,16 +617,7 @@
         </m:r>
       </m:oMath>
       <w:r>
-        <w:t xml:space="preserve">, multiplied the re-arrest rate to give the first arrest rate, and was bounded below at 0.5. Entry into injecting was the official 2015 number of new drug users by age, without scaling</w:t>
-      </w:r>
-      <w:r>
-        <w:t xml:space="preserve"> </w:t>
-      </w:r>
-      <w:r>
-        <w:t xml:space="preserve">[23]</w:t>
-      </w:r>
-      <w:r>
-        <w:t xml:space="preserve">. Each model run started in model year 0 and ran for 150 years to reach equilibrium with these entry counts. The end of that period represents 2015. Entry was held at the 2015 counts from 2016 to 2030, so the projections show the effect of treatment and screening, not of changes in drug use.</w:t>
+        <w:t xml:space="preserve">, multiplied the re-arrest rate to give the first arrest rate, and was bounded below at 0.5. Each model run started in model year 0 and ran for 150 years to reach equilibrium. The end of that period represents 2015, and with constant entry and no treatment before 2019 it also stands for the 2017 survey year. Entry was held at its 2015 value from 2016 to 2030, so the projections show the effect of treatment and screening, not of changes in drug use.</w:t>
       </w:r>
     </w:p>
     <w:p>
@@ -616,7 +625,7 @@
         <w:pStyle w:val="BodyText"/>
       </w:pPr>
       <w:r>
-        <w:t xml:space="preserve">The prior did not depend on the data. Each log contact scale had a normal prior with mean 0 and standard deviation 1.5. The log of</w:t>
+        <w:t xml:space="preserve">The prior did not depend on the data. Each log contact scale had a normal prior with mean 0 and standard deviation 1.5. Each log entry scale had a half normal prior with standard deviation 1, so entry was at least the official count. The log of</w:t>
       </w:r>
       <w:r>
         <w:t xml:space="preserve"> </w:t>
@@ -630,7 +639,7 @@
         <w:t xml:space="preserve"> </w:t>
       </w:r>
       <w:r>
-        <w:t xml:space="preserve">had a normal prior with mean 0 and standard deviation 0.5, centred on equal first and re-arrest rates and truncated at the bounds. A multi start Nelder Mead search found the posterior mode. Parameter sets that did not reach equilibrium were excluded. We sampled the posterior with an adaptive random walk Metropolis algorithm</w:t>
+        <w:t xml:space="preserve">had a normal prior with mean 0 and standard deviation 0.5, centred on equal first and re-arrest rates. All priors were truncated at the bounds. A multi start Nelder Mead search found the posterior mode. Parameter sets that did not reach equilibrium were excluded. We sampled the posterior with an adaptive random walk Metropolis algorithm</w:t>
       </w:r>
       <w:r>
         <w:t xml:space="preserve"> </w:t>
@@ -639,7 +648,7 @@
         <w:t xml:space="preserve">[24]</w:t>
       </w:r>
       <w:r>
-        <w:t xml:space="preserve">. We ran four chains from independent prior draws, with 50,000 model runs each. All parameters reached rank normalised R-hat below 1.01</w:t>
+        <w:t xml:space="preserve">. We ran eight chains from independent prior draws, with 60,000 model runs each. All parameters reached rank normalised R-hat below 1.01</w:t>
       </w:r>
       <w:r>
         <w:t xml:space="preserve"> </w:t>
@@ -802,7 +811,7 @@
         <w:pStyle w:val="FirstParagraph"/>
       </w:pPr>
       <w:r>
-        <w:t xml:space="preserve">The model reproduced the age specific seroprevalence targets; the best fit was within 2.3 percentage points of every target, and all six 95% posterior intervals overlapped the target intervals (S1 Text, Section 2). The first arrest multiplier was 1.24 (95% interval 0.57 to 3.13). Its posterior was close to its prior (posterior standard deviation 87% of the prior’s), so seroprevalence says little about how fast people are first arrested. Because the population size was not fitted, the modelled prison population in 2015 was 8,451 (8,283–8,520), compared with 3,367 people with a known screening result in prison records. In 2015, the model estimated 50,218 (95% interval: 49,496–50,893) people with a history of injecting drugs. Of these, 2,178 (839–4,651) were in D, 5,857 (5,664–5,947) in F and 33,713 (31,476–35,073) in X.</w:t>
+        <w:t xml:space="preserve">The model reproduced the age specific seroprevalence targets; the best fit was within 2.3 percentage points of every target. All 13 95% posterior predictive intervals overlapped the target intervals (S1 Text, Section 2). Modelled first arrests matched the counts of new drug users at ages under 30 but were higher at older ages, because people who start injecting young age before their first arrest and entry could not fall below the official counts. The model had 7,957 (95% interval: 7,062–9,298) active injectors outside prison in 2015, below the survey estimate of 11,000 but within its interval. The first arrest multiplier was 2.78 (95% interval 1.55 to 5.49), well above its prior median of about 1.05, but its posterior was only modestly narrower than its prior (standard deviation 75% of the prior’s). Entry was close to the official counts: the median scale was 1.09 to 1.15 below age 60. Because the prison population size was not fitted, the modelled prison population in 2015 was 9,741 (8,889–11,104), compared with 3,367 people with a known screening result in prison records. In 2015, the model estimated 57,742 (95% interval: 52,350–66,850) people with a history of injecting drugs. Of these, 1,130 (577–2,004) were in D, 6,802 (6,189–7,827) in F and 40,035 (36,123–46,690) in X.</w:t>
       </w:r>
     </w:p>
     <w:bookmarkEnd w:id="25"/>
@@ -820,7 +829,7 @@
         <w:pStyle w:val="FirstParagraph"/>
       </w:pPr>
       <w:r>
-        <w:t xml:space="preserve">Without any treatment, new infections in 2030 were 100.0% (95% UI: 100.0%–100.1%) of the 2015 level and HCV deaths 100.1% (95% UI: 100.0%–100.4%) (Fig 2).</w:t>
+        <w:t xml:space="preserve">Without any treatment, new infections in 2030 were 100.0% (95% UI: 100.0%–100.0%) of the 2015 level and HCV deaths 100.1% (95% UI: 100.0%–100.3%) (Fig 2).</w:t>
       </w:r>
     </w:p>
     <w:p>
@@ -828,7 +837,7 @@
         <w:pStyle w:val="BodyText"/>
       </w:pPr>
       <w:r>
-        <w:t xml:space="preserve">Prison treatment from 2019 changed the course of new infections. By 2025 they were 33.4% (95% UI: 25.9%–48.0%) of the 2015 level. By 2030 they had fallen by 84.5% (95% UI: 68.7%–90.5%), which met the 80% target at the median and in 77% of draws. Deaths fell more slowly. By 2025 they were 58.7% (95% UI: 56.2%–61.1%) of the 2015 level. By 2030 the reduction was 54.9% (95% UI: 52.3%–57.5%), well short of the 65% target.</w:t>
+        <w:t xml:space="preserve">Prison treatment from 2019 changed the course of new infections. By 2025 they were 33.7% (95% UI: 26.1%–48.6%) of the 2015 level. By 2030 they had fallen by 84.4% (95% UI: 67.9%–90.4%), which met the 80% target at the median and in 78% of draws. Deaths fell more slowly. By 2025 they were 59.6% (95% UI: 57.2%–62.2%) of the 2015 level. By 2030 the reduction was 54.0% (95% UI: 51.2%–56.6%), well short of the 65% target.</w:t>
       </w:r>
     </w:p>
     <w:p>
@@ -836,7 +845,7 @@
         <w:pStyle w:val="BodyText"/>
       </w:pPr>
       <w:r>
-        <w:t xml:space="preserve">The reason lies in where infection and disease sit after release. In 2026, F held 350 (95% UI: 286–451) people with chronic infection. X held 3,098 (95% UI: 2,582–3,664). X thus held 90% of chronic infections among released people. In the J only scenario, 96% of HCV deaths in 2026 occurred in F and X. By 2030 this share was 96%. People in X do not inject and do not transmit. Prison treatment does not reach them after release.</w:t>
+        <w:t xml:space="preserve">The reason lies in where infection and disease sit after release. In 2026, F held 457 (95% UI: 360–593) people with chronic infection. X held 3,719 (95% UI: 3,019–4,690). X thus held 89% of chronic infections among released people. In the J only scenario, 97% of HCV deaths in 2026 occurred in F and X. By 2030 this share was 97%. People in X do not inject and do not transmit. Prison treatment does not reach them after release.</w:t>
       </w:r>
     </w:p>
     <w:bookmarkEnd w:id="26"/>
@@ -854,7 +863,7 @@
         <w:pStyle w:val="FirstParagraph"/>
       </w:pPr>
       <w:r>
-        <w:t xml:space="preserve">Adding community screening increased both reductions (Table 1). Every scenario met the incidence target at the median, including 600 tests a year (85.6% (95% UI: 70.1%–91.3%) with 25% to F; target met in 82% of draws). Screening everyone eligible in F and X every year gave 99.0% (95% UI: 85.8%–100.0%). In that ideal reference, 24% of the remaining new infections in 2030 occurred in D, among people who inject but have never been imprisoned.</w:t>
+        <w:t xml:space="preserve">Adding community screening increased both reductions (Table 1). Every scenario met the incidence target at the median, including 600 tests a year (85.6% (95% UI: 70.0%–91.2%) with 25% to F; target met in 83% of draws). Screening everyone eligible in F and X every year gave 99.9% (95% UI: 99.5%–100.0%). In that ideal reference, 12% of the remaining new infections in 2030 occurred in D, among people who inject but have never been imprisoned.</w:t>
       </w:r>
     </w:p>
     <w:p>
@@ -862,7 +871,7 @@
         <w:pStyle w:val="BodyText"/>
       </w:pPr>
       <w:r>
-        <w:t xml:space="preserve">The mortality target was met at the median in 4 of 15 scenarios: 5,000 or 8,000 tests a year with 25% or 50% to F. Three of them met both targets in at least 95% of draws: 5,000 tests a year with 25% to F (95%), 8,000 with 25% (98%) and 8,000 with 50% (99%). At 5,000 tests a year with 50% to F the median reduction was 65.1% (95% UI: 62.8%–67.3%), just above the target, and both targets were met in only 51% of draws. With 75% to F the target was missed at both capacities (61.0% and 63.7%). Screening everyone eligible in F and X every year reduced mortality by 87.1% (95% UI: 85.8%–88.0%). At 600 tests a year, the planned size of the current community programme, the mortality reduction was at most 56.8%, a gain of under 5 percentage points over prison treatment alone.</w:t>
+        <w:t xml:space="preserve">The mortality target was met at the median in 3 of 15 scenarios: 5,000 tests a year with 25% to F and 8,000 with 25% or 50% to F. Only 8,000 tests a year with 25% to F met both targets in at least 95% of draws (100%). With 50% to F at that capacity both were met in 94% of draws, and at 5,000 tests a year with 25% to F (66.2% (95% UI: 63.4%–68.7%)) in 80%. At 5,000 tests a year with 50% to F the median reduction was 63.2% (95% UI: 60.3%–65.8%), below the target, and both targets were met in only 9% of draws. With 75% to F the target was missed at both capacities (59.6% and 62.0%). Screening everyone eligible in F and X every year reduced mortality by 87.9% (95% UI: 86.9%–88.8%). At 600 tests a year, the planned size of the current community programme, the mortality reduction was at most 55.7%, a gain of under 5 percentage points over prison treatment alone.</w:t>
       </w:r>
     </w:p>
     <w:bookmarkEnd w:id="27"/>
@@ -888,7 +897,7 @@
         <w:pStyle w:val="BodyText"/>
       </w:pPr>
       <w:r>
-        <w:t xml:space="preserve">The two groups differ in where chronic infection is. In 2026 about 6,000 people in F were eligible for screening, of whom 6% had chronic infection. In X, 9% of those eligible did. A test given to X therefore found more people to treat. At 8,000 tests a year, the mortality reduction fell from 73.9% (95% UI: 72.2%–75.5%) with 25% to F to 63.7% (95% UI: 61.2%–66.2%) with 75% to F, while the incidence reduction rose from 94.9% to 99.0%. With 75% to F at this capacity, 100% of the F quota was used. At 2,000 tests a year, moving from 25% to 75% for F raised the incidence reduction from 88.0% to 93.1% and lowered the mortality reduction from 61.0% to 57.8%. Because every scenario already met the incidence target, the mortality target is the binding one, and it favours X: at 5,000 and 8,000 tests a year, only the splits with 25% or 50% to F met it.</w:t>
+        <w:t xml:space="preserve">The two groups differ in where chronic infection is. In 2026 about 6,990 people in F were eligible for screening, of whom 7% had chronic infection. In X, 9% of those eligible did. A test given to X therefore found more people to treat. At 8,000 tests a year, the mortality reduction fell from 71.6% (95% UI: 68.6%–74.0%) with 25% to F to 62.0% (95% UI: 59.0%–64.8%) with 75% to F, while the incidence reduction rose from 95.3% to 99.8%. The F quota was used in full in every scenario, so the difference comes from what each test finds, not from unused tests. At 2,000 tests a year, moving from 25% to 75% for F raised the incidence reduction from 88.0% to 93.4% and lowered the mortality reduction from 59.4% to 56.6%. Because every scenario already met the incidence target, the mortality target is the binding one, and it favours X: at 5,000 and 8,000 tests a year, only the splits with 25% or 50% to F met it.</w:t>
       </w:r>
     </w:p>
     <w:bookmarkEnd w:id="28"/>
@@ -906,7 +915,7 @@
         <w:pStyle w:val="FirstParagraph"/>
       </w:pPr>
       <w:r>
-        <w:t xml:space="preserve">Treatment starts in F and X over 2026 to 2030 ranged from 146 (95% UI: 122–181) at 600 tests a year with 75% to F, to 2,058 (95% UI: 1,727–2,433) at 8,000 tests a year with 25% to F (Table 1). Starts were highest in 2026 and fell each year as the stock of chronic infection was treated. The cheapest scenario that met both targets in at least 95% of draws, 5,000 tests a year with 25% to F, cost S$81.0 million (95% UI: S$67.1 million–S$99.3 million) over five years; drugs made up 95% of it. Compared with prison treatment alone, each extra percentage point of mortality reduction cost about S$3.7 million in that scenario. Single round neural posterior estimation gave median reductions within 0.3% of the MCMC results (S1 Text, Table S4).</w:t>
+        <w:t xml:space="preserve">Treatment starts in F and X over 2026 to 2030 ranged from 157 (95% UI: 128–200) at 600 tests a year with 75% to F, to 2,196 (95% UI: 1,823–2,653) at 8,000 tests a year with 25% to F (Table 1). Starts were highest in 2026 and fell each year as the stock of chronic infection was treated. The cheapest scenario that met both targets at the median, 5,000 tests a year with 25% to F, cost S$86.2 million (95% UI: S$70.9 million–S$106.4 million) over five years; drugs made up 95% of it. The only scenario that met both targets in at least 95% of draws, 8,000 tests a year with 25% to F, cost S$109.4 million (95% UI: S$90.9 million–S$133.0 million). Compared with prison treatment alone, each extra percentage point of mortality reduction cost about S$4.2 million at 5,000 tests a year and S$4.3 million at 8,000. Single round neural posterior estimation gave median reductions within 5.4% of the MCMC results (S1 Text, Table S4).</w:t>
       </w:r>
     </w:p>
     <w:p>
@@ -1026,18 +1035,18 @@
               <w:pStyle w:val="Compact"/>
             </w:pPr>
             <w:r>
-              <w:t xml:space="preserve">84.5% (95% UI: 68.7%–90.5%)</w:t>
-            </w:r>
-          </w:p>
-        </w:tc>
-        <w:tc>
-          <w:tcPr/>
-          <w:p>
-            <w:pPr>
-              <w:pStyle w:val="Compact"/>
-            </w:pPr>
-            <w:r>
-              <w:t xml:space="preserve">54.9% (95% UI: 52.3%–57.5%)</w:t>
+              <w:t xml:space="preserve">84.4% (95% UI: 67.9%–90.4%)</w:t>
+            </w:r>
+          </w:p>
+        </w:tc>
+        <w:tc>
+          <w:tcPr/>
+          <w:p>
+            <w:pPr>
+              <w:pStyle w:val="Compact"/>
+            </w:pPr>
+            <w:r>
+              <w:t xml:space="preserve">54.0% (95% UI: 51.2%–56.6%)</w:t>
             </w:r>
           </w:p>
         </w:tc>
@@ -1070,7 +1079,7 @@
               <w:pStyle w:val="Compact"/>
             </w:pPr>
             <w:r>
-              <w:t xml:space="preserve">30.3 (95% UI: 22.9–44.7)</w:t>
+              <w:t xml:space="preserve">34.3 (95% UI: 25.5–48.9)</w:t>
             </w:r>
           </w:p>
         </w:tc>
@@ -1094,18 +1103,18 @@
               <w:pStyle w:val="Compact"/>
             </w:pPr>
             <w:r>
-              <w:t xml:space="preserve">86.7% (95% UI: 71.4%–92.0%)</w:t>
-            </w:r>
-          </w:p>
-        </w:tc>
-        <w:tc>
-          <w:tcPr/>
-          <w:p>
-            <w:pPr>
-              <w:pStyle w:val="Compact"/>
-            </w:pPr>
-            <w:r>
-              <w:t xml:space="preserve">56.4% (95% UI: 53.8%–58.9%)</w:t>
+              <w:t xml:space="preserve">86.7% (95% UI: 71.9%–91.9%)</w:t>
+            </w:r>
+          </w:p>
+        </w:tc>
+        <w:tc>
+          <w:tcPr/>
+          <w:p>
+            <w:pPr>
+              <w:pStyle w:val="Compact"/>
+            </w:pPr>
+            <w:r>
+              <w:t xml:space="preserve">55.3% (95% UI: 52.5%–57.9%)</w:t>
             </w:r>
           </w:p>
         </w:tc>
@@ -1127,18 +1136,18 @@
               <w:pStyle w:val="Compact"/>
             </w:pPr>
             <w:r>
-              <w:t xml:space="preserve">178 (95% UI: 150–214)</w:t>
-            </w:r>
-          </w:p>
-        </w:tc>
-        <w:tc>
-          <w:tcPr/>
-          <w:p>
-            <w:pPr>
-              <w:pStyle w:val="Compact"/>
-            </w:pPr>
-            <w:r>
-              <w:t xml:space="preserve">35.3 (95% UI: 27.5–50.2)</w:t>
+              <w:t xml:space="preserve">187 (95% UI: 154–226)</w:t>
+            </w:r>
+          </w:p>
+        </w:tc>
+        <w:tc>
+          <w:tcPr/>
+          <w:p>
+            <w:pPr>
+              <w:pStyle w:val="Compact"/>
+            </w:pPr>
+            <w:r>
+              <w:t xml:space="preserve">39.4 (95% UI: 30.1–54.4)</w:t>
             </w:r>
           </w:p>
         </w:tc>
@@ -1162,18 +1171,18 @@
               <w:pStyle w:val="Compact"/>
             </w:pPr>
             <w:r>
-              <w:t xml:space="preserve">88.0% (95% UI: 72.9%–93.0%)</w:t>
-            </w:r>
-          </w:p>
-        </w:tc>
-        <w:tc>
-          <w:tcPr/>
-          <w:p>
-            <w:pPr>
-              <w:pStyle w:val="Compact"/>
-            </w:pPr>
-            <w:r>
-              <w:t xml:space="preserve">61.0% (95% UI: 58.6%–63.3%)</w:t>
+              <w:t xml:space="preserve">88.0% (95% UI: 74.3%–92.8%)</w:t>
+            </w:r>
+          </w:p>
+        </w:tc>
+        <w:tc>
+          <w:tcPr/>
+          <w:p>
+            <w:pPr>
+              <w:pStyle w:val="Compact"/>
+            </w:pPr>
+            <w:r>
+              <w:t xml:space="preserve">59.4% (95% UI: 56.7%–61.9%)</w:t>
             </w:r>
           </w:p>
         </w:tc>
@@ -1195,18 +1204,18 @@
               <w:pStyle w:val="Compact"/>
             </w:pPr>
             <w:r>
-              <w:t xml:space="preserve">655 (95% UI: 547–776)</w:t>
-            </w:r>
-          </w:p>
-        </w:tc>
-        <w:tc>
-          <w:tcPr/>
-          <w:p>
-            <w:pPr>
-              <w:pStyle w:val="Compact"/>
-            </w:pPr>
-            <w:r>
-              <w:t xml:space="preserve">53.2 (95% UI: 43.0–68.6)</w:t>
+              <w:t xml:space="preserve">675 (95% UI: 560–813)</w:t>
+            </w:r>
+          </w:p>
+        </w:tc>
+        <w:tc>
+          <w:tcPr/>
+          <w:p>
+            <w:pPr>
+              <w:pStyle w:val="Compact"/>
+            </w:pPr>
+            <w:r>
+              <w:t xml:space="preserve">57.3 (95% UI: 46.2–74.1)</w:t>
             </w:r>
           </w:p>
         </w:tc>
@@ -1230,18 +1239,18 @@
               <w:pStyle w:val="Compact"/>
             </w:pPr>
             <w:r>
-              <w:t xml:space="preserve">93.1% (95% UI: 78.4%–96.5%)</w:t>
-            </w:r>
-          </w:p>
-        </w:tc>
-        <w:tc>
-          <w:tcPr/>
-          <w:p>
-            <w:pPr>
-              <w:pStyle w:val="Compact"/>
-            </w:pPr>
-            <w:r>
-              <w:t xml:space="preserve">57.8% (95% UI: 55.1%–60.4%)</w:t>
+              <w:t xml:space="preserve">93.4% (95% UI: 84.4%–96.2%)</w:t>
+            </w:r>
+          </w:p>
+        </w:tc>
+        <w:tc>
+          <w:tcPr/>
+          <w:p>
+            <w:pPr>
+              <w:pStyle w:val="Compact"/>
+            </w:pPr>
+            <w:r>
+              <w:t xml:space="preserve">56.6% (95% UI: 53.7%–59.3%)</w:t>
             </w:r>
           </w:p>
         </w:tc>
@@ -1263,18 +1272,18 @@
               <w:pStyle w:val="Compact"/>
             </w:pPr>
             <w:r>
-              <w:t xml:space="preserve">428 (95% UI: 358–525)</w:t>
-            </w:r>
-          </w:p>
-        </w:tc>
-        <w:tc>
-          <w:tcPr/>
-          <w:p>
-            <w:pPr>
-              <w:pStyle w:val="Compact"/>
-            </w:pPr>
-            <w:r>
-              <w:t xml:space="preserve">38.7 (95% UI: 30.6–54.6)</w:t>
+              <w:t xml:space="preserve">465 (95% UI: 379–585)</w:t>
+            </w:r>
+          </w:p>
+        </w:tc>
+        <w:tc>
+          <w:tcPr/>
+          <w:p>
+            <w:pPr>
+              <w:pStyle w:val="Compact"/>
+            </w:pPr>
+            <w:r>
+              <w:t xml:space="preserve">42.6 (95% UI: 33.4–57.4)</w:t>
             </w:r>
           </w:p>
         </w:tc>
@@ -1298,51 +1307,51 @@
               <w:pStyle w:val="Compact"/>
             </w:pPr>
             <w:r>
-              <w:t xml:space="preserve">92.0% (95% UI: 77.4%–95.8%)</w:t>
-            </w:r>
-          </w:p>
-        </w:tc>
-        <w:tc>
-          <w:tcPr/>
-          <w:p>
-            <w:pPr>
-              <w:pStyle w:val="Compact"/>
-            </w:pPr>
-            <w:r>
-              <w:t xml:space="preserve">68.4% (95% UI: 66.3%–70.2%)</w:t>
-            </w:r>
-          </w:p>
-        </w:tc>
-        <w:tc>
-          <w:tcPr/>
-          <w:p>
-            <w:pPr>
-              <w:pStyle w:val="Compact"/>
-            </w:pPr>
-            <w:r>
-              <w:t xml:space="preserve">100%</w:t>
-            </w:r>
-          </w:p>
-        </w:tc>
-        <w:tc>
-          <w:tcPr/>
-          <w:p>
-            <w:pPr>
-              <w:pStyle w:val="Compact"/>
-            </w:pPr>
-            <w:r>
-              <w:t xml:space="preserve">1,450 (95% UI: 1,214–1,716)</w:t>
-            </w:r>
-          </w:p>
-        </w:tc>
-        <w:tc>
-          <w:tcPr/>
-          <w:p>
-            <w:pPr>
-              <w:pStyle w:val="Compact"/>
-            </w:pPr>
-            <w:r>
-              <w:t xml:space="preserve">81.0 (95% UI: 67.1–99.3)</w:t>
+              <w:t xml:space="preserve">92.3% (95% UI: 82.0%–95.5%)</w:t>
+            </w:r>
+          </w:p>
+        </w:tc>
+        <w:tc>
+          <w:tcPr/>
+          <w:p>
+            <w:pPr>
+              <w:pStyle w:val="Compact"/>
+            </w:pPr>
+            <w:r>
+              <w:t xml:space="preserve">66.2% (95% UI: 63.4%–68.7%)</w:t>
+            </w:r>
+          </w:p>
+        </w:tc>
+        <w:tc>
+          <w:tcPr/>
+          <w:p>
+            <w:pPr>
+              <w:pStyle w:val="Compact"/>
+            </w:pPr>
+            <w:r>
+              <w:t xml:space="preserve">82%</w:t>
+            </w:r>
+          </w:p>
+        </w:tc>
+        <w:tc>
+          <w:tcPr/>
+          <w:p>
+            <w:pPr>
+              <w:pStyle w:val="Compact"/>
+            </w:pPr>
+            <w:r>
+              <w:t xml:space="preserve">1,521 (95% UI: 1,260–1,833)</w:t>
+            </w:r>
+          </w:p>
+        </w:tc>
+        <w:tc>
+          <w:tcPr/>
+          <w:p>
+            <w:pPr>
+              <w:pStyle w:val="Compact"/>
+            </w:pPr>
+            <w:r>
+              <w:t xml:space="preserve">86.2 (95% UI: 70.9–106.4)</w:t>
             </w:r>
           </w:p>
         </w:tc>
@@ -1366,51 +1375,51 @@
               <w:pStyle w:val="Compact"/>
             </w:pPr>
             <w:r>
-              <w:t xml:space="preserve">96.1% (95% UI: 81.5%–98.4%)</w:t>
-            </w:r>
-          </w:p>
-        </w:tc>
-        <w:tc>
-          <w:tcPr/>
-          <w:p>
-            <w:pPr>
-              <w:pStyle w:val="Compact"/>
-            </w:pPr>
-            <w:r>
-              <w:t xml:space="preserve">65.1% (95% UI: 62.8%–67.3%)</w:t>
-            </w:r>
-          </w:p>
-        </w:tc>
-        <w:tc>
-          <w:tcPr/>
-          <w:p>
-            <w:pPr>
-              <w:pStyle w:val="Compact"/>
-            </w:pPr>
-            <w:r>
-              <w:t xml:space="preserve">52%</w:t>
-            </w:r>
-          </w:p>
-        </w:tc>
-        <w:tc>
-          <w:tcPr/>
-          <w:p>
-            <w:pPr>
-              <w:pStyle w:val="Compact"/>
-            </w:pPr>
-            <w:r>
-              <w:t xml:space="preserve">1,203 (95% UI: 1,014–1,428)</w:t>
-            </w:r>
-          </w:p>
-        </w:tc>
-        <w:tc>
-          <w:tcPr/>
-          <w:p>
-            <w:pPr>
-              <w:pStyle w:val="Compact"/>
-            </w:pPr>
-            <w:r>
-              <w:t xml:space="preserve">66.4 (95% UI: 54.6–84.2)</w:t>
+              <w:t xml:space="preserve">96.7% (95% UI: 91.3%–98.2%)</w:t>
+            </w:r>
+          </w:p>
+        </w:tc>
+        <w:tc>
+          <w:tcPr/>
+          <w:p>
+            <w:pPr>
+              <w:pStyle w:val="Compact"/>
+            </w:pPr>
+            <w:r>
+              <w:t xml:space="preserve">63.2% (95% UI: 60.3%–65.8%)</w:t>
+            </w:r>
+          </w:p>
+        </w:tc>
+        <w:tc>
+          <w:tcPr/>
+          <w:p>
+            <w:pPr>
+              <w:pStyle w:val="Compact"/>
+            </w:pPr>
+            <w:r>
+              <w:t xml:space="preserve">10%</w:t>
+            </w:r>
+          </w:p>
+        </w:tc>
+        <w:tc>
+          <w:tcPr/>
+          <w:p>
+            <w:pPr>
+              <w:pStyle w:val="Compact"/>
+            </w:pPr>
+            <w:r>
+              <w:t xml:space="preserve">1,278 (95% UI: 1,058–1,538)</w:t>
+            </w:r>
+          </w:p>
+        </w:tc>
+        <w:tc>
+          <w:tcPr/>
+          <w:p>
+            <w:pPr>
+              <w:pStyle w:val="Compact"/>
+            </w:pPr>
+            <w:r>
+              <w:t xml:space="preserve">70.3 (95% UI: 57.7–87.5)</w:t>
             </w:r>
           </w:p>
         </w:tc>
@@ -1434,18 +1443,18 @@
               <w:pStyle w:val="Compact"/>
             </w:pPr>
             <w:r>
-              <w:t xml:space="preserve">98.1% (95% UI: 83.8%–99.5%)</w:t>
-            </w:r>
-          </w:p>
-        </w:tc>
-        <w:tc>
-          <w:tcPr/>
-          <w:p>
-            <w:pPr>
-              <w:pStyle w:val="Compact"/>
-            </w:pPr>
-            <w:r>
-              <w:t xml:space="preserve">61.0% (95% UI: 58.4%–63.6%)</w:t>
+              <w:t xml:space="preserve">98.8% (95% UI: 96.1%–99.4%)</w:t>
+            </w:r>
+          </w:p>
+        </w:tc>
+        <w:tc>
+          <w:tcPr/>
+          <w:p>
+            <w:pPr>
+              <w:pStyle w:val="Compact"/>
+            </w:pPr>
+            <w:r>
+              <w:t xml:space="preserve">59.6% (95% UI: 56.6%–62.4%)</w:t>
             </w:r>
           </w:p>
         </w:tc>
@@ -1467,18 +1476,18 @@
               <w:pStyle w:val="Compact"/>
             </w:pPr>
             <w:r>
-              <w:t xml:space="preserve">854 (95% UI: 717–1,027)</w:t>
-            </w:r>
-          </w:p>
-        </w:tc>
-        <w:tc>
-          <w:tcPr/>
-          <w:p>
-            <w:pPr>
-              <w:pStyle w:val="Compact"/>
-            </w:pPr>
-            <w:r>
-              <w:t xml:space="preserve">49.2 (95% UI: 40.0–66.6)</w:t>
+              <w:t xml:space="preserve">926 (95% UI: 763–1,142)</w:t>
+            </w:r>
+          </w:p>
+        </w:tc>
+        <w:tc>
+          <w:tcPr/>
+          <w:p>
+            <w:pPr>
+              <w:pStyle w:val="Compact"/>
+            </w:pPr>
+            <w:r>
+              <w:t xml:space="preserve">52.4 (95% UI: 42.7–66.7)</w:t>
             </w:r>
           </w:p>
         </w:tc>
@@ -1502,18 +1511,18 @@
               <w:pStyle w:val="Compact"/>
             </w:pPr>
             <w:r>
-              <w:t xml:space="preserve">94.9% (95% UI: 80.1%–97.6%)</w:t>
-            </w:r>
-          </w:p>
-        </w:tc>
-        <w:tc>
-          <w:tcPr/>
-          <w:p>
-            <w:pPr>
-              <w:pStyle w:val="Compact"/>
-            </w:pPr>
-            <w:r>
-              <w:t xml:space="preserve">73.9% (95% UI: 72.2%–75.5%)</w:t>
+              <w:t xml:space="preserve">95.3% (95% UI: 88.2%–97.3%)</w:t>
+            </w:r>
+          </w:p>
+        </w:tc>
+        <w:tc>
+          <w:tcPr/>
+          <w:p>
+            <w:pPr>
+              <w:pStyle w:val="Compact"/>
+            </w:pPr>
+            <w:r>
+              <w:t xml:space="preserve">71.6% (95% UI: 68.6%–74.0%)</w:t>
             </w:r>
           </w:p>
         </w:tc>
@@ -1535,18 +1544,18 @@
               <w:pStyle w:val="Compact"/>
             </w:pPr>
             <w:r>
-              <w:t xml:space="preserve">2,058 (95% UI: 1,727–2,433)</w:t>
-            </w:r>
-          </w:p>
-        </w:tc>
-        <w:tc>
-          <w:tcPr/>
-          <w:p>
-            <w:pPr>
-              <w:pStyle w:val="Compact"/>
-            </w:pPr>
-            <w:r>
-              <w:t xml:space="preserve">102.7 (95% UI: 86.0–123.4)</w:t>
+              <w:t xml:space="preserve">2,196 (95% UI: 1,823–2,653)</w:t>
+            </w:r>
+          </w:p>
+        </w:tc>
+        <w:tc>
+          <w:tcPr/>
+          <w:p>
+            <w:pPr>
+              <w:pStyle w:val="Compact"/>
+            </w:pPr>
+            <w:r>
+              <w:t xml:space="preserve">109.4 (95% UI: 90.9–133.0)</w:t>
             </w:r>
           </w:p>
         </w:tc>
@@ -1570,51 +1579,51 @@
               <w:pStyle w:val="Compact"/>
             </w:pPr>
             <w:r>
-              <w:t xml:space="preserve">98.3% (95% UI: 84.1%–99.6%)</w:t>
-            </w:r>
-          </w:p>
-        </w:tc>
-        <w:tc>
-          <w:tcPr/>
-          <w:p>
-            <w:pPr>
-              <w:pStyle w:val="Compact"/>
-            </w:pPr>
-            <w:r>
-              <w:t xml:space="preserve">69.6% (95% UI: 67.5%–71.6%)</w:t>
-            </w:r>
-          </w:p>
-        </w:tc>
-        <w:tc>
-          <w:tcPr/>
-          <w:p>
-            <w:pPr>
-              <w:pStyle w:val="Compact"/>
-            </w:pPr>
-            <w:r>
-              <w:t xml:space="preserve">100%</w:t>
-            </w:r>
-          </w:p>
-        </w:tc>
-        <w:tc>
-          <w:tcPr/>
-          <w:p>
-            <w:pPr>
-              <w:pStyle w:val="Compact"/>
-            </w:pPr>
-            <w:r>
-              <w:t xml:space="preserve">1,699 (95% UI: 1,435–2,011)</w:t>
-            </w:r>
-          </w:p>
-        </w:tc>
-        <w:tc>
-          <w:tcPr/>
-          <w:p>
-            <w:pPr>
-              <w:pStyle w:val="Compact"/>
-            </w:pPr>
-            <w:r>
-              <w:t xml:space="preserve">83.0 (95% UI: 68.9–102.7)</w:t>
+              <w:t xml:space="preserve">99.0% (95% UI: 96.8%–99.6%)</w:t>
+            </w:r>
+          </w:p>
+        </w:tc>
+        <w:tc>
+          <w:tcPr/>
+          <w:p>
+            <w:pPr>
+              <w:pStyle w:val="Compact"/>
+            </w:pPr>
+            <w:r>
+              <w:t xml:space="preserve">67.4% (95% UI: 64.4%–70.0%)</w:t>
+            </w:r>
+          </w:p>
+        </w:tc>
+        <w:tc>
+          <w:tcPr/>
+          <w:p>
+            <w:pPr>
+              <w:pStyle w:val="Compact"/>
+            </w:pPr>
+            <w:r>
+              <w:t xml:space="preserve">94%</w:t>
+            </w:r>
+          </w:p>
+        </w:tc>
+        <w:tc>
+          <w:tcPr/>
+          <w:p>
+            <w:pPr>
+              <w:pStyle w:val="Compact"/>
+            </w:pPr>
+            <w:r>
+              <w:t xml:space="preserve">1,820 (95% UI: 1,511–2,191)</w:t>
+            </w:r>
+          </w:p>
+        </w:tc>
+        <w:tc>
+          <w:tcPr/>
+          <w:p>
+            <w:pPr>
+              <w:pStyle w:val="Compact"/>
+            </w:pPr>
+            <w:r>
+              <w:t xml:space="preserve">87.4 (95% UI: 72.6–106.7)</w:t>
             </w:r>
           </w:p>
         </w:tc>
@@ -1638,51 +1647,51 @@
               <w:pStyle w:val="Compact"/>
             </w:pPr>
             <w:r>
-              <w:t xml:space="preserve">99.0% (95% UI: 85.8%–100.0%)</w:t>
-            </w:r>
-          </w:p>
-        </w:tc>
-        <w:tc>
-          <w:tcPr/>
-          <w:p>
-            <w:pPr>
-              <w:pStyle w:val="Compact"/>
-            </w:pPr>
-            <w:r>
-              <w:t xml:space="preserve">63.7% (95% UI: 61.2%–66.2%)</w:t>
-            </w:r>
-          </w:p>
-        </w:tc>
-        <w:tc>
-          <w:tcPr/>
-          <w:p>
-            <w:pPr>
-              <w:pStyle w:val="Compact"/>
-            </w:pPr>
-            <w:r>
-              <w:t xml:space="preserve">16%</w:t>
-            </w:r>
-          </w:p>
-        </w:tc>
-        <w:tc>
-          <w:tcPr/>
-          <w:p>
-            <w:pPr>
-              <w:pStyle w:val="Compact"/>
-            </w:pPr>
-            <w:r>
-              <w:t xml:space="preserve">1,157 (95% UI: 974–1,371)</w:t>
-            </w:r>
-          </w:p>
-        </w:tc>
-        <w:tc>
-          <w:tcPr/>
-          <w:p>
-            <w:pPr>
-              <w:pStyle w:val="Compact"/>
-            </w:pPr>
-            <w:r>
-              <w:t xml:space="preserve">59.2 (95% UI: 48.9–77.8)</w:t>
+              <w:t xml:space="preserve">99.8% (95% UI: 99.2%–100.0%)</w:t>
+            </w:r>
+          </w:p>
+        </w:tc>
+        <w:tc>
+          <w:tcPr/>
+          <w:p>
+            <w:pPr>
+              <w:pStyle w:val="Compact"/>
+            </w:pPr>
+            <w:r>
+              <w:t xml:space="preserve">62.0% (95% UI: 59.0%–64.8%)</w:t>
+            </w:r>
+          </w:p>
+        </w:tc>
+        <w:tc>
+          <w:tcPr/>
+          <w:p>
+            <w:pPr>
+              <w:pStyle w:val="Compact"/>
+            </w:pPr>
+            <w:r>
+              <w:t xml:space="preserve">2%</w:t>
+            </w:r>
+          </w:p>
+        </w:tc>
+        <w:tc>
+          <w:tcPr/>
+          <w:p>
+            <w:pPr>
+              <w:pStyle w:val="Compact"/>
+            </w:pPr>
+            <w:r>
+              <w:t xml:space="preserve">1,252 (95% UI: 1,040–1,524)</w:t>
+            </w:r>
+          </w:p>
+        </w:tc>
+        <w:tc>
+          <w:tcPr/>
+          <w:p>
+            <w:pPr>
+              <w:pStyle w:val="Compact"/>
+            </w:pPr>
+            <w:r>
+              <w:t xml:space="preserve">61.8 (95% UI: 51.1–75.8)</w:t>
             </w:r>
           </w:p>
         </w:tc>
@@ -1706,18 +1715,18 @@
               <w:pStyle w:val="Compact"/>
             </w:pPr>
             <w:r>
-              <w:t xml:space="preserve">99.0% (95% UI: 85.8%–100.0%)</w:t>
-            </w:r>
-          </w:p>
-        </w:tc>
-        <w:tc>
-          <w:tcPr/>
-          <w:p>
-            <w:pPr>
-              <w:pStyle w:val="Compact"/>
-            </w:pPr>
-            <w:r>
-              <w:t xml:space="preserve">87.1% (95% UI: 85.8%–88.0%)</w:t>
+              <w:t xml:space="preserve">99.9% (95% UI: 99.5%–100.0%)</w:t>
+            </w:r>
+          </w:p>
+        </w:tc>
+        <w:tc>
+          <w:tcPr/>
+          <w:p>
+            <w:pPr>
+              <w:pStyle w:val="Compact"/>
+            </w:pPr>
+            <w:r>
+              <w:t xml:space="preserve">87.9% (95% UI: 86.9%–88.8%)</w:t>
             </w:r>
           </w:p>
         </w:tc>
@@ -1739,18 +1748,18 @@
               <w:pStyle w:val="Compact"/>
             </w:pPr>
             <w:r>
-              <w:t xml:space="preserve">3,754 (95% UI: 3,168–4,403)</w:t>
-            </w:r>
-          </w:p>
-        </w:tc>
-        <w:tc>
-          <w:tcPr/>
-          <w:p>
-            <w:pPr>
-              <w:pStyle w:val="Compact"/>
-            </w:pPr>
-            <w:r>
-              <w:t xml:space="preserve">178.8 (95% UI: 152.7–207.4)</w:t>
+              <w:t xml:space="preserve">4,511 (95% UI: 3,684–5,633)</w:t>
+            </w:r>
+          </w:p>
+        </w:tc>
+        <w:tc>
+          <w:tcPr/>
+          <w:p>
+            <w:pPr>
+              <w:pStyle w:val="Compact"/>
+            </w:pPr>
+            <w:r>
+              <w:t xml:space="preserve">209.7 (95% UI: 173.5–259.6)</w:t>
             </w:r>
           </w:p>
         </w:tc>
@@ -1761,7 +1770,7 @@
         <w:pStyle w:val="BodyText"/>
       </w:pPr>
       <w:r>
-        <w:t xml:space="preserve">Reductions compare 2030 with 2015. Values are medians (95% UI) across 2,000 posterior draws. Targets are at least 80% for incidence and at least 65% for mortality. Every scenario met the incidence target at the median; the mortality target was met at 5,000 or 8,000 tests a year with 25% or 50% to F. Costs are in 2026 Singapore dollars, discounted at 3% a year, and include prison treatment costs from 2026. Treatment starts count courses, not people. S1 Text, Table S9 gives all 17 scenarios.</w:t>
+        <w:t xml:space="preserve">Reductions compare 2030 with 2015. Values are medians (95% UI) across 2,000 posterior draws. Targets are at least 80% for incidence and at least 65% for mortality. Every scenario met the incidence target at the median; the mortality target was met at 5,000 tests a year with 25% to F and 8,000 with 25% or 50% to F. Costs are in 2026 Singapore dollars, discounted at 3% a year, and include prison treatment costs from 2026. Treatment starts count courses, not people. S1 Text, Table S9 gives all 17 scenarios.</w:t>
       </w:r>
     </w:p>
     <w:bookmarkEnd w:id="29"/>
@@ -1780,7 +1789,7 @@
         <w:pStyle w:val="FirstParagraph"/>
       </w:pPr>
       <w:r>
-        <w:t xml:space="preserve">In this model, prison treatment from 2019 cut new HCV infections among people who inject drugs in Singapore by 85% and HCV deaths by 55% by 2030. This met the incidence target but not the mortality target. By 2026, nearly all HCV deaths occurred among released people, and nearly all chronic infections among released people were in those who had stopped injecting. Community screening of 5,000 tests a year or more met the mortality target, but only when most tests went to released people who had stopped injecting.</w:t>
+        <w:t xml:space="preserve">In this model, prison treatment from 2019 cut new HCV infections among people who inject drugs in Singapore by 84% and HCV deaths by 54% by 2030. This met the incidence target but not the mortality target. By 2026, nearly all HCV deaths occurred among released people, and most chronic infections among released people were in those who had stopped injecting. Community screening of 5,000 tests a year or more met the mortality target at the median, but only when most tests went to released people who had stopped injecting, and only 8,000 tests a year met it reliably.</w:t>
       </w:r>
     </w:p>
     <w:p>
@@ -1797,7 +1806,7 @@
         <w:t xml:space="preserve">[14,15]</w:t>
       </w:r>
       <w:r>
-        <w:t xml:space="preserve">. In this model people who inject are first arrested at about the rate at which released people are re-arrested, so prison reaches most of the network; even with screening of everyone eligible after release, 24% of the remaining infections in 2030 occurred in people never imprisoned. The first arrest rate is the weakest part of this result. Seroprevalence barely informs it, and its posterior follows its prior. A slower first arrest would leave more infections out of reach of prison. Deaths follow a different path. They arise from cirrhosis and liver cancer that built up over many years. Most of this burden sits in people who stopped injecting long ago. They do not transmit and are not reached by prison treatment after release. Cure also does not remove all risk in people who already have cirrhosis</w:t>
+        <w:t xml:space="preserve">. In this model people who inject are first arrested about 2.8 times as fast as released people are re-arrested, so few people who start injecting go long without being imprisoned, and prison reaches most of the network; even with screening of everyone eligible after release, 12% of the remaining infections in 2030 occurred in people never imprisoned. The first arrest rate rests on treating the official counts of new drug users as first arrests of people who inject. These counts also include people who do not inject, so the true first arrest flow of injectors is likely smaller. A slower first arrest would leave more infections out of reach of prison. Deaths follow a different path. They arise from cirrhosis and liver cancer that built up over many years. Most of this burden sits in people who stopped injecting long ago. They do not transmit and are not reached by prison treatment after release. Cure also does not remove all risk in people who already have cirrhosis</w:t>
       </w:r>
       <w:r>
         <w:t xml:space="preserve"> </w:t>
@@ -1822,7 +1831,7 @@
         <w:pStyle w:val="BodyText"/>
       </w:pPr>
       <w:r>
-        <w:t xml:space="preserve">The scale required is large. The cheapest robust scenario, 5,000 tests a year, is 8 times the planned capacity of the current community programme</w:t>
+        <w:t xml:space="preserve">The scale required is large. The only robust scenario, 8,000 tests a year, is 13 times the planned capacity of the current community programme</w:t>
       </w:r>
       <w:r>
         <w:t xml:space="preserve"> </w:t>
@@ -1831,7 +1840,7 @@
         <w:t xml:space="preserve">[11]</w:t>
       </w:r>
       <w:r>
-        <w:t xml:space="preserve">. All scenarios also assumed that every person identified starts treatment. Real linkage is weaker. In a Singapore trial among halfway house residents, only 12.6% of people with antibodies started treatment</w:t>
+        <w:t xml:space="preserve">, and 5,000 tests a year, which met the targets at the median, is 8 times. All scenarios also assumed that every person identified starts treatment. Real linkage is weaker. In a Singapore trial among halfway house residents, only 12.6% of people with antibodies started treatment</w:t>
       </w:r>
       <w:r>
         <w:t xml:space="preserve"> </w:t>
@@ -1892,7 +1901,16 @@
         <w:t xml:space="preserve">[3]</w:t>
       </w:r>
       <w:r>
-        <w:t xml:space="preserve">. Second, we calibrated the model only to one year of prison seroprevalence. We did not fit the size of the prison population, and the model’s 2015 prison population (8,451 (8,283–8,520)) was much larger than the 3,367 people with a known screening result in prison records. Absolute numbers of infections, deaths and treatments are therefore uncertain beyond what the UIs show; the reductions relative to 2015 are less affected. We did not fit observed treatment numbers after 2019. Third, we assumed perfect linkage from screening to treatment and no loss to follow up. Fourth, people in X cannot be reinfected or return to injecting. Some do relapse, which would add transmission. Fifth, the first arrest rate is set largely by its prior. Entry into injecting uses the 2015 counts of new drug users from law enforcement, without scaling, as a proxy, and holds them constant to 2030; later changes in drug use are not modelled. Sixth, the mortality ratios come from an Amsterdam cohort grouped by antibody status rather than viraemia</w:t>
+        <w:t xml:space="preserve">. Second, we calibrated the model to one year of data: prison seroprevalence, counts of new drug users and one small survey estimate of the number of people who inject drugs (199 respondents)</w:t>
+      </w:r>
+      <w:r>
+        <w:t xml:space="preserve"> </w:t>
+      </w:r>
+      <w:r>
+        <w:t xml:space="preserve">[7]</w:t>
+      </w:r>
+      <w:r>
+        <w:t xml:space="preserve">. We did not fit the size of the prison population, and the model’s 2015 prison population (9,741 (8,889–11,104)) was much larger than the 3,367 people with a known screening result in prison records. Absolute numbers of infections, deaths and treatments are therefore uncertain beyond what the UIs show; the reductions relative to 2015 are less affected. We did not fit observed treatment numbers after 2019. Third, we assumed perfect linkage from screening to treatment and no loss to follow up. Fourth, people in X cannot be reinfected or return to injecting. Some do relapse, which would add transmission. Fifth, the first arrest rate and entry into injecting are both informed by the 2015 counts of new drug users from law enforcement. These counts include people who use drugs without injecting, and entry was not allowed to fall below them, so modelled first arrests were too high at older ages. Entry was held constant to 2030; later changes in drug use are not modelled. Sixth, the mortality ratios come from an Amsterdam cohort grouped by antibody status rather than viraemia</w:t>
       </w:r>
       <w:r>
         <w:t xml:space="preserve"> </w:t>
@@ -1909,7 +1927,7 @@
         <w:pStyle w:val="BodyText"/>
       </w:pPr>
       <w:r>
-        <w:t xml:space="preserve">In conclusion, prison treatment has done much to reduce HCV among people who inject drugs in Singapore. In this model it meets the WHO incidence target by 2030 but not the mortality target. Community screening after release can meet both targets at about 5,000 tests a year, if most tests go to people who have stopped injecting, but that is far larger than current plans.</w:t>
+        <w:t xml:space="preserve">In conclusion, prison treatment has done much to reduce HCV among people who inject drugs in Singapore. In this model it meets the WHO incidence target by 2030 but not the mortality target. Community screening after release can meet both targets from about 5,000 tests a year, and reliably at 8,000, if most tests go to people who have stopped injecting, but that is far larger than current plans.</w:t>
       </w:r>
     </w:p>
     <w:bookmarkEnd w:id="31"/>

</xml_diff>